<commit_message>
fix(kpi-report): template Word com tabelas reais via {%tr%} corrigido
Descoberta técnica documentada em gen_template.py (não versionado):
o regex do docxtpl (template.py:184-188) CONSOME a <w:tr> inteira que
contém {%tr xxx %}. Logo {%tr for%} + {%tr endfor %} na MESMA linha =
ambos consumidos junto, deixando {% for %} órfão.

Solução: 3 linhas físicas separadas
  - Linha A: SÓ {%tr for parada in bloco2.paradas %} → consumida pelo regex
  - Linha B: dados {{ parada.* }} → repetida pelo for gerado
  - Linha C: SÓ {%tr endfor %} → consumida pelo regex

Resultado: 8 tabelas Word reais no DOCX
  - Bloco 1/3 KPIs (3×4): número grande + meta + sunburst
  - Bloco 2/5 Top 5 paradas (6×6): #/Equip/Data/Dur/Causa/Descrição
  - Bloco 4 Detalhamento (9×10): 8 equipamentos + linha TOTAL
  - Página 2: 3 áreas de anotação (tabelas 1×1)

Substitui parágrafos `|` da v6 (workaround temporário).
</commit_message>
<xml_diff>
--- a/webapp/src/assets/templates/kpi_report.docx
+++ b/webapp/src/assets/templates/kpi_report.docx
@@ -265,25 +265,285 @@
         <w:t>Top 5 Paradas do Período Mensal</w:t>
       </w:r>
     </w:p>
-    <w:p>
-      <w:r>
-        <w:rPr>
-          <w:b/>
-          <w:sz w:val="18"/>
-        </w:rPr>
-        <w:t>#  |  Equipamento  |  Data/Hora  |  Duração  |  Causa  |  Descrição</w:t>
-      </w:r>
-    </w:p>
-    <w:p>
-      <w:r>
-        <w:rPr>
-          <w:sz w:val="16"/>
-        </w:rPr>
-        <w:t>{% for parada in bloco2.paradas %}{{ parada.posicao }} | {{ parada.equipamento }} | {{ parada.data_hora }} | {{ parada.duracao_min }} | {{ parada.causa }} | {{ parada.descricao }}</w:t>
-        <w:br/>
-        <w:t>{% endfor %}</w:t>
-      </w:r>
-    </w:p>
+    <w:tbl>
+      <w:tblPr>
+        <w:tblStyle w:val="LightGrid-Accent1"/>
+        <w:tblW w:type="auto" w:w="0"/>
+        <w:tblLook w:firstColumn="1" w:firstRow="1" w:lastColumn="0" w:lastRow="0" w:noHBand="0" w:noVBand="1" w:val="04A0"/>
+      </w:tblPr>
+      <w:tblGrid>
+        <w:gridCol w:w="2413"/>
+        <w:gridCol w:w="2413"/>
+        <w:gridCol w:w="2413"/>
+        <w:gridCol w:w="2413"/>
+        <w:gridCol w:w="2413"/>
+        <w:gridCol w:w="2413"/>
+      </w:tblGrid>
+      <w:tr>
+        <w:tc>
+          <w:tcPr>
+            <w:tcW w:type="dxa" w:w="2413"/>
+          </w:tcPr>
+          <w:p>
+            <w:r>
+              <w:rPr>
+                <w:b/>
+                <w:sz w:val="18"/>
+              </w:rPr>
+              <w:t>#</w:t>
+            </w:r>
+          </w:p>
+        </w:tc>
+        <w:tc>
+          <w:tcPr>
+            <w:tcW w:type="dxa" w:w="2413"/>
+          </w:tcPr>
+          <w:p>
+            <w:r>
+              <w:rPr>
+                <w:b/>
+                <w:sz w:val="18"/>
+              </w:rPr>
+              <w:t>Equipamento</w:t>
+            </w:r>
+          </w:p>
+        </w:tc>
+        <w:tc>
+          <w:tcPr>
+            <w:tcW w:type="dxa" w:w="2413"/>
+          </w:tcPr>
+          <w:p>
+            <w:r>
+              <w:rPr>
+                <w:b/>
+                <w:sz w:val="18"/>
+              </w:rPr>
+              <w:t>Data/Hora</w:t>
+            </w:r>
+          </w:p>
+        </w:tc>
+        <w:tc>
+          <w:tcPr>
+            <w:tcW w:type="dxa" w:w="2413"/>
+          </w:tcPr>
+          <w:p>
+            <w:r>
+              <w:rPr>
+                <w:b/>
+                <w:sz w:val="18"/>
+              </w:rPr>
+              <w:t>Duração</w:t>
+            </w:r>
+          </w:p>
+        </w:tc>
+        <w:tc>
+          <w:tcPr>
+            <w:tcW w:type="dxa" w:w="2413"/>
+          </w:tcPr>
+          <w:p>
+            <w:r>
+              <w:rPr>
+                <w:b/>
+                <w:sz w:val="18"/>
+              </w:rPr>
+              <w:t>Causa</w:t>
+            </w:r>
+          </w:p>
+        </w:tc>
+        <w:tc>
+          <w:tcPr>
+            <w:tcW w:type="dxa" w:w="2413"/>
+          </w:tcPr>
+          <w:p>
+            <w:r>
+              <w:rPr>
+                <w:b/>
+                <w:sz w:val="18"/>
+              </w:rPr>
+              <w:t>Descrição</w:t>
+            </w:r>
+          </w:p>
+        </w:tc>
+      </w:tr>
+      <w:tr>
+        <w:tc>
+          <w:tcPr>
+            <w:tcW w:type="dxa" w:w="2413"/>
+          </w:tcPr>
+          <w:p>
+            <w:r>
+              <w:rPr>
+                <w:b w:val="0"/>
+                <w:sz w:val="2"/>
+              </w:rPr>
+              <w:t>{%tr for parada in bloco2.paradas %}</w:t>
+            </w:r>
+          </w:p>
+        </w:tc>
+        <w:tc>
+          <w:tcPr>
+            <w:tcW w:type="dxa" w:w="2413"/>
+          </w:tcPr>
+          <w:p/>
+        </w:tc>
+        <w:tc>
+          <w:tcPr>
+            <w:tcW w:type="dxa" w:w="2413"/>
+          </w:tcPr>
+          <w:p/>
+        </w:tc>
+        <w:tc>
+          <w:tcPr>
+            <w:tcW w:type="dxa" w:w="2413"/>
+          </w:tcPr>
+          <w:p/>
+        </w:tc>
+        <w:tc>
+          <w:tcPr>
+            <w:tcW w:type="dxa" w:w="2413"/>
+          </w:tcPr>
+          <w:p/>
+        </w:tc>
+        <w:tc>
+          <w:tcPr>
+            <w:tcW w:type="dxa" w:w="2413"/>
+          </w:tcPr>
+          <w:p/>
+        </w:tc>
+      </w:tr>
+      <w:tr>
+        <w:tc>
+          <w:tcPr>
+            <w:tcW w:type="dxa" w:w="2413"/>
+          </w:tcPr>
+          <w:p>
+            <w:r>
+              <w:rPr>
+                <w:b w:val="0"/>
+                <w:sz w:val="16"/>
+              </w:rPr>
+              <w:t>{{ parada.posicao }}</w:t>
+            </w:r>
+          </w:p>
+        </w:tc>
+        <w:tc>
+          <w:tcPr>
+            <w:tcW w:type="dxa" w:w="2413"/>
+          </w:tcPr>
+          <w:p>
+            <w:r>
+              <w:rPr>
+                <w:b w:val="0"/>
+                <w:sz w:val="16"/>
+              </w:rPr>
+              <w:t>{{ parada.equipamento }}</w:t>
+            </w:r>
+          </w:p>
+        </w:tc>
+        <w:tc>
+          <w:tcPr>
+            <w:tcW w:type="dxa" w:w="2413"/>
+          </w:tcPr>
+          <w:p>
+            <w:r>
+              <w:rPr>
+                <w:b w:val="0"/>
+                <w:sz w:val="16"/>
+              </w:rPr>
+              <w:t>{{ parada.data_hora }}</w:t>
+            </w:r>
+          </w:p>
+        </w:tc>
+        <w:tc>
+          <w:tcPr>
+            <w:tcW w:type="dxa" w:w="2413"/>
+          </w:tcPr>
+          <w:p>
+            <w:r>
+              <w:rPr>
+                <w:b w:val="0"/>
+                <w:sz w:val="16"/>
+              </w:rPr>
+              <w:t>{{ parada.duracao_min }}</w:t>
+            </w:r>
+          </w:p>
+        </w:tc>
+        <w:tc>
+          <w:tcPr>
+            <w:tcW w:type="dxa" w:w="2413"/>
+          </w:tcPr>
+          <w:p>
+            <w:r>
+              <w:rPr>
+                <w:b w:val="0"/>
+                <w:sz w:val="16"/>
+              </w:rPr>
+              <w:t>{{ parada.causa }}</w:t>
+            </w:r>
+          </w:p>
+        </w:tc>
+        <w:tc>
+          <w:tcPr>
+            <w:tcW w:type="dxa" w:w="2413"/>
+          </w:tcPr>
+          <w:p>
+            <w:r>
+              <w:rPr>
+                <w:b w:val="0"/>
+                <w:sz w:val="16"/>
+              </w:rPr>
+              <w:t>{{ parada.descricao }}</w:t>
+            </w:r>
+          </w:p>
+        </w:tc>
+      </w:tr>
+      <w:tr>
+        <w:tc>
+          <w:tcPr>
+            <w:tcW w:type="dxa" w:w="2413"/>
+          </w:tcPr>
+          <w:p>
+            <w:r>
+              <w:rPr>
+                <w:b w:val="0"/>
+                <w:sz w:val="2"/>
+              </w:rPr>
+              <w:t>{%tr endfor %}</w:t>
+            </w:r>
+          </w:p>
+        </w:tc>
+        <w:tc>
+          <w:tcPr>
+            <w:tcW w:type="dxa" w:w="2413"/>
+          </w:tcPr>
+          <w:p/>
+        </w:tc>
+        <w:tc>
+          <w:tcPr>
+            <w:tcW w:type="dxa" w:w="2413"/>
+          </w:tcPr>
+          <w:p/>
+        </w:tc>
+        <w:tc>
+          <w:tcPr>
+            <w:tcW w:type="dxa" w:w="2413"/>
+          </w:tcPr>
+          <w:p/>
+        </w:tc>
+        <w:tc>
+          <w:tcPr>
+            <w:tcW w:type="dxa" w:w="2413"/>
+          </w:tcPr>
+          <w:p/>
+        </w:tc>
+        <w:tc>
+          <w:tcPr>
+            <w:tcW w:type="dxa" w:w="2413"/>
+          </w:tcPr>
+          <w:p/>
+        </w:tc>
+      </w:tr>
+    </w:tbl>
     <w:p>
       <w:r>
         <w:rPr>
@@ -526,34 +786,536 @@
         <w:t>Detalhamento por Equipamento</w:t>
       </w:r>
     </w:p>
-    <w:p>
-      <w:r>
-        <w:rPr>
-          <w:b/>
-          <w:sz w:val="16"/>
-        </w:rPr>
-        <w:t>Equipamento | Nº Ord. | Nº Par. | Avaria (min) | Atividade (h) | Uptime (h) | MTBF (h) | MTTR (min) | Taxa (%)</w:t>
-      </w:r>
-    </w:p>
-    <w:p>
-      <w:r>
-        <w:rPr>
-          <w:sz w:val="16"/>
-        </w:rPr>
-        <w:t>{% for linha in bloco4.linhas %}{{ linha.equipamento }} | {{ linha.num_ordens }} | {{ linha.num_paradas }} | {{ linha.avaria_min }} | {{ linha.atividade_h }} | {{ linha.uptime_h }} | {{ linha.mtbf }} | {{ linha.mttr }} | {{ linha.taxa_avaria }}</w:t>
-        <w:br/>
-        <w:t>{% endfor %}</w:t>
-      </w:r>
-    </w:p>
-    <w:p>
-      <w:r>
-        <w:rPr>
-          <w:b/>
-          <w:sz w:val="18"/>
-        </w:rPr>
-        <w:t>TOTAL | {{ bloco4.total.num_ordens }} | {{ bloco4.total.num_paradas }} | {{ bloco4.total.avaria_min }} | {{ bloco4.total.atividade_h }} | {{ bloco4.total.uptime_h }} | {{ bloco4.total.mtbf }} | {{ bloco4.total.mttr }} | {{ bloco4.total.taxa_avaria }}</w:t>
-      </w:r>
-    </w:p>
+    <w:tbl>
+      <w:tblPr>
+        <w:tblStyle w:val="LightGrid-Accent1"/>
+        <w:tblW w:type="auto" w:w="0"/>
+        <w:tblLook w:firstColumn="1" w:firstRow="1" w:lastColumn="0" w:lastRow="0" w:noHBand="0" w:noVBand="1" w:val="04A0"/>
+      </w:tblPr>
+      <w:tblGrid>
+        <w:gridCol w:w="1609"/>
+        <w:gridCol w:w="1609"/>
+        <w:gridCol w:w="1609"/>
+        <w:gridCol w:w="1609"/>
+        <w:gridCol w:w="1609"/>
+        <w:gridCol w:w="1609"/>
+        <w:gridCol w:w="1609"/>
+        <w:gridCol w:w="1609"/>
+        <w:gridCol w:w="1609"/>
+      </w:tblGrid>
+      <w:tr>
+        <w:tc>
+          <w:tcPr>
+            <w:tcW w:type="dxa" w:w="1609"/>
+          </w:tcPr>
+          <w:p>
+            <w:r>
+              <w:rPr>
+                <w:b/>
+                <w:sz w:val="16"/>
+              </w:rPr>
+              <w:t>Equipamento</w:t>
+            </w:r>
+          </w:p>
+        </w:tc>
+        <w:tc>
+          <w:tcPr>
+            <w:tcW w:type="dxa" w:w="1609"/>
+          </w:tcPr>
+          <w:p>
+            <w:r>
+              <w:rPr>
+                <w:b/>
+                <w:sz w:val="16"/>
+              </w:rPr>
+              <w:t>Nº Ord.</w:t>
+            </w:r>
+          </w:p>
+        </w:tc>
+        <w:tc>
+          <w:tcPr>
+            <w:tcW w:type="dxa" w:w="1609"/>
+          </w:tcPr>
+          <w:p>
+            <w:r>
+              <w:rPr>
+                <w:b/>
+                <w:sz w:val="16"/>
+              </w:rPr>
+              <w:t>Nº Par.</w:t>
+            </w:r>
+          </w:p>
+        </w:tc>
+        <w:tc>
+          <w:tcPr>
+            <w:tcW w:type="dxa" w:w="1609"/>
+          </w:tcPr>
+          <w:p>
+            <w:r>
+              <w:rPr>
+                <w:b/>
+                <w:sz w:val="16"/>
+              </w:rPr>
+              <w:t>Avaria (min)</w:t>
+            </w:r>
+          </w:p>
+        </w:tc>
+        <w:tc>
+          <w:tcPr>
+            <w:tcW w:type="dxa" w:w="1609"/>
+          </w:tcPr>
+          <w:p>
+            <w:r>
+              <w:rPr>
+                <w:b/>
+                <w:sz w:val="16"/>
+              </w:rPr>
+              <w:t>Atividade (h)</w:t>
+            </w:r>
+          </w:p>
+        </w:tc>
+        <w:tc>
+          <w:tcPr>
+            <w:tcW w:type="dxa" w:w="1609"/>
+          </w:tcPr>
+          <w:p>
+            <w:r>
+              <w:rPr>
+                <w:b/>
+                <w:sz w:val="16"/>
+              </w:rPr>
+              <w:t>Uptime (h)</w:t>
+            </w:r>
+          </w:p>
+        </w:tc>
+        <w:tc>
+          <w:tcPr>
+            <w:tcW w:type="dxa" w:w="1609"/>
+          </w:tcPr>
+          <w:p>
+            <w:r>
+              <w:rPr>
+                <w:b/>
+                <w:sz w:val="16"/>
+              </w:rPr>
+              <w:t>MTBF (h)</w:t>
+            </w:r>
+          </w:p>
+        </w:tc>
+        <w:tc>
+          <w:tcPr>
+            <w:tcW w:type="dxa" w:w="1609"/>
+          </w:tcPr>
+          <w:p>
+            <w:r>
+              <w:rPr>
+                <w:b/>
+                <w:sz w:val="16"/>
+              </w:rPr>
+              <w:t>MTTR (min)</w:t>
+            </w:r>
+          </w:p>
+        </w:tc>
+        <w:tc>
+          <w:tcPr>
+            <w:tcW w:type="dxa" w:w="1609"/>
+          </w:tcPr>
+          <w:p>
+            <w:r>
+              <w:rPr>
+                <w:b/>
+                <w:sz w:val="16"/>
+              </w:rPr>
+              <w:t>Taxa (%)</w:t>
+            </w:r>
+          </w:p>
+        </w:tc>
+      </w:tr>
+      <w:tr>
+        <w:tc>
+          <w:tcPr>
+            <w:tcW w:type="dxa" w:w="1609"/>
+          </w:tcPr>
+          <w:p>
+            <w:r>
+              <w:rPr>
+                <w:b w:val="0"/>
+                <w:sz w:val="2"/>
+              </w:rPr>
+              <w:t>{%tr for linha in bloco4.linhas %}</w:t>
+            </w:r>
+          </w:p>
+        </w:tc>
+        <w:tc>
+          <w:tcPr>
+            <w:tcW w:type="dxa" w:w="1609"/>
+          </w:tcPr>
+          <w:p/>
+        </w:tc>
+        <w:tc>
+          <w:tcPr>
+            <w:tcW w:type="dxa" w:w="1609"/>
+          </w:tcPr>
+          <w:p/>
+        </w:tc>
+        <w:tc>
+          <w:tcPr>
+            <w:tcW w:type="dxa" w:w="1609"/>
+          </w:tcPr>
+          <w:p/>
+        </w:tc>
+        <w:tc>
+          <w:tcPr>
+            <w:tcW w:type="dxa" w:w="1609"/>
+          </w:tcPr>
+          <w:p/>
+        </w:tc>
+        <w:tc>
+          <w:tcPr>
+            <w:tcW w:type="dxa" w:w="1609"/>
+          </w:tcPr>
+          <w:p/>
+        </w:tc>
+        <w:tc>
+          <w:tcPr>
+            <w:tcW w:type="dxa" w:w="1609"/>
+          </w:tcPr>
+          <w:p/>
+        </w:tc>
+        <w:tc>
+          <w:tcPr>
+            <w:tcW w:type="dxa" w:w="1609"/>
+          </w:tcPr>
+          <w:p/>
+        </w:tc>
+        <w:tc>
+          <w:tcPr>
+            <w:tcW w:type="dxa" w:w="1609"/>
+          </w:tcPr>
+          <w:p/>
+        </w:tc>
+      </w:tr>
+      <w:tr>
+        <w:tc>
+          <w:tcPr>
+            <w:tcW w:type="dxa" w:w="1609"/>
+          </w:tcPr>
+          <w:p>
+            <w:r>
+              <w:rPr>
+                <w:b w:val="0"/>
+                <w:sz w:val="16"/>
+              </w:rPr>
+              <w:t>{{ linha.equipamento }}</w:t>
+            </w:r>
+          </w:p>
+        </w:tc>
+        <w:tc>
+          <w:tcPr>
+            <w:tcW w:type="dxa" w:w="1609"/>
+          </w:tcPr>
+          <w:p>
+            <w:r>
+              <w:rPr>
+                <w:b w:val="0"/>
+                <w:sz w:val="16"/>
+              </w:rPr>
+              <w:t>{{ linha.num_ordens }}</w:t>
+            </w:r>
+          </w:p>
+        </w:tc>
+        <w:tc>
+          <w:tcPr>
+            <w:tcW w:type="dxa" w:w="1609"/>
+          </w:tcPr>
+          <w:p>
+            <w:r>
+              <w:rPr>
+                <w:b w:val="0"/>
+                <w:sz w:val="16"/>
+              </w:rPr>
+              <w:t>{{ linha.num_paradas }}</w:t>
+            </w:r>
+          </w:p>
+        </w:tc>
+        <w:tc>
+          <w:tcPr>
+            <w:tcW w:type="dxa" w:w="1609"/>
+          </w:tcPr>
+          <w:p>
+            <w:r>
+              <w:rPr>
+                <w:b w:val="0"/>
+                <w:sz w:val="16"/>
+              </w:rPr>
+              <w:t>{{ linha.avaria_min }}</w:t>
+            </w:r>
+          </w:p>
+        </w:tc>
+        <w:tc>
+          <w:tcPr>
+            <w:tcW w:type="dxa" w:w="1609"/>
+          </w:tcPr>
+          <w:p>
+            <w:r>
+              <w:rPr>
+                <w:b w:val="0"/>
+                <w:sz w:val="16"/>
+              </w:rPr>
+              <w:t>{{ linha.atividade_h }}</w:t>
+            </w:r>
+          </w:p>
+        </w:tc>
+        <w:tc>
+          <w:tcPr>
+            <w:tcW w:type="dxa" w:w="1609"/>
+          </w:tcPr>
+          <w:p>
+            <w:r>
+              <w:rPr>
+                <w:b w:val="0"/>
+                <w:sz w:val="16"/>
+              </w:rPr>
+              <w:t>{{ linha.uptime_h }}</w:t>
+            </w:r>
+          </w:p>
+        </w:tc>
+        <w:tc>
+          <w:tcPr>
+            <w:tcW w:type="dxa" w:w="1609"/>
+          </w:tcPr>
+          <w:p>
+            <w:r>
+              <w:rPr>
+                <w:b w:val="0"/>
+                <w:sz w:val="16"/>
+              </w:rPr>
+              <w:t>{{ linha.mtbf }}</w:t>
+            </w:r>
+          </w:p>
+        </w:tc>
+        <w:tc>
+          <w:tcPr>
+            <w:tcW w:type="dxa" w:w="1609"/>
+          </w:tcPr>
+          <w:p>
+            <w:r>
+              <w:rPr>
+                <w:b w:val="0"/>
+                <w:sz w:val="16"/>
+              </w:rPr>
+              <w:t>{{ linha.mttr }}</w:t>
+            </w:r>
+          </w:p>
+        </w:tc>
+        <w:tc>
+          <w:tcPr>
+            <w:tcW w:type="dxa" w:w="1609"/>
+          </w:tcPr>
+          <w:p>
+            <w:r>
+              <w:rPr>
+                <w:b w:val="0"/>
+                <w:sz w:val="16"/>
+              </w:rPr>
+              <w:t>{{ linha.taxa_avaria }}</w:t>
+            </w:r>
+          </w:p>
+        </w:tc>
+      </w:tr>
+      <w:tr>
+        <w:tc>
+          <w:tcPr>
+            <w:tcW w:type="dxa" w:w="1609"/>
+          </w:tcPr>
+          <w:p>
+            <w:r>
+              <w:rPr>
+                <w:b w:val="0"/>
+                <w:sz w:val="2"/>
+              </w:rPr>
+              <w:t>{%tr endfor %}</w:t>
+            </w:r>
+          </w:p>
+        </w:tc>
+        <w:tc>
+          <w:tcPr>
+            <w:tcW w:type="dxa" w:w="1609"/>
+          </w:tcPr>
+          <w:p/>
+        </w:tc>
+        <w:tc>
+          <w:tcPr>
+            <w:tcW w:type="dxa" w:w="1609"/>
+          </w:tcPr>
+          <w:p/>
+        </w:tc>
+        <w:tc>
+          <w:tcPr>
+            <w:tcW w:type="dxa" w:w="1609"/>
+          </w:tcPr>
+          <w:p/>
+        </w:tc>
+        <w:tc>
+          <w:tcPr>
+            <w:tcW w:type="dxa" w:w="1609"/>
+          </w:tcPr>
+          <w:p/>
+        </w:tc>
+        <w:tc>
+          <w:tcPr>
+            <w:tcW w:type="dxa" w:w="1609"/>
+          </w:tcPr>
+          <w:p/>
+        </w:tc>
+        <w:tc>
+          <w:tcPr>
+            <w:tcW w:type="dxa" w:w="1609"/>
+          </w:tcPr>
+          <w:p/>
+        </w:tc>
+        <w:tc>
+          <w:tcPr>
+            <w:tcW w:type="dxa" w:w="1609"/>
+          </w:tcPr>
+          <w:p/>
+        </w:tc>
+        <w:tc>
+          <w:tcPr>
+            <w:tcW w:type="dxa" w:w="1609"/>
+          </w:tcPr>
+          <w:p/>
+        </w:tc>
+      </w:tr>
+      <w:tr>
+        <w:tc>
+          <w:tcPr>
+            <w:tcW w:type="dxa" w:w="1609"/>
+          </w:tcPr>
+          <w:p>
+            <w:r>
+              <w:rPr>
+                <w:b/>
+                <w:sz w:val="18"/>
+              </w:rPr>
+              <w:t>TOTAL</w:t>
+            </w:r>
+          </w:p>
+        </w:tc>
+        <w:tc>
+          <w:tcPr>
+            <w:tcW w:type="dxa" w:w="1609"/>
+          </w:tcPr>
+          <w:p>
+            <w:r>
+              <w:rPr>
+                <w:b/>
+                <w:sz w:val="16"/>
+              </w:rPr>
+              <w:t>{{ bloco4.total.num_ordens }}</w:t>
+            </w:r>
+          </w:p>
+        </w:tc>
+        <w:tc>
+          <w:tcPr>
+            <w:tcW w:type="dxa" w:w="1609"/>
+          </w:tcPr>
+          <w:p>
+            <w:r>
+              <w:rPr>
+                <w:b/>
+                <w:sz w:val="16"/>
+              </w:rPr>
+              <w:t>{{ bloco4.total.num_paradas }}</w:t>
+            </w:r>
+          </w:p>
+        </w:tc>
+        <w:tc>
+          <w:tcPr>
+            <w:tcW w:type="dxa" w:w="1609"/>
+          </w:tcPr>
+          <w:p>
+            <w:r>
+              <w:rPr>
+                <w:b/>
+                <w:sz w:val="16"/>
+              </w:rPr>
+              <w:t>{{ bloco4.total.avaria_min }}</w:t>
+            </w:r>
+          </w:p>
+        </w:tc>
+        <w:tc>
+          <w:tcPr>
+            <w:tcW w:type="dxa" w:w="1609"/>
+          </w:tcPr>
+          <w:p>
+            <w:r>
+              <w:rPr>
+                <w:b/>
+                <w:sz w:val="16"/>
+              </w:rPr>
+              <w:t>{{ bloco4.total.atividade_h }}</w:t>
+            </w:r>
+          </w:p>
+        </w:tc>
+        <w:tc>
+          <w:tcPr>
+            <w:tcW w:type="dxa" w:w="1609"/>
+          </w:tcPr>
+          <w:p>
+            <w:r>
+              <w:rPr>
+                <w:b/>
+                <w:sz w:val="16"/>
+              </w:rPr>
+              <w:t>{{ bloco4.total.uptime_h }}</w:t>
+            </w:r>
+          </w:p>
+        </w:tc>
+        <w:tc>
+          <w:tcPr>
+            <w:tcW w:type="dxa" w:w="1609"/>
+          </w:tcPr>
+          <w:p>
+            <w:r>
+              <w:rPr>
+                <w:b/>
+                <w:sz w:val="16"/>
+              </w:rPr>
+              <w:t>{{ bloco4.total.mtbf }}</w:t>
+            </w:r>
+          </w:p>
+        </w:tc>
+        <w:tc>
+          <w:tcPr>
+            <w:tcW w:type="dxa" w:w="1609"/>
+          </w:tcPr>
+          <w:p>
+            <w:r>
+              <w:rPr>
+                <w:b/>
+                <w:sz w:val="16"/>
+              </w:rPr>
+              <w:t>{{ bloco4.total.mttr }}</w:t>
+            </w:r>
+          </w:p>
+        </w:tc>
+        <w:tc>
+          <w:tcPr>
+            <w:tcW w:type="dxa" w:w="1609"/>
+          </w:tcPr>
+          <w:p>
+            <w:r>
+              <w:rPr>
+                <w:b/>
+                <w:sz w:val="16"/>
+              </w:rPr>
+              <w:t>{{ bloco4.total.taxa_avaria }}</w:t>
+            </w:r>
+          </w:p>
+        </w:tc>
+      </w:tr>
+    </w:tbl>
     <w:p>
       <w:r>
         <w:rPr>
@@ -563,25 +1325,285 @@
         <w:t>Top 5 Paradas das Últimas 24 Horas</w:t>
       </w:r>
     </w:p>
-    <w:p>
-      <w:r>
-        <w:rPr>
-          <w:b/>
-          <w:sz w:val="18"/>
-        </w:rPr>
-        <w:t>#  |  Equipamento  |  Data/Hora  |  Duração  |  Causa  |  Descrição</w:t>
-      </w:r>
-    </w:p>
-    <w:p>
-      <w:r>
-        <w:rPr>
-          <w:sz w:val="16"/>
-        </w:rPr>
-        <w:t>{% for parada in bloco5.paradas %}{{ parada.posicao }} | {{ parada.equipamento }} | {{ parada.data_hora }} | {{ parada.duracao_min }} | {{ parada.causa }} | {{ parada.descricao }}</w:t>
-        <w:br/>
-        <w:t>{% endfor %}</w:t>
-      </w:r>
-    </w:p>
+    <w:tbl>
+      <w:tblPr>
+        <w:tblStyle w:val="LightGrid-Accent1"/>
+        <w:tblW w:type="auto" w:w="0"/>
+        <w:tblLook w:firstColumn="1" w:firstRow="1" w:lastColumn="0" w:lastRow="0" w:noHBand="0" w:noVBand="1" w:val="04A0"/>
+      </w:tblPr>
+      <w:tblGrid>
+        <w:gridCol w:w="2413"/>
+        <w:gridCol w:w="2413"/>
+        <w:gridCol w:w="2413"/>
+        <w:gridCol w:w="2413"/>
+        <w:gridCol w:w="2413"/>
+        <w:gridCol w:w="2413"/>
+      </w:tblGrid>
+      <w:tr>
+        <w:tc>
+          <w:tcPr>
+            <w:tcW w:type="dxa" w:w="2413"/>
+          </w:tcPr>
+          <w:p>
+            <w:r>
+              <w:rPr>
+                <w:b/>
+                <w:sz w:val="18"/>
+              </w:rPr>
+              <w:t>#</w:t>
+            </w:r>
+          </w:p>
+        </w:tc>
+        <w:tc>
+          <w:tcPr>
+            <w:tcW w:type="dxa" w:w="2413"/>
+          </w:tcPr>
+          <w:p>
+            <w:r>
+              <w:rPr>
+                <w:b/>
+                <w:sz w:val="18"/>
+              </w:rPr>
+              <w:t>Equipamento</w:t>
+            </w:r>
+          </w:p>
+        </w:tc>
+        <w:tc>
+          <w:tcPr>
+            <w:tcW w:type="dxa" w:w="2413"/>
+          </w:tcPr>
+          <w:p>
+            <w:r>
+              <w:rPr>
+                <w:b/>
+                <w:sz w:val="18"/>
+              </w:rPr>
+              <w:t>Data/Hora</w:t>
+            </w:r>
+          </w:p>
+        </w:tc>
+        <w:tc>
+          <w:tcPr>
+            <w:tcW w:type="dxa" w:w="2413"/>
+          </w:tcPr>
+          <w:p>
+            <w:r>
+              <w:rPr>
+                <w:b/>
+                <w:sz w:val="18"/>
+              </w:rPr>
+              <w:t>Duração</w:t>
+            </w:r>
+          </w:p>
+        </w:tc>
+        <w:tc>
+          <w:tcPr>
+            <w:tcW w:type="dxa" w:w="2413"/>
+          </w:tcPr>
+          <w:p>
+            <w:r>
+              <w:rPr>
+                <w:b/>
+                <w:sz w:val="18"/>
+              </w:rPr>
+              <w:t>Causa</w:t>
+            </w:r>
+          </w:p>
+        </w:tc>
+        <w:tc>
+          <w:tcPr>
+            <w:tcW w:type="dxa" w:w="2413"/>
+          </w:tcPr>
+          <w:p>
+            <w:r>
+              <w:rPr>
+                <w:b/>
+                <w:sz w:val="18"/>
+              </w:rPr>
+              <w:t>Descrição</w:t>
+            </w:r>
+          </w:p>
+        </w:tc>
+      </w:tr>
+      <w:tr>
+        <w:tc>
+          <w:tcPr>
+            <w:tcW w:type="dxa" w:w="2413"/>
+          </w:tcPr>
+          <w:p>
+            <w:r>
+              <w:rPr>
+                <w:b w:val="0"/>
+                <w:sz w:val="2"/>
+              </w:rPr>
+              <w:t>{%tr for parada in bloco5.paradas %}</w:t>
+            </w:r>
+          </w:p>
+        </w:tc>
+        <w:tc>
+          <w:tcPr>
+            <w:tcW w:type="dxa" w:w="2413"/>
+          </w:tcPr>
+          <w:p/>
+        </w:tc>
+        <w:tc>
+          <w:tcPr>
+            <w:tcW w:type="dxa" w:w="2413"/>
+          </w:tcPr>
+          <w:p/>
+        </w:tc>
+        <w:tc>
+          <w:tcPr>
+            <w:tcW w:type="dxa" w:w="2413"/>
+          </w:tcPr>
+          <w:p/>
+        </w:tc>
+        <w:tc>
+          <w:tcPr>
+            <w:tcW w:type="dxa" w:w="2413"/>
+          </w:tcPr>
+          <w:p/>
+        </w:tc>
+        <w:tc>
+          <w:tcPr>
+            <w:tcW w:type="dxa" w:w="2413"/>
+          </w:tcPr>
+          <w:p/>
+        </w:tc>
+      </w:tr>
+      <w:tr>
+        <w:tc>
+          <w:tcPr>
+            <w:tcW w:type="dxa" w:w="2413"/>
+          </w:tcPr>
+          <w:p>
+            <w:r>
+              <w:rPr>
+                <w:b w:val="0"/>
+                <w:sz w:val="16"/>
+              </w:rPr>
+              <w:t>{{ parada.posicao }}</w:t>
+            </w:r>
+          </w:p>
+        </w:tc>
+        <w:tc>
+          <w:tcPr>
+            <w:tcW w:type="dxa" w:w="2413"/>
+          </w:tcPr>
+          <w:p>
+            <w:r>
+              <w:rPr>
+                <w:b w:val="0"/>
+                <w:sz w:val="16"/>
+              </w:rPr>
+              <w:t>{{ parada.equipamento }}</w:t>
+            </w:r>
+          </w:p>
+        </w:tc>
+        <w:tc>
+          <w:tcPr>
+            <w:tcW w:type="dxa" w:w="2413"/>
+          </w:tcPr>
+          <w:p>
+            <w:r>
+              <w:rPr>
+                <w:b w:val="0"/>
+                <w:sz w:val="16"/>
+              </w:rPr>
+              <w:t>{{ parada.data_hora }}</w:t>
+            </w:r>
+          </w:p>
+        </w:tc>
+        <w:tc>
+          <w:tcPr>
+            <w:tcW w:type="dxa" w:w="2413"/>
+          </w:tcPr>
+          <w:p>
+            <w:r>
+              <w:rPr>
+                <w:b w:val="0"/>
+                <w:sz w:val="16"/>
+              </w:rPr>
+              <w:t>{{ parada.duracao_min }}</w:t>
+            </w:r>
+          </w:p>
+        </w:tc>
+        <w:tc>
+          <w:tcPr>
+            <w:tcW w:type="dxa" w:w="2413"/>
+          </w:tcPr>
+          <w:p>
+            <w:r>
+              <w:rPr>
+                <w:b w:val="0"/>
+                <w:sz w:val="16"/>
+              </w:rPr>
+              <w:t>{{ parada.causa }}</w:t>
+            </w:r>
+          </w:p>
+        </w:tc>
+        <w:tc>
+          <w:tcPr>
+            <w:tcW w:type="dxa" w:w="2413"/>
+          </w:tcPr>
+          <w:p>
+            <w:r>
+              <w:rPr>
+                <w:b w:val="0"/>
+                <w:sz w:val="16"/>
+              </w:rPr>
+              <w:t>{{ parada.descricao }}</w:t>
+            </w:r>
+          </w:p>
+        </w:tc>
+      </w:tr>
+      <w:tr>
+        <w:tc>
+          <w:tcPr>
+            <w:tcW w:type="dxa" w:w="2413"/>
+          </w:tcPr>
+          <w:p>
+            <w:r>
+              <w:rPr>
+                <w:b w:val="0"/>
+                <w:sz w:val="2"/>
+              </w:rPr>
+              <w:t>{%tr endfor %}</w:t>
+            </w:r>
+          </w:p>
+        </w:tc>
+        <w:tc>
+          <w:tcPr>
+            <w:tcW w:type="dxa" w:w="2413"/>
+          </w:tcPr>
+          <w:p/>
+        </w:tc>
+        <w:tc>
+          <w:tcPr>
+            <w:tcW w:type="dxa" w:w="2413"/>
+          </w:tcPr>
+          <w:p/>
+        </w:tc>
+        <w:tc>
+          <w:tcPr>
+            <w:tcW w:type="dxa" w:w="2413"/>
+          </w:tcPr>
+          <w:p/>
+        </w:tc>
+        <w:tc>
+          <w:tcPr>
+            <w:tcW w:type="dxa" w:w="2413"/>
+          </w:tcPr>
+          <w:p/>
+        </w:tc>
+        <w:tc>
+          <w:tcPr>
+            <w:tcW w:type="dxa" w:w="2413"/>
+          </w:tcPr>
+          <w:p/>
+        </w:tc>
+      </w:tr>
+    </w:tbl>
     <w:p>
       <w:pPr>
         <w:jc w:val="center"/>

</xml_diff>

<commit_message>
feat(kpi-report): Bloco 5 ganha coluna Observações + vertical center todas tabelas
Mudança 1 — Coluna Observações no Bloco 5:
- 7ª coluna "Observações" — vazia, largura ~87mm (~30% da página A4 paisagem)
- Para preenchimento manual durante reunião
- Bloco 2 (Top 5 mensal) inalterado — 6 colunas

Mudança 2 — Vertical center em todas as células:
- cell.vertical_alignment = WD_ALIGN_VERTICAL.CENTER aplicado em:
  - Tabelas KPI 3-col (Blocos 1, 3)
  - Tabelas paradas (Blocos 2, 5)
  - Tabela Detalhamento (Bloco 4)
  - Tabelas página 2 (3 áreas anotação)

Mudança 3 — Larguras de coluna definidas:
- Bloco 2 (6 col): 10, 35, 35, 25, 20, 131 mm
- Bloco 5 (7 col): 10, 28, 32, 18, 16, 65, 87 mm (Observações é a maior)

Documentação:
- SP-11 anotada com coluna Observações

pytest 62/62 verde.
</commit_message>
<xml_diff>
--- a/webapp/src/assets/templates/kpi_report.docx
+++ b/webapp/src/assets/templates/kpi_report.docx
@@ -47,6 +47,7 @@
         <w:tc>
           <w:tcPr>
             <w:tcW w:type="dxa" w:w="4827"/>
+            <w:vAlign w:val="center"/>
           </w:tcPr>
           <w:p>
             <w:pPr>
@@ -64,6 +65,7 @@
         <w:tc>
           <w:tcPr>
             <w:tcW w:type="dxa" w:w="4827"/>
+            <w:vAlign w:val="center"/>
           </w:tcPr>
           <w:p>
             <w:pPr>
@@ -81,6 +83,7 @@
         <w:tc>
           <w:tcPr>
             <w:tcW w:type="dxa" w:w="4827"/>
+            <w:vAlign w:val="center"/>
           </w:tcPr>
           <w:p>
             <w:pPr>
@@ -100,6 +103,7 @@
         <w:tc>
           <w:tcPr>
             <w:tcW w:type="dxa" w:w="4827"/>
+            <w:vAlign w:val="center"/>
           </w:tcPr>
           <w:p>
             <w:pPr>
@@ -117,6 +121,7 @@
         <w:tc>
           <w:tcPr>
             <w:tcW w:type="dxa" w:w="4827"/>
+            <w:vAlign w:val="center"/>
           </w:tcPr>
           <w:p>
             <w:pPr>
@@ -134,6 +139,7 @@
         <w:tc>
           <w:tcPr>
             <w:tcW w:type="dxa" w:w="4827"/>
+            <w:vAlign w:val="center"/>
           </w:tcPr>
           <w:p>
             <w:pPr>
@@ -153,6 +159,7 @@
         <w:tc>
           <w:tcPr>
             <w:tcW w:type="dxa" w:w="4827"/>
+            <w:vAlign w:val="center"/>
           </w:tcPr>
           <w:p>
             <w:pPr>
@@ -170,6 +177,7 @@
         <w:tc>
           <w:tcPr>
             <w:tcW w:type="dxa" w:w="4827"/>
+            <w:vAlign w:val="center"/>
           </w:tcPr>
           <w:p>
             <w:pPr>
@@ -187,6 +195,7 @@
         <w:tc>
           <w:tcPr>
             <w:tcW w:type="dxa" w:w="4827"/>
+            <w:vAlign w:val="center"/>
           </w:tcPr>
           <w:p>
             <w:pPr>
@@ -206,6 +215,7 @@
         <w:tc>
           <w:tcPr>
             <w:tcW w:type="dxa" w:w="4827"/>
+            <w:vAlign w:val="center"/>
           </w:tcPr>
           <w:p>
             <w:pPr>
@@ -223,6 +233,7 @@
         <w:tc>
           <w:tcPr>
             <w:tcW w:type="dxa" w:w="4827"/>
+            <w:vAlign w:val="center"/>
           </w:tcPr>
           <w:p>
             <w:pPr>
@@ -240,6 +251,7 @@
         <w:tc>
           <w:tcPr>
             <w:tcW w:type="dxa" w:w="4827"/>
+            <w:vAlign w:val="center"/>
           </w:tcPr>
           <w:p>
             <w:pPr>
@@ -282,7 +294,8 @@
       <w:tr>
         <w:tc>
           <w:tcPr>
-            <w:tcW w:type="dxa" w:w="2413"/>
+            <w:tcW w:type="dxa" w:w="567"/>
+            <w:vAlign w:val="center"/>
           </w:tcPr>
           <w:p>
             <w:r>
@@ -296,7 +309,8 @@
         </w:tc>
         <w:tc>
           <w:tcPr>
-            <w:tcW w:type="dxa" w:w="2413"/>
+            <w:tcW w:type="dxa" w:w="1984"/>
+            <w:vAlign w:val="center"/>
           </w:tcPr>
           <w:p>
             <w:r>
@@ -310,7 +324,8 @@
         </w:tc>
         <w:tc>
           <w:tcPr>
-            <w:tcW w:type="dxa" w:w="2413"/>
+            <w:tcW w:type="dxa" w:w="1984"/>
+            <w:vAlign w:val="center"/>
           </w:tcPr>
           <w:p>
             <w:r>
@@ -324,7 +339,8 @@
         </w:tc>
         <w:tc>
           <w:tcPr>
-            <w:tcW w:type="dxa" w:w="2413"/>
+            <w:tcW w:type="dxa" w:w="1417"/>
+            <w:vAlign w:val="center"/>
           </w:tcPr>
           <w:p>
             <w:r>
@@ -338,7 +354,8 @@
         </w:tc>
         <w:tc>
           <w:tcPr>
-            <w:tcW w:type="dxa" w:w="2413"/>
+            <w:tcW w:type="dxa" w:w="1134"/>
+            <w:vAlign w:val="center"/>
           </w:tcPr>
           <w:p>
             <w:r>
@@ -352,7 +369,8 @@
         </w:tc>
         <w:tc>
           <w:tcPr>
-            <w:tcW w:type="dxa" w:w="2413"/>
+            <w:tcW w:type="dxa" w:w="7427"/>
+            <w:vAlign w:val="center"/>
           </w:tcPr>
           <w:p>
             <w:r>
@@ -368,7 +386,8 @@
       <w:tr>
         <w:tc>
           <w:tcPr>
-            <w:tcW w:type="dxa" w:w="2413"/>
+            <w:tcW w:type="dxa" w:w="567"/>
+            <w:vAlign w:val="center"/>
           </w:tcPr>
           <w:p>
             <w:r>
@@ -382,31 +401,36 @@
         </w:tc>
         <w:tc>
           <w:tcPr>
-            <w:tcW w:type="dxa" w:w="2413"/>
+            <w:tcW w:type="dxa" w:w="1984"/>
+            <w:vAlign w:val="center"/>
           </w:tcPr>
           <w:p/>
         </w:tc>
         <w:tc>
           <w:tcPr>
-            <w:tcW w:type="dxa" w:w="2413"/>
+            <w:tcW w:type="dxa" w:w="1984"/>
+            <w:vAlign w:val="center"/>
           </w:tcPr>
           <w:p/>
         </w:tc>
         <w:tc>
           <w:tcPr>
-            <w:tcW w:type="dxa" w:w="2413"/>
+            <w:tcW w:type="dxa" w:w="1417"/>
+            <w:vAlign w:val="center"/>
           </w:tcPr>
           <w:p/>
         </w:tc>
         <w:tc>
           <w:tcPr>
-            <w:tcW w:type="dxa" w:w="2413"/>
+            <w:tcW w:type="dxa" w:w="1134"/>
+            <w:vAlign w:val="center"/>
           </w:tcPr>
           <w:p/>
         </w:tc>
         <w:tc>
           <w:tcPr>
-            <w:tcW w:type="dxa" w:w="2413"/>
+            <w:tcW w:type="dxa" w:w="7427"/>
+            <w:vAlign w:val="center"/>
           </w:tcPr>
           <w:p/>
         </w:tc>
@@ -414,7 +438,8 @@
       <w:tr>
         <w:tc>
           <w:tcPr>
-            <w:tcW w:type="dxa" w:w="2413"/>
+            <w:tcW w:type="dxa" w:w="567"/>
+            <w:vAlign w:val="center"/>
           </w:tcPr>
           <w:p>
             <w:r>
@@ -428,7 +453,8 @@
         </w:tc>
         <w:tc>
           <w:tcPr>
-            <w:tcW w:type="dxa" w:w="2413"/>
+            <w:tcW w:type="dxa" w:w="1984"/>
+            <w:vAlign w:val="center"/>
           </w:tcPr>
           <w:p>
             <w:r>
@@ -442,7 +468,8 @@
         </w:tc>
         <w:tc>
           <w:tcPr>
-            <w:tcW w:type="dxa" w:w="2413"/>
+            <w:tcW w:type="dxa" w:w="1984"/>
+            <w:vAlign w:val="center"/>
           </w:tcPr>
           <w:p>
             <w:r>
@@ -456,7 +483,8 @@
         </w:tc>
         <w:tc>
           <w:tcPr>
-            <w:tcW w:type="dxa" w:w="2413"/>
+            <w:tcW w:type="dxa" w:w="1417"/>
+            <w:vAlign w:val="center"/>
           </w:tcPr>
           <w:p>
             <w:r>
@@ -470,7 +498,8 @@
         </w:tc>
         <w:tc>
           <w:tcPr>
-            <w:tcW w:type="dxa" w:w="2413"/>
+            <w:tcW w:type="dxa" w:w="1134"/>
+            <w:vAlign w:val="center"/>
           </w:tcPr>
           <w:p>
             <w:r>
@@ -484,7 +513,8 @@
         </w:tc>
         <w:tc>
           <w:tcPr>
-            <w:tcW w:type="dxa" w:w="2413"/>
+            <w:tcW w:type="dxa" w:w="7427"/>
+            <w:vAlign w:val="center"/>
           </w:tcPr>
           <w:p>
             <w:r>
@@ -500,7 +530,8 @@
       <w:tr>
         <w:tc>
           <w:tcPr>
-            <w:tcW w:type="dxa" w:w="2413"/>
+            <w:tcW w:type="dxa" w:w="567"/>
+            <w:vAlign w:val="center"/>
           </w:tcPr>
           <w:p>
             <w:r>
@@ -514,31 +545,36 @@
         </w:tc>
         <w:tc>
           <w:tcPr>
-            <w:tcW w:type="dxa" w:w="2413"/>
+            <w:tcW w:type="dxa" w:w="1984"/>
+            <w:vAlign w:val="center"/>
           </w:tcPr>
           <w:p/>
         </w:tc>
         <w:tc>
           <w:tcPr>
-            <w:tcW w:type="dxa" w:w="2413"/>
+            <w:tcW w:type="dxa" w:w="1984"/>
+            <w:vAlign w:val="center"/>
           </w:tcPr>
           <w:p/>
         </w:tc>
         <w:tc>
           <w:tcPr>
-            <w:tcW w:type="dxa" w:w="2413"/>
+            <w:tcW w:type="dxa" w:w="1417"/>
+            <w:vAlign w:val="center"/>
           </w:tcPr>
           <w:p/>
         </w:tc>
         <w:tc>
           <w:tcPr>
-            <w:tcW w:type="dxa" w:w="2413"/>
+            <w:tcW w:type="dxa" w:w="1134"/>
+            <w:vAlign w:val="center"/>
           </w:tcPr>
           <w:p/>
         </w:tc>
         <w:tc>
           <w:tcPr>
-            <w:tcW w:type="dxa" w:w="2413"/>
+            <w:tcW w:type="dxa" w:w="7427"/>
+            <w:vAlign w:val="center"/>
           </w:tcPr>
           <w:p/>
         </w:tc>
@@ -568,6 +604,7 @@
         <w:tc>
           <w:tcPr>
             <w:tcW w:type="dxa" w:w="4827"/>
+            <w:vAlign w:val="center"/>
           </w:tcPr>
           <w:p>
             <w:pPr>
@@ -585,6 +622,7 @@
         <w:tc>
           <w:tcPr>
             <w:tcW w:type="dxa" w:w="4827"/>
+            <w:vAlign w:val="center"/>
           </w:tcPr>
           <w:p>
             <w:pPr>
@@ -602,6 +640,7 @@
         <w:tc>
           <w:tcPr>
             <w:tcW w:type="dxa" w:w="4827"/>
+            <w:vAlign w:val="center"/>
           </w:tcPr>
           <w:p>
             <w:pPr>
@@ -621,6 +660,7 @@
         <w:tc>
           <w:tcPr>
             <w:tcW w:type="dxa" w:w="4827"/>
+            <w:vAlign w:val="center"/>
           </w:tcPr>
           <w:p>
             <w:pPr>
@@ -638,6 +678,7 @@
         <w:tc>
           <w:tcPr>
             <w:tcW w:type="dxa" w:w="4827"/>
+            <w:vAlign w:val="center"/>
           </w:tcPr>
           <w:p>
             <w:pPr>
@@ -655,6 +696,7 @@
         <w:tc>
           <w:tcPr>
             <w:tcW w:type="dxa" w:w="4827"/>
+            <w:vAlign w:val="center"/>
           </w:tcPr>
           <w:p>
             <w:pPr>
@@ -674,6 +716,7 @@
         <w:tc>
           <w:tcPr>
             <w:tcW w:type="dxa" w:w="4827"/>
+            <w:vAlign w:val="center"/>
           </w:tcPr>
           <w:p>
             <w:pPr>
@@ -691,6 +734,7 @@
         <w:tc>
           <w:tcPr>
             <w:tcW w:type="dxa" w:w="4827"/>
+            <w:vAlign w:val="center"/>
           </w:tcPr>
           <w:p>
             <w:pPr>
@@ -708,6 +752,7 @@
         <w:tc>
           <w:tcPr>
             <w:tcW w:type="dxa" w:w="4827"/>
+            <w:vAlign w:val="center"/>
           </w:tcPr>
           <w:p>
             <w:pPr>
@@ -727,6 +772,7 @@
         <w:tc>
           <w:tcPr>
             <w:tcW w:type="dxa" w:w="4827"/>
+            <w:vAlign w:val="center"/>
           </w:tcPr>
           <w:p>
             <w:pPr>
@@ -744,6 +790,7 @@
         <w:tc>
           <w:tcPr>
             <w:tcW w:type="dxa" w:w="4827"/>
+            <w:vAlign w:val="center"/>
           </w:tcPr>
           <w:p>
             <w:pPr>
@@ -761,6 +808,7 @@
         <w:tc>
           <w:tcPr>
             <w:tcW w:type="dxa" w:w="4827"/>
+            <w:vAlign w:val="center"/>
           </w:tcPr>
           <w:p>
             <w:pPr>
@@ -807,6 +855,7 @@
         <w:tc>
           <w:tcPr>
             <w:tcW w:type="dxa" w:w="1609"/>
+            <w:vAlign w:val="center"/>
           </w:tcPr>
           <w:p>
             <w:r>
@@ -821,6 +870,7 @@
         <w:tc>
           <w:tcPr>
             <w:tcW w:type="dxa" w:w="1609"/>
+            <w:vAlign w:val="center"/>
           </w:tcPr>
           <w:p>
             <w:r>
@@ -835,6 +885,7 @@
         <w:tc>
           <w:tcPr>
             <w:tcW w:type="dxa" w:w="1609"/>
+            <w:vAlign w:val="center"/>
           </w:tcPr>
           <w:p>
             <w:r>
@@ -849,6 +900,7 @@
         <w:tc>
           <w:tcPr>
             <w:tcW w:type="dxa" w:w="1609"/>
+            <w:vAlign w:val="center"/>
           </w:tcPr>
           <w:p>
             <w:r>
@@ -863,6 +915,7 @@
         <w:tc>
           <w:tcPr>
             <w:tcW w:type="dxa" w:w="1609"/>
+            <w:vAlign w:val="center"/>
           </w:tcPr>
           <w:p>
             <w:r>
@@ -877,6 +930,7 @@
         <w:tc>
           <w:tcPr>
             <w:tcW w:type="dxa" w:w="1609"/>
+            <w:vAlign w:val="center"/>
           </w:tcPr>
           <w:p>
             <w:r>
@@ -891,6 +945,7 @@
         <w:tc>
           <w:tcPr>
             <w:tcW w:type="dxa" w:w="1609"/>
+            <w:vAlign w:val="center"/>
           </w:tcPr>
           <w:p>
             <w:r>
@@ -905,6 +960,7 @@
         <w:tc>
           <w:tcPr>
             <w:tcW w:type="dxa" w:w="1609"/>
+            <w:vAlign w:val="center"/>
           </w:tcPr>
           <w:p>
             <w:r>
@@ -919,6 +975,7 @@
         <w:tc>
           <w:tcPr>
             <w:tcW w:type="dxa" w:w="1609"/>
+            <w:vAlign w:val="center"/>
           </w:tcPr>
           <w:p>
             <w:r>
@@ -935,6 +992,7 @@
         <w:tc>
           <w:tcPr>
             <w:tcW w:type="dxa" w:w="1609"/>
+            <w:vAlign w:val="center"/>
           </w:tcPr>
           <w:p>
             <w:r>
@@ -949,48 +1007,56 @@
         <w:tc>
           <w:tcPr>
             <w:tcW w:type="dxa" w:w="1609"/>
+            <w:vAlign w:val="center"/>
           </w:tcPr>
           <w:p/>
         </w:tc>
         <w:tc>
           <w:tcPr>
             <w:tcW w:type="dxa" w:w="1609"/>
+            <w:vAlign w:val="center"/>
           </w:tcPr>
           <w:p/>
         </w:tc>
         <w:tc>
           <w:tcPr>
             <w:tcW w:type="dxa" w:w="1609"/>
+            <w:vAlign w:val="center"/>
           </w:tcPr>
           <w:p/>
         </w:tc>
         <w:tc>
           <w:tcPr>
             <w:tcW w:type="dxa" w:w="1609"/>
+            <w:vAlign w:val="center"/>
           </w:tcPr>
           <w:p/>
         </w:tc>
         <w:tc>
           <w:tcPr>
             <w:tcW w:type="dxa" w:w="1609"/>
+            <w:vAlign w:val="center"/>
           </w:tcPr>
           <w:p/>
         </w:tc>
         <w:tc>
           <w:tcPr>
             <w:tcW w:type="dxa" w:w="1609"/>
+            <w:vAlign w:val="center"/>
           </w:tcPr>
           <w:p/>
         </w:tc>
         <w:tc>
           <w:tcPr>
             <w:tcW w:type="dxa" w:w="1609"/>
+            <w:vAlign w:val="center"/>
           </w:tcPr>
           <w:p/>
         </w:tc>
         <w:tc>
           <w:tcPr>
             <w:tcW w:type="dxa" w:w="1609"/>
+            <w:vAlign w:val="center"/>
           </w:tcPr>
           <w:p/>
         </w:tc>
@@ -999,6 +1065,7 @@
         <w:tc>
           <w:tcPr>
             <w:tcW w:type="dxa" w:w="1609"/>
+            <w:vAlign w:val="center"/>
           </w:tcPr>
           <w:p>
             <w:r>
@@ -1013,6 +1080,7 @@
         <w:tc>
           <w:tcPr>
             <w:tcW w:type="dxa" w:w="1609"/>
+            <w:vAlign w:val="center"/>
           </w:tcPr>
           <w:p>
             <w:r>
@@ -1027,6 +1095,7 @@
         <w:tc>
           <w:tcPr>
             <w:tcW w:type="dxa" w:w="1609"/>
+            <w:vAlign w:val="center"/>
           </w:tcPr>
           <w:p>
             <w:r>
@@ -1041,6 +1110,7 @@
         <w:tc>
           <w:tcPr>
             <w:tcW w:type="dxa" w:w="1609"/>
+            <w:vAlign w:val="center"/>
           </w:tcPr>
           <w:p>
             <w:r>
@@ -1055,6 +1125,7 @@
         <w:tc>
           <w:tcPr>
             <w:tcW w:type="dxa" w:w="1609"/>
+            <w:vAlign w:val="center"/>
           </w:tcPr>
           <w:p>
             <w:r>
@@ -1069,6 +1140,7 @@
         <w:tc>
           <w:tcPr>
             <w:tcW w:type="dxa" w:w="1609"/>
+            <w:vAlign w:val="center"/>
           </w:tcPr>
           <w:p>
             <w:r>
@@ -1083,6 +1155,7 @@
         <w:tc>
           <w:tcPr>
             <w:tcW w:type="dxa" w:w="1609"/>
+            <w:vAlign w:val="center"/>
           </w:tcPr>
           <w:p>
             <w:r>
@@ -1097,6 +1170,7 @@
         <w:tc>
           <w:tcPr>
             <w:tcW w:type="dxa" w:w="1609"/>
+            <w:vAlign w:val="center"/>
           </w:tcPr>
           <w:p>
             <w:r>
@@ -1111,6 +1185,7 @@
         <w:tc>
           <w:tcPr>
             <w:tcW w:type="dxa" w:w="1609"/>
+            <w:vAlign w:val="center"/>
           </w:tcPr>
           <w:p>
             <w:r>
@@ -1127,6 +1202,7 @@
         <w:tc>
           <w:tcPr>
             <w:tcW w:type="dxa" w:w="1609"/>
+            <w:vAlign w:val="center"/>
           </w:tcPr>
           <w:p>
             <w:r>
@@ -1141,48 +1217,56 @@
         <w:tc>
           <w:tcPr>
             <w:tcW w:type="dxa" w:w="1609"/>
+            <w:vAlign w:val="center"/>
           </w:tcPr>
           <w:p/>
         </w:tc>
         <w:tc>
           <w:tcPr>
             <w:tcW w:type="dxa" w:w="1609"/>
+            <w:vAlign w:val="center"/>
           </w:tcPr>
           <w:p/>
         </w:tc>
         <w:tc>
           <w:tcPr>
             <w:tcW w:type="dxa" w:w="1609"/>
+            <w:vAlign w:val="center"/>
           </w:tcPr>
           <w:p/>
         </w:tc>
         <w:tc>
           <w:tcPr>
             <w:tcW w:type="dxa" w:w="1609"/>
+            <w:vAlign w:val="center"/>
           </w:tcPr>
           <w:p/>
         </w:tc>
         <w:tc>
           <w:tcPr>
             <w:tcW w:type="dxa" w:w="1609"/>
+            <w:vAlign w:val="center"/>
           </w:tcPr>
           <w:p/>
         </w:tc>
         <w:tc>
           <w:tcPr>
             <w:tcW w:type="dxa" w:w="1609"/>
+            <w:vAlign w:val="center"/>
           </w:tcPr>
           <w:p/>
         </w:tc>
         <w:tc>
           <w:tcPr>
             <w:tcW w:type="dxa" w:w="1609"/>
+            <w:vAlign w:val="center"/>
           </w:tcPr>
           <w:p/>
         </w:tc>
         <w:tc>
           <w:tcPr>
             <w:tcW w:type="dxa" w:w="1609"/>
+            <w:vAlign w:val="center"/>
           </w:tcPr>
           <w:p/>
         </w:tc>
@@ -1191,6 +1275,7 @@
         <w:tc>
           <w:tcPr>
             <w:tcW w:type="dxa" w:w="1609"/>
+            <w:vAlign w:val="center"/>
           </w:tcPr>
           <w:p>
             <w:r>
@@ -1205,6 +1290,7 @@
         <w:tc>
           <w:tcPr>
             <w:tcW w:type="dxa" w:w="1609"/>
+            <w:vAlign w:val="center"/>
           </w:tcPr>
           <w:p>
             <w:r>
@@ -1219,6 +1305,7 @@
         <w:tc>
           <w:tcPr>
             <w:tcW w:type="dxa" w:w="1609"/>
+            <w:vAlign w:val="center"/>
           </w:tcPr>
           <w:p>
             <w:r>
@@ -1233,6 +1320,7 @@
         <w:tc>
           <w:tcPr>
             <w:tcW w:type="dxa" w:w="1609"/>
+            <w:vAlign w:val="center"/>
           </w:tcPr>
           <w:p>
             <w:r>
@@ -1247,6 +1335,7 @@
         <w:tc>
           <w:tcPr>
             <w:tcW w:type="dxa" w:w="1609"/>
+            <w:vAlign w:val="center"/>
           </w:tcPr>
           <w:p>
             <w:r>
@@ -1261,6 +1350,7 @@
         <w:tc>
           <w:tcPr>
             <w:tcW w:type="dxa" w:w="1609"/>
+            <w:vAlign w:val="center"/>
           </w:tcPr>
           <w:p>
             <w:r>
@@ -1275,6 +1365,7 @@
         <w:tc>
           <w:tcPr>
             <w:tcW w:type="dxa" w:w="1609"/>
+            <w:vAlign w:val="center"/>
           </w:tcPr>
           <w:p>
             <w:r>
@@ -1289,6 +1380,7 @@
         <w:tc>
           <w:tcPr>
             <w:tcW w:type="dxa" w:w="1609"/>
+            <w:vAlign w:val="center"/>
           </w:tcPr>
           <w:p>
             <w:r>
@@ -1303,6 +1395,7 @@
         <w:tc>
           <w:tcPr>
             <w:tcW w:type="dxa" w:w="1609"/>
+            <w:vAlign w:val="center"/>
           </w:tcPr>
           <w:p>
             <w:r>
@@ -1332,17 +1425,19 @@
         <w:tblLook w:firstColumn="1" w:firstRow="1" w:lastColumn="0" w:lastRow="0" w:noHBand="0" w:noVBand="1" w:val="04A0"/>
       </w:tblPr>
       <w:tblGrid>
-        <w:gridCol w:w="2413"/>
-        <w:gridCol w:w="2413"/>
-        <w:gridCol w:w="2413"/>
-        <w:gridCol w:w="2413"/>
-        <w:gridCol w:w="2413"/>
-        <w:gridCol w:w="2413"/>
+        <w:gridCol w:w="2069"/>
+        <w:gridCol w:w="2069"/>
+        <w:gridCol w:w="2069"/>
+        <w:gridCol w:w="2069"/>
+        <w:gridCol w:w="2069"/>
+        <w:gridCol w:w="2069"/>
+        <w:gridCol w:w="2069"/>
       </w:tblGrid>
       <w:tr>
         <w:tc>
           <w:tcPr>
-            <w:tcW w:type="dxa" w:w="2413"/>
+            <w:tcW w:type="dxa" w:w="567"/>
+            <w:vAlign w:val="center"/>
           </w:tcPr>
           <w:p>
             <w:r>
@@ -1356,7 +1451,8 @@
         </w:tc>
         <w:tc>
           <w:tcPr>
-            <w:tcW w:type="dxa" w:w="2413"/>
+            <w:tcW w:type="dxa" w:w="1587"/>
+            <w:vAlign w:val="center"/>
           </w:tcPr>
           <w:p>
             <w:r>
@@ -1370,7 +1466,8 @@
         </w:tc>
         <w:tc>
           <w:tcPr>
-            <w:tcW w:type="dxa" w:w="2413"/>
+            <w:tcW w:type="dxa" w:w="1814"/>
+            <w:vAlign w:val="center"/>
           </w:tcPr>
           <w:p>
             <w:r>
@@ -1384,7 +1481,8 @@
         </w:tc>
         <w:tc>
           <w:tcPr>
-            <w:tcW w:type="dxa" w:w="2413"/>
+            <w:tcW w:type="dxa" w:w="1020"/>
+            <w:vAlign w:val="center"/>
           </w:tcPr>
           <w:p>
             <w:r>
@@ -1398,7 +1496,8 @@
         </w:tc>
         <w:tc>
           <w:tcPr>
-            <w:tcW w:type="dxa" w:w="2413"/>
+            <w:tcW w:type="dxa" w:w="907"/>
+            <w:vAlign w:val="center"/>
           </w:tcPr>
           <w:p>
             <w:r>
@@ -1412,7 +1511,8 @@
         </w:tc>
         <w:tc>
           <w:tcPr>
-            <w:tcW w:type="dxa" w:w="2413"/>
+            <w:tcW w:type="dxa" w:w="3685"/>
+            <w:vAlign w:val="center"/>
           </w:tcPr>
           <w:p>
             <w:r>
@@ -1424,11 +1524,27 @@
             </w:r>
           </w:p>
         </w:tc>
+        <w:tc>
+          <w:tcPr>
+            <w:tcW w:type="dxa" w:w="4932"/>
+            <w:vAlign w:val="center"/>
+          </w:tcPr>
+          <w:p>
+            <w:r>
+              <w:rPr>
+                <w:b/>
+                <w:sz w:val="18"/>
+              </w:rPr>
+              <w:t>Observações</w:t>
+            </w:r>
+          </w:p>
+        </w:tc>
       </w:tr>
       <w:tr>
         <w:tc>
           <w:tcPr>
-            <w:tcW w:type="dxa" w:w="2413"/>
+            <w:tcW w:type="dxa" w:w="567"/>
+            <w:vAlign w:val="center"/>
           </w:tcPr>
           <w:p>
             <w:r>
@@ -1442,31 +1558,43 @@
         </w:tc>
         <w:tc>
           <w:tcPr>
-            <w:tcW w:type="dxa" w:w="2413"/>
+            <w:tcW w:type="dxa" w:w="1587"/>
+            <w:vAlign w:val="center"/>
           </w:tcPr>
           <w:p/>
         </w:tc>
         <w:tc>
           <w:tcPr>
-            <w:tcW w:type="dxa" w:w="2413"/>
+            <w:tcW w:type="dxa" w:w="1814"/>
+            <w:vAlign w:val="center"/>
           </w:tcPr>
           <w:p/>
         </w:tc>
         <w:tc>
           <w:tcPr>
-            <w:tcW w:type="dxa" w:w="2413"/>
+            <w:tcW w:type="dxa" w:w="1020"/>
+            <w:vAlign w:val="center"/>
           </w:tcPr>
           <w:p/>
         </w:tc>
         <w:tc>
           <w:tcPr>
-            <w:tcW w:type="dxa" w:w="2413"/>
+            <w:tcW w:type="dxa" w:w="907"/>
+            <w:vAlign w:val="center"/>
           </w:tcPr>
           <w:p/>
         </w:tc>
         <w:tc>
           <w:tcPr>
-            <w:tcW w:type="dxa" w:w="2413"/>
+            <w:tcW w:type="dxa" w:w="3685"/>
+            <w:vAlign w:val="center"/>
+          </w:tcPr>
+          <w:p/>
+        </w:tc>
+        <w:tc>
+          <w:tcPr>
+            <w:tcW w:type="dxa" w:w="4932"/>
+            <w:vAlign w:val="center"/>
           </w:tcPr>
           <w:p/>
         </w:tc>
@@ -1474,7 +1602,8 @@
       <w:tr>
         <w:tc>
           <w:tcPr>
-            <w:tcW w:type="dxa" w:w="2413"/>
+            <w:tcW w:type="dxa" w:w="567"/>
+            <w:vAlign w:val="center"/>
           </w:tcPr>
           <w:p>
             <w:r>
@@ -1488,7 +1617,8 @@
         </w:tc>
         <w:tc>
           <w:tcPr>
-            <w:tcW w:type="dxa" w:w="2413"/>
+            <w:tcW w:type="dxa" w:w="1587"/>
+            <w:vAlign w:val="center"/>
           </w:tcPr>
           <w:p>
             <w:r>
@@ -1502,7 +1632,8 @@
         </w:tc>
         <w:tc>
           <w:tcPr>
-            <w:tcW w:type="dxa" w:w="2413"/>
+            <w:tcW w:type="dxa" w:w="1814"/>
+            <w:vAlign w:val="center"/>
           </w:tcPr>
           <w:p>
             <w:r>
@@ -1516,7 +1647,8 @@
         </w:tc>
         <w:tc>
           <w:tcPr>
-            <w:tcW w:type="dxa" w:w="2413"/>
+            <w:tcW w:type="dxa" w:w="1020"/>
+            <w:vAlign w:val="center"/>
           </w:tcPr>
           <w:p>
             <w:r>
@@ -1530,7 +1662,8 @@
         </w:tc>
         <w:tc>
           <w:tcPr>
-            <w:tcW w:type="dxa" w:w="2413"/>
+            <w:tcW w:type="dxa" w:w="907"/>
+            <w:vAlign w:val="center"/>
           </w:tcPr>
           <w:p>
             <w:r>
@@ -1544,7 +1677,8 @@
         </w:tc>
         <w:tc>
           <w:tcPr>
-            <w:tcW w:type="dxa" w:w="2413"/>
+            <w:tcW w:type="dxa" w:w="3685"/>
+            <w:vAlign w:val="center"/>
           </w:tcPr>
           <w:p>
             <w:r>
@@ -1556,11 +1690,27 @@
             </w:r>
           </w:p>
         </w:tc>
+        <w:tc>
+          <w:tcPr>
+            <w:tcW w:type="dxa" w:w="4932"/>
+            <w:vAlign w:val="center"/>
+          </w:tcPr>
+          <w:p>
+            <w:r>
+              <w:rPr>
+                <w:b w:val="0"/>
+                <w:sz w:val="16"/>
+              </w:rPr>
+              <w:t xml:space="preserve"> </w:t>
+            </w:r>
+          </w:p>
+        </w:tc>
       </w:tr>
       <w:tr>
         <w:tc>
           <w:tcPr>
-            <w:tcW w:type="dxa" w:w="2413"/>
+            <w:tcW w:type="dxa" w:w="567"/>
+            <w:vAlign w:val="center"/>
           </w:tcPr>
           <w:p>
             <w:r>
@@ -1574,31 +1724,43 @@
         </w:tc>
         <w:tc>
           <w:tcPr>
-            <w:tcW w:type="dxa" w:w="2413"/>
+            <w:tcW w:type="dxa" w:w="1587"/>
+            <w:vAlign w:val="center"/>
           </w:tcPr>
           <w:p/>
         </w:tc>
         <w:tc>
           <w:tcPr>
-            <w:tcW w:type="dxa" w:w="2413"/>
+            <w:tcW w:type="dxa" w:w="1814"/>
+            <w:vAlign w:val="center"/>
           </w:tcPr>
           <w:p/>
         </w:tc>
         <w:tc>
           <w:tcPr>
-            <w:tcW w:type="dxa" w:w="2413"/>
+            <w:tcW w:type="dxa" w:w="1020"/>
+            <w:vAlign w:val="center"/>
           </w:tcPr>
           <w:p/>
         </w:tc>
         <w:tc>
           <w:tcPr>
-            <w:tcW w:type="dxa" w:w="2413"/>
+            <w:tcW w:type="dxa" w:w="907"/>
+            <w:vAlign w:val="center"/>
           </w:tcPr>
           <w:p/>
         </w:tc>
         <w:tc>
           <w:tcPr>
-            <w:tcW w:type="dxa" w:w="2413"/>
+            <w:tcW w:type="dxa" w:w="3685"/>
+            <w:vAlign w:val="center"/>
+          </w:tcPr>
+          <w:p/>
+        </w:tc>
+        <w:tc>
+          <w:tcPr>
+            <w:tcW w:type="dxa" w:w="4932"/>
+            <w:vAlign w:val="center"/>
           </w:tcPr>
           <w:p/>
         </w:tc>
@@ -1655,6 +1817,7 @@
         <w:tc>
           <w:tcPr>
             <w:tcW w:type="dxa" w:w="14480"/>
+            <w:vAlign w:val="center"/>
           </w:tcPr>
           <w:p>
             <w:r>
@@ -1694,6 +1857,7 @@
         <w:tc>
           <w:tcPr>
             <w:tcW w:type="dxa" w:w="14480"/>
+            <w:vAlign w:val="center"/>
           </w:tcPr>
           <w:p>
             <w:r>
@@ -1733,6 +1897,7 @@
         <w:tc>
           <w:tcPr>
             <w:tcW w:type="dxa" w:w="14480"/>
+            <w:vAlign w:val="center"/>
           </w:tcPr>
           <w:p>
             <w:r>

</xml_diff>

<commit_message>
style(kpi-report): fonte sunburst 22pt + espaçamento headings de bloco
Perfumarias 2026-05-13 — checkpoint antes do próximo ciclo:

1. Fonte sunburst aumentada 18pt → 22pt (validação visual confirmou)
   - Aplicada em fig.update_layout(font=dict(size=22)) APÓS
     create_kpi_sunburst_chart. Tela mantém font default.

2. Espaçamento antes dos headings de bloco (14pt space_before):
   - "Indicadores Mensais — Planta"
   - "Top 5 Paradas do Período Mensal"
   - "Indicadores Últimas 24 Horas — Planta"
   - "Detalhamento por Equipamento"
   - "Paradas das Últimas 24 Horas"
   - Headings da página 2 (Segurança / Solicitações / Observações)
   - Rodapé "Gerado em..." com 8pt space_before
</commit_message>
<xml_diff>
--- a/webapp/src/assets/templates/kpi_report.docx
+++ b/webapp/src/assets/templates/kpi_report.docx
@@ -24,6 +24,9 @@
       </w:r>
     </w:p>
     <w:p>
+      <w:pPr>
+        <w:spacing w:before="280"/>
+      </w:pPr>
       <w:r>
         <w:rPr>
           <w:b/>
@@ -269,6 +272,9 @@
       </w:tr>
     </w:tbl>
     <w:p>
+      <w:pPr>
+        <w:spacing w:before="280"/>
+      </w:pPr>
       <w:r>
         <w:rPr>
           <w:b/>
@@ -581,6 +587,9 @@
       </w:tr>
     </w:tbl>
     <w:p>
+      <w:pPr>
+        <w:spacing w:before="280"/>
+      </w:pPr>
       <w:r>
         <w:rPr>
           <w:b/>
@@ -826,6 +835,9 @@
       </w:tr>
     </w:tbl>
     <w:p>
+      <w:pPr>
+        <w:spacing w:before="280"/>
+      </w:pPr>
       <w:r>
         <w:rPr>
           <w:b/>
@@ -1410,6 +1422,9 @@
       </w:tr>
     </w:tbl>
     <w:p>
+      <w:pPr>
+        <w:spacing w:before="280"/>
+      </w:pPr>
       <w:r>
         <w:rPr>
           <w:b/>
@@ -1768,6 +1783,7 @@
     </w:tbl>
     <w:p>
       <w:pPr>
+        <w:spacing w:before="160"/>
         <w:jc w:val="center"/>
       </w:pPr>
       <w:r>
@@ -1793,6 +1809,9 @@
       </w:r>
     </w:p>
     <w:p>
+      <w:pPr>
+        <w:spacing w:before="280"/>
+      </w:pPr>
       <w:r>
         <w:rPr>
           <w:b/>
@@ -1833,6 +1852,9 @@
       </w:r>
     </w:p>
     <w:p>
+      <w:pPr>
+        <w:spacing w:before="280"/>
+      </w:pPr>
       <w:r>
         <w:rPr>
           <w:b/>
@@ -1873,6 +1895,9 @@
       </w:r>
     </w:p>
     <w:p>
+      <w:pPr>
+        <w:spacing w:before="280"/>
+      </w:pPr>
       <w:r>
         <w:rPr>
           <w:b/>

</xml_diff>

<commit_message>
style(kpi-report): footer "Powered by [logo Tekmont]" (replica gantt/workflow)
Padrão encontrado em assets/gantt_print.js:104-106 e workflow_print.js
(footer com "Powered by" + img logo.png). Replicado no KPIReport:

- Adicionado parágrafo centralizado com "Powered by " + img embedded
- Logo: assets/logo.png height=Mm(6) (~22px equivalent)
- Posicionamento: fim da página 1 (após rodapé "Gerado em...") e fim da
  página 2 (após áreas de anotação)
- Embed direto via add_picture — sem placeholder Jinja (imagem fixa,
  não depende de dados de runtime)

Fallback: se logo ausente, exibe "Tekmont" em negrito.
</commit_message>
<xml_diff>
--- a/webapp/src/assets/templates/kpi_report.docx
+++ b/webapp/src/assets/templates/kpi_report.docx
@@ -1795,6 +1795,53 @@
       </w:r>
     </w:p>
     <w:p>
+      <w:pPr>
+        <w:spacing w:before="80"/>
+        <w:jc w:val="center"/>
+      </w:pPr>
+      <w:r>
+        <w:rPr>
+          <w:i/>
+          <w:sz w:val="16"/>
+        </w:rPr>
+        <w:t xml:space="preserve">Powered by </w:t>
+      </w:r>
+      <w:r>
+        <w:drawing>
+          <wp:inline xmlns:a="http://schemas.openxmlformats.org/drawingml/2006/main" xmlns:pic="http://schemas.openxmlformats.org/drawingml/2006/picture">
+            <wp:extent cx="523720" cy="216000"/>
+            <wp:docPr id="1" name="Picture 1"/>
+            <wp:cNvGraphicFramePr>
+              <a:graphicFrameLocks noChangeAspect="1"/>
+            </wp:cNvGraphicFramePr>
+            <a:graphic>
+              <a:graphicData uri="http://schemas.openxmlformats.org/drawingml/2006/picture">
+                <pic:pic>
+                  <pic:nvPicPr>
+                    <pic:cNvPr id="0" name="logo.png"/>
+                    <pic:cNvPicPr/>
+                  </pic:nvPicPr>
+                  <pic:blipFill>
+                    <a:blip r:embed="rId9"/>
+                    <a:stretch>
+                      <a:fillRect/>
+                    </a:stretch>
+                  </pic:blipFill>
+                  <pic:spPr>
+                    <a:xfrm>
+                      <a:off x="0" y="0"/>
+                      <a:ext cx="523720" cy="216000"/>
+                    </a:xfrm>
+                    <a:prstGeom prst="rect"/>
+                  </pic:spPr>
+                </pic:pic>
+              </a:graphicData>
+            </a:graphic>
+          </wp:inline>
+        </w:drawing>
+      </w:r>
+    </w:p>
+    <w:p>
       <w:r>
         <w:br w:type="page"/>
       </w:r>
@@ -1935,6 +1982,53 @@
     <w:p>
       <w:r>
         <w:t xml:space="preserve"> </w:t>
+      </w:r>
+    </w:p>
+    <w:p>
+      <w:pPr>
+        <w:spacing w:before="200"/>
+        <w:jc w:val="center"/>
+      </w:pPr>
+      <w:r>
+        <w:rPr>
+          <w:i/>
+          <w:sz w:val="16"/>
+        </w:rPr>
+        <w:t xml:space="preserve">Powered by </w:t>
+      </w:r>
+      <w:r>
+        <w:drawing>
+          <wp:inline xmlns:a="http://schemas.openxmlformats.org/drawingml/2006/main" xmlns:pic="http://schemas.openxmlformats.org/drawingml/2006/picture">
+            <wp:extent cx="523720" cy="216000"/>
+            <wp:docPr id="2" name="Picture 2"/>
+            <wp:cNvGraphicFramePr>
+              <a:graphicFrameLocks noChangeAspect="1"/>
+            </wp:cNvGraphicFramePr>
+            <a:graphic>
+              <a:graphicData uri="http://schemas.openxmlformats.org/drawingml/2006/picture">
+                <pic:pic>
+                  <pic:nvPicPr>
+                    <pic:cNvPr id="0" name="logo.png"/>
+                    <pic:cNvPicPr/>
+                  </pic:nvPicPr>
+                  <pic:blipFill>
+                    <a:blip r:embed="rId9"/>
+                    <a:stretch>
+                      <a:fillRect/>
+                    </a:stretch>
+                  </pic:blipFill>
+                  <pic:spPr>
+                    <a:xfrm>
+                      <a:off x="0" y="0"/>
+                      <a:ext cx="523720" cy="216000"/>
+                    </a:xfrm>
+                    <a:prstGeom prst="rect"/>
+                  </pic:spPr>
+                </pic:pic>
+              </a:graphicData>
+            </a:graphic>
+          </wp:inline>
+        </w:drawing>
       </w:r>
     </w:p>
     <w:sectPr>

</xml_diff>

<commit_message>
style(kpi-report): Powered by no FOOTER Word — todas páginas, direita
Substitui parágrafos manuais (commit 3df3ebf) por footer nativo do Word:
section.footer.paragraphs[0] com alignment=RIGHT + "Powered by " + logo.

Vantagens:
- Repete em TODAS as páginas automaticamente (não só fim de cada bloco)
- Alinhado à direita conforme solicitado
- Não ocupa espaço no corpo do documento

Bottom margin aumentado: 10mm → 14mm para garantir o footer caber sem
sobrepor o conteúdo do corpo.
</commit_message>
<xml_diff>
--- a/webapp/src/assets/templates/kpi_report.docx
+++ b/webapp/src/assets/templates/kpi_report.docx
@@ -1795,53 +1795,6 @@
       </w:r>
     </w:p>
     <w:p>
-      <w:pPr>
-        <w:spacing w:before="80"/>
-        <w:jc w:val="center"/>
-      </w:pPr>
-      <w:r>
-        <w:rPr>
-          <w:i/>
-          <w:sz w:val="16"/>
-        </w:rPr>
-        <w:t xml:space="preserve">Powered by </w:t>
-      </w:r>
-      <w:r>
-        <w:drawing>
-          <wp:inline xmlns:a="http://schemas.openxmlformats.org/drawingml/2006/main" xmlns:pic="http://schemas.openxmlformats.org/drawingml/2006/picture">
-            <wp:extent cx="523720" cy="216000"/>
-            <wp:docPr id="1" name="Picture 1"/>
-            <wp:cNvGraphicFramePr>
-              <a:graphicFrameLocks noChangeAspect="1"/>
-            </wp:cNvGraphicFramePr>
-            <a:graphic>
-              <a:graphicData uri="http://schemas.openxmlformats.org/drawingml/2006/picture">
-                <pic:pic>
-                  <pic:nvPicPr>
-                    <pic:cNvPr id="0" name="logo.png"/>
-                    <pic:cNvPicPr/>
-                  </pic:nvPicPr>
-                  <pic:blipFill>
-                    <a:blip r:embed="rId9"/>
-                    <a:stretch>
-                      <a:fillRect/>
-                    </a:stretch>
-                  </pic:blipFill>
-                  <pic:spPr>
-                    <a:xfrm>
-                      <a:off x="0" y="0"/>
-                      <a:ext cx="523720" cy="216000"/>
-                    </a:xfrm>
-                    <a:prstGeom prst="rect"/>
-                  </pic:spPr>
-                </pic:pic>
-              </a:graphicData>
-            </a:graphic>
-          </wp:inline>
-        </w:drawing>
-      </w:r>
-    </w:p>
-    <w:p>
       <w:r>
         <w:br w:type="page"/>
       </w:r>
@@ -1984,61 +1937,67 @@
         <w:t xml:space="preserve"> </w:t>
       </w:r>
     </w:p>
-    <w:p>
-      <w:pPr>
-        <w:spacing w:before="200"/>
-        <w:jc w:val="center"/>
-      </w:pPr>
-      <w:r>
-        <w:rPr>
-          <w:i/>
-          <w:sz w:val="16"/>
-        </w:rPr>
-        <w:t xml:space="preserve">Powered by </w:t>
-      </w:r>
-      <w:r>
-        <w:drawing>
-          <wp:inline xmlns:a="http://schemas.openxmlformats.org/drawingml/2006/main" xmlns:pic="http://schemas.openxmlformats.org/drawingml/2006/picture">
-            <wp:extent cx="523720" cy="216000"/>
-            <wp:docPr id="2" name="Picture 2"/>
-            <wp:cNvGraphicFramePr>
-              <a:graphicFrameLocks noChangeAspect="1"/>
-            </wp:cNvGraphicFramePr>
-            <a:graphic>
-              <a:graphicData uri="http://schemas.openxmlformats.org/drawingml/2006/picture">
-                <pic:pic>
-                  <pic:nvPicPr>
-                    <pic:cNvPr id="0" name="logo.png"/>
-                    <pic:cNvPicPr/>
-                  </pic:nvPicPr>
-                  <pic:blipFill>
-                    <a:blip r:embed="rId9"/>
-                    <a:stretch>
-                      <a:fillRect/>
-                    </a:stretch>
-                  </pic:blipFill>
-                  <pic:spPr>
-                    <a:xfrm>
-                      <a:off x="0" y="0"/>
-                      <a:ext cx="523720" cy="216000"/>
-                    </a:xfrm>
-                    <a:prstGeom prst="rect"/>
-                  </pic:spPr>
-                </pic:pic>
-              </a:graphicData>
-            </a:graphic>
-          </wp:inline>
-        </w:drawing>
-      </w:r>
-    </w:p>
     <w:sectPr>
+      <w:footerReference w:type="default" r:id="rId9"/>
       <w:pgSz w:w="15840" w:h="12240" w:orient="landscape"/>
-      <w:pgMar w:top="567" w:right="680" w:bottom="567" w:left="680" w:header="720" w:footer="720" w:gutter="0"/>
+      <w:pgMar w:top="567" w:right="680" w:bottom="794" w:left="680" w:header="720" w:footer="720" w:gutter="0"/>
       <w:cols w:space="720"/>
       <w:docGrid w:linePitch="360"/>
     </w:sectPr>
   </w:body>
 </w:document>
+</file>
+
+<file path=word/footer1.xml><?xml version="1.0" encoding="utf-8"?>
+<w:ftr xmlns:m="http://schemas.openxmlformats.org/officeDocument/2006/math" xmlns:mc="http://schemas.openxmlformats.org/markup-compatibility/2006" xmlns:mo="http://schemas.microsoft.com/office/mac/office/2008/main" xmlns:mv="urn:schemas-microsoft-com:mac:vml" xmlns:o="urn:schemas-microsoft-com:office:office" xmlns:r="http://schemas.openxmlformats.org/officeDocument/2006/relationships" xmlns:v="urn:schemas-microsoft-com:vml" xmlns:w10="urn:schemas-microsoft-com:office:word" xmlns:w14="http://schemas.microsoft.com/office/word/2010/wordml" xmlns:w="http://schemas.openxmlformats.org/wordprocessingml/2006/main" xmlns:wne="http://schemas.microsoft.com/office/word/2006/wordml" xmlns:wp14="http://schemas.microsoft.com/office/word/2010/wordprocessingDrawing" xmlns:wp="http://schemas.openxmlformats.org/drawingml/2006/wordprocessingDrawing" xmlns:wpc="http://schemas.microsoft.com/office/word/2010/wordprocessingCanvas" xmlns:wpg="http://schemas.microsoft.com/office/word/2010/wordprocessingGroup" xmlns:wpi="http://schemas.microsoft.com/office/word/2010/wordprocessingInk" xmlns:wps="http://schemas.microsoft.com/office/word/2010/wordprocessingShape" mc:Ignorable="w14 wp14">
+  <w:p>
+    <w:pPr>
+      <w:pStyle w:val="Footer"/>
+      <w:jc w:val="right"/>
+    </w:pPr>
+    <w:r>
+      <w:rPr>
+        <w:i/>
+        <w:sz w:val="16"/>
+      </w:rPr>
+      <w:t xml:space="preserve">Powered by </w:t>
+    </w:r>
+    <w:r>
+      <w:drawing>
+        <wp:inline xmlns:a="http://schemas.openxmlformats.org/drawingml/2006/main" xmlns:pic="http://schemas.openxmlformats.org/drawingml/2006/picture">
+          <wp:extent cx="523720" cy="216000"/>
+          <wp:docPr id="1" name="Picture 1"/>
+          <wp:cNvGraphicFramePr>
+            <a:graphicFrameLocks noChangeAspect="1"/>
+          </wp:cNvGraphicFramePr>
+          <a:graphic>
+            <a:graphicData uri="http://schemas.openxmlformats.org/drawingml/2006/picture">
+              <pic:pic>
+                <pic:nvPicPr>
+                  <pic:cNvPr id="0" name="logo.png"/>
+                  <pic:cNvPicPr/>
+                </pic:nvPicPr>
+                <pic:blipFill>
+                  <a:blip r:embed="rId1"/>
+                  <a:stretch>
+                    <a:fillRect/>
+                  </a:stretch>
+                </pic:blipFill>
+                <pic:spPr>
+                  <a:xfrm>
+                    <a:off x="0" y="0"/>
+                    <a:ext cx="523720" cy="216000"/>
+                  </a:xfrm>
+                  <a:prstGeom prst="rect"/>
+                </pic:spPr>
+              </pic:pic>
+            </a:graphicData>
+          </a:graphic>
+        </wp:inline>
+      </w:drawing>
+    </w:r>
+  </w:p>
+</w:ftr>
 </file>
 
 <file path=word/numbering.xml><?xml version="1.0" encoding="utf-8"?>

</xml_diff>

<commit_message>
style(kpi-report): reordenação dos blocos no template via Word
Edição manual pelo PCM em 2026-05-13 — reordenação dos blocos do relatório
via cut/paste no Word, com placeholders Jinja preservados.

Validação automática:
  ✅ _load_template carrega
  ✅ montar_docx render real produz DOCX válido (64794B, PK signature)
  ✅ pytest 62/62 verde
</commit_message>
<xml_diff>
--- a/webapp/src/assets/templates/kpi_report.docx
+++ b/webapp/src/assets/templates/kpi_report.docx
@@ -87,43 +87,17 @@
         <w:spacing w:before="280"/>
         <w:rPr>
           <w:color w:val="1B2860"/>
+          <w:lang w:val="pt-BR"/>
         </w:rPr>
       </w:pPr>
-      <w:proofErr w:type="spellStart"/>
       <w:r>
         <w:rPr>
           <w:b/>
           <w:color w:val="1B2860"/>
           <w:sz w:val="24"/>
+          <w:lang w:val="pt-BR"/>
         </w:rPr>
-        <w:t>Indicadores</w:t>
-      </w:r>
-      <w:proofErr w:type="spellEnd"/>
-      <w:r>
-        <w:rPr>
-          <w:b/>
-          <w:color w:val="1B2860"/>
-          <w:sz w:val="24"/>
-        </w:rPr>
-        <w:t xml:space="preserve"> </w:t>
-      </w:r>
-      <w:proofErr w:type="spellStart"/>
-      <w:r>
-        <w:rPr>
-          <w:b/>
-          <w:color w:val="1B2860"/>
-          <w:sz w:val="24"/>
-        </w:rPr>
-        <w:t>Mensais</w:t>
-      </w:r>
-      <w:proofErr w:type="spellEnd"/>
-      <w:r>
-        <w:rPr>
-          <w:b/>
-          <w:color w:val="1B2860"/>
-          <w:sz w:val="24"/>
-        </w:rPr>
-        <w:t xml:space="preserve"> — Planta</w:t>
+        <w:t>Indicadores Mensais — Planta</w:t>
       </w:r>
     </w:p>
     <w:tbl>
@@ -1108,7 +1082,7 @@
         <w:tc>
           <w:tcPr>
             <w:cnfStyle w:val="001000000000" w:firstRow="0" w:lastRow="0" w:firstColumn="1" w:lastColumn="0" w:oddVBand="0" w:evenVBand="0" w:oddHBand="0" w:evenHBand="0" w:firstRowFirstColumn="0" w:firstRowLastColumn="0" w:lastRowFirstColumn="0" w:lastRowLastColumn="0"/>
-            <w:tcW w:w="4827" w:type="dxa"/>
+            <w:tcW w:w="4270" w:type="dxa"/>
             <w:vAlign w:val="center"/>
           </w:tcPr>
           <w:p>
@@ -1122,7 +1096,7 @@
         </w:tc>
         <w:tc>
           <w:tcPr>
-            <w:tcW w:w="4827" w:type="dxa"/>
+            <w:tcW w:w="4581" w:type="dxa"/>
             <w:vAlign w:val="center"/>
           </w:tcPr>
           <w:p>
@@ -1137,7 +1111,7 @@
         </w:tc>
         <w:tc>
           <w:tcPr>
-            <w:tcW w:w="4827" w:type="dxa"/>
+            <w:tcW w:w="5845" w:type="dxa"/>
             <w:vAlign w:val="center"/>
           </w:tcPr>
           <w:p>
@@ -1158,7 +1132,7 @@
         <w:tc>
           <w:tcPr>
             <w:cnfStyle w:val="001000000000" w:firstRow="0" w:lastRow="0" w:firstColumn="1" w:lastColumn="0" w:oddVBand="0" w:evenVBand="0" w:oddHBand="0" w:evenHBand="0" w:firstRowFirstColumn="0" w:firstRowLastColumn="0" w:lastRowFirstColumn="0" w:lastRowLastColumn="0"/>
-            <w:tcW w:w="4827" w:type="dxa"/>
+            <w:tcW w:w="4270" w:type="dxa"/>
             <w:vAlign w:val="center"/>
           </w:tcPr>
           <w:p>
@@ -1175,7 +1149,7 @@
         </w:tc>
         <w:tc>
           <w:tcPr>
-            <w:tcW w:w="4827" w:type="dxa"/>
+            <w:tcW w:w="4581" w:type="dxa"/>
             <w:vAlign w:val="center"/>
           </w:tcPr>
           <w:p>
@@ -1194,7 +1168,7 @@
         </w:tc>
         <w:tc>
           <w:tcPr>
-            <w:tcW w:w="4827" w:type="dxa"/>
+            <w:tcW w:w="5845" w:type="dxa"/>
             <w:vAlign w:val="center"/>
           </w:tcPr>
           <w:p>
@@ -1251,7 +1225,7 @@
         <w:tc>
           <w:tcPr>
             <w:cnfStyle w:val="001000000000" w:firstRow="0" w:lastRow="0" w:firstColumn="1" w:lastColumn="0" w:oddVBand="0" w:evenVBand="0" w:oddHBand="0" w:evenHBand="0" w:firstRowFirstColumn="0" w:firstRowLastColumn="0" w:lastRowFirstColumn="0" w:lastRowLastColumn="0"/>
-            <w:tcW w:w="4827" w:type="dxa"/>
+            <w:tcW w:w="4270" w:type="dxa"/>
             <w:vAlign w:val="center"/>
           </w:tcPr>
           <w:p>
@@ -1337,7 +1311,7 @@
         </w:tc>
         <w:tc>
           <w:tcPr>
-            <w:tcW w:w="4827" w:type="dxa"/>
+            <w:tcW w:w="4581" w:type="dxa"/>
             <w:vAlign w:val="center"/>
           </w:tcPr>
           <w:p>
@@ -1416,7 +1390,7 @@
         </w:tc>
         <w:tc>
           <w:tcPr>
-            <w:tcW w:w="4827" w:type="dxa"/>
+            <w:tcW w:w="5845" w:type="dxa"/>
             <w:vAlign w:val="center"/>
           </w:tcPr>
           <w:p>
@@ -1501,7 +1475,7 @@
         <w:tc>
           <w:tcPr>
             <w:cnfStyle w:val="001000000000" w:firstRow="0" w:lastRow="0" w:firstColumn="1" w:lastColumn="0" w:oddVBand="0" w:evenVBand="0" w:oddHBand="0" w:evenHBand="0" w:firstRowFirstColumn="0" w:firstRowLastColumn="0" w:lastRowFirstColumn="0" w:lastRowLastColumn="0"/>
-            <w:tcW w:w="4827" w:type="dxa"/>
+            <w:tcW w:w="4270" w:type="dxa"/>
             <w:vAlign w:val="center"/>
           </w:tcPr>
           <w:p>
@@ -1544,7 +1518,7 @@
         </w:tc>
         <w:tc>
           <w:tcPr>
-            <w:tcW w:w="4827" w:type="dxa"/>
+            <w:tcW w:w="4581" w:type="dxa"/>
             <w:vAlign w:val="center"/>
           </w:tcPr>
           <w:p>
@@ -1562,7 +1536,7 @@
         </w:tc>
         <w:tc>
           <w:tcPr>
-            <w:tcW w:w="4827" w:type="dxa"/>
+            <w:tcW w:w="5845" w:type="dxa"/>
             <w:vAlign w:val="center"/>
           </w:tcPr>
           <w:p>
@@ -1587,14 +1561,52 @@
           <w:color w:val="1B2860"/>
         </w:rPr>
       </w:pPr>
+      <w:proofErr w:type="spellStart"/>
       <w:r>
         <w:rPr>
           <w:b/>
           <w:color w:val="1B2860"/>
           <w:sz w:val="24"/>
         </w:rPr>
-        <w:t>Detalhamento por Equipamento</w:t>
+        <w:t>Detalhamento</w:t>
       </w:r>
+      <w:proofErr w:type="spellEnd"/>
+      <w:r>
+        <w:rPr>
+          <w:b/>
+          <w:color w:val="1B2860"/>
+          <w:sz w:val="24"/>
+        </w:rPr>
+        <w:t xml:space="preserve"> </w:t>
+      </w:r>
+      <w:proofErr w:type="spellStart"/>
+      <w:r>
+        <w:rPr>
+          <w:b/>
+          <w:color w:val="1B2860"/>
+          <w:sz w:val="24"/>
+        </w:rPr>
+        <w:t>por</w:t>
+      </w:r>
+      <w:proofErr w:type="spellEnd"/>
+      <w:r>
+        <w:rPr>
+          <w:b/>
+          <w:color w:val="1B2860"/>
+          <w:sz w:val="24"/>
+        </w:rPr>
+        <w:t xml:space="preserve"> </w:t>
+      </w:r>
+      <w:proofErr w:type="spellStart"/>
+      <w:r>
+        <w:rPr>
+          <w:b/>
+          <w:color w:val="1B2860"/>
+          <w:sz w:val="24"/>
+        </w:rPr>
+        <w:t>Equipamento</w:t>
+      </w:r>
+      <w:proofErr w:type="spellEnd"/>
     </w:p>
     <w:tbl>
       <w:tblPr>
@@ -1624,12 +1636,14 @@
             <w:vAlign w:val="center"/>
           </w:tcPr>
           <w:p>
+            <w:proofErr w:type="spellStart"/>
             <w:r>
               <w:rPr>
                 <w:sz w:val="16"/>
               </w:rPr>
               <w:t>Equipamento</w:t>
             </w:r>
+            <w:proofErr w:type="spellEnd"/>
           </w:p>
         </w:tc>
         <w:tc>
@@ -1641,11 +1655,19 @@
             <w:pPr>
               <w:cnfStyle w:val="100000000000" w:firstRow="1" w:lastRow="0" w:firstColumn="0" w:lastColumn="0" w:oddVBand="0" w:evenVBand="0" w:oddHBand="0" w:evenHBand="0" w:firstRowFirstColumn="0" w:firstRowLastColumn="0" w:lastRowFirstColumn="0" w:lastRowLastColumn="0"/>
             </w:pPr>
+            <w:proofErr w:type="gramStart"/>
             <w:r>
               <w:rPr>
                 <w:sz w:val="16"/>
               </w:rPr>
-              <w:t>Nº Ord.</w:t>
+              <w:t>Nº</w:t>
+            </w:r>
+            <w:proofErr w:type="gramEnd"/>
+            <w:r>
+              <w:rPr>
+                <w:sz w:val="16"/>
+              </w:rPr>
+              <w:t xml:space="preserve"> Ord.</w:t>
             </w:r>
           </w:p>
         </w:tc>
@@ -1658,11 +1680,19 @@
             <w:pPr>
               <w:cnfStyle w:val="100000000000" w:firstRow="1" w:lastRow="0" w:firstColumn="0" w:lastColumn="0" w:oddVBand="0" w:evenVBand="0" w:oddHBand="0" w:evenHBand="0" w:firstRowFirstColumn="0" w:firstRowLastColumn="0" w:lastRowFirstColumn="0" w:lastRowLastColumn="0"/>
             </w:pPr>
+            <w:proofErr w:type="gramStart"/>
             <w:r>
               <w:rPr>
                 <w:sz w:val="16"/>
               </w:rPr>
-              <w:t>Nº Par.</w:t>
+              <w:t>Nº</w:t>
+            </w:r>
+            <w:proofErr w:type="gramEnd"/>
+            <w:r>
+              <w:rPr>
+                <w:sz w:val="16"/>
+              </w:rPr>
+              <w:t xml:space="preserve"> Par.</w:t>
             </w:r>
           </w:p>
         </w:tc>
@@ -1692,11 +1722,19 @@
             <w:pPr>
               <w:cnfStyle w:val="100000000000" w:firstRow="1" w:lastRow="0" w:firstColumn="0" w:lastColumn="0" w:oddVBand="0" w:evenVBand="0" w:oddHBand="0" w:evenHBand="0" w:firstRowFirstColumn="0" w:firstRowLastColumn="0" w:lastRowFirstColumn="0" w:lastRowLastColumn="0"/>
             </w:pPr>
+            <w:proofErr w:type="spellStart"/>
             <w:r>
               <w:rPr>
                 <w:sz w:val="16"/>
               </w:rPr>
-              <w:t>Atividade (h)</w:t>
+              <w:t>Atividade</w:t>
+            </w:r>
+            <w:proofErr w:type="spellEnd"/>
+            <w:r>
+              <w:rPr>
+                <w:sz w:val="16"/>
+              </w:rPr>
+              <w:t xml:space="preserve"> (h)</w:t>
             </w:r>
           </w:p>
         </w:tc>
@@ -1981,11 +2019,33 @@
             <w:pPr>
               <w:cnfStyle w:val="000000010000" w:firstRow="0" w:lastRow="0" w:firstColumn="0" w:lastColumn="0" w:oddVBand="0" w:evenVBand="0" w:oddHBand="0" w:evenHBand="1" w:firstRowFirstColumn="0" w:firstRowLastColumn="0" w:lastRowFirstColumn="0" w:lastRowLastColumn="0"/>
             </w:pPr>
+            <w:proofErr w:type="gramStart"/>
             <w:r>
               <w:rPr>
                 <w:sz w:val="16"/>
               </w:rPr>
-              <w:t>{{ linha.num_ordens }}</w:t>
+              <w:t xml:space="preserve">{{ </w:t>
+            </w:r>
+            <w:proofErr w:type="spellStart"/>
+            <w:r>
+              <w:rPr>
+                <w:sz w:val="16"/>
+              </w:rPr>
+              <w:t>linha.num</w:t>
+            </w:r>
+            <w:proofErr w:type="gramEnd"/>
+            <w:r>
+              <w:rPr>
+                <w:sz w:val="16"/>
+              </w:rPr>
+              <w:t>_ordens</w:t>
+            </w:r>
+            <w:proofErr w:type="spellEnd"/>
+            <w:r>
+              <w:rPr>
+                <w:sz w:val="16"/>
+              </w:rPr>
+              <w:t xml:space="preserve"> }}</w:t>
             </w:r>
           </w:p>
         </w:tc>
@@ -1998,11 +2058,33 @@
             <w:pPr>
               <w:cnfStyle w:val="000000010000" w:firstRow="0" w:lastRow="0" w:firstColumn="0" w:lastColumn="0" w:oddVBand="0" w:evenVBand="0" w:oddHBand="0" w:evenHBand="1" w:firstRowFirstColumn="0" w:firstRowLastColumn="0" w:lastRowFirstColumn="0" w:lastRowLastColumn="0"/>
             </w:pPr>
+            <w:proofErr w:type="gramStart"/>
             <w:r>
               <w:rPr>
                 <w:sz w:val="16"/>
               </w:rPr>
-              <w:t>{{ linha.num_paradas }}</w:t>
+              <w:t xml:space="preserve">{{ </w:t>
+            </w:r>
+            <w:proofErr w:type="spellStart"/>
+            <w:r>
+              <w:rPr>
+                <w:sz w:val="16"/>
+              </w:rPr>
+              <w:t>linha.num</w:t>
+            </w:r>
+            <w:proofErr w:type="gramEnd"/>
+            <w:r>
+              <w:rPr>
+                <w:sz w:val="16"/>
+              </w:rPr>
+              <w:t>_paradas</w:t>
+            </w:r>
+            <w:proofErr w:type="spellEnd"/>
+            <w:r>
+              <w:rPr>
+                <w:sz w:val="16"/>
+              </w:rPr>
+              <w:t xml:space="preserve"> }}</w:t>
             </w:r>
           </w:p>
         </w:tc>
@@ -2015,11 +2097,33 @@
             <w:pPr>
               <w:cnfStyle w:val="000000010000" w:firstRow="0" w:lastRow="0" w:firstColumn="0" w:lastColumn="0" w:oddVBand="0" w:evenVBand="0" w:oddHBand="0" w:evenHBand="1" w:firstRowFirstColumn="0" w:firstRowLastColumn="0" w:lastRowFirstColumn="0" w:lastRowLastColumn="0"/>
             </w:pPr>
+            <w:proofErr w:type="gramStart"/>
             <w:r>
               <w:rPr>
                 <w:sz w:val="16"/>
               </w:rPr>
-              <w:t>{{ linha.avaria_min }}</w:t>
+              <w:t xml:space="preserve">{{ </w:t>
+            </w:r>
+            <w:proofErr w:type="spellStart"/>
+            <w:r>
+              <w:rPr>
+                <w:sz w:val="16"/>
+              </w:rPr>
+              <w:t>linha</w:t>
+            </w:r>
+            <w:proofErr w:type="gramEnd"/>
+            <w:r>
+              <w:rPr>
+                <w:sz w:val="16"/>
+              </w:rPr>
+              <w:t>.avaria_min</w:t>
+            </w:r>
+            <w:proofErr w:type="spellEnd"/>
+            <w:r>
+              <w:rPr>
+                <w:sz w:val="16"/>
+              </w:rPr>
+              <w:t xml:space="preserve"> }}</w:t>
             </w:r>
           </w:p>
         </w:tc>
@@ -2032,11 +2136,33 @@
             <w:pPr>
               <w:cnfStyle w:val="000000010000" w:firstRow="0" w:lastRow="0" w:firstColumn="0" w:lastColumn="0" w:oddVBand="0" w:evenVBand="0" w:oddHBand="0" w:evenHBand="1" w:firstRowFirstColumn="0" w:firstRowLastColumn="0" w:lastRowFirstColumn="0" w:lastRowLastColumn="0"/>
             </w:pPr>
+            <w:proofErr w:type="gramStart"/>
             <w:r>
               <w:rPr>
                 <w:sz w:val="16"/>
               </w:rPr>
-              <w:t>{{ linha.atividade_h }}</w:t>
+              <w:t xml:space="preserve">{{ </w:t>
+            </w:r>
+            <w:proofErr w:type="spellStart"/>
+            <w:r>
+              <w:rPr>
+                <w:sz w:val="16"/>
+              </w:rPr>
+              <w:t>linha</w:t>
+            </w:r>
+            <w:proofErr w:type="gramEnd"/>
+            <w:r>
+              <w:rPr>
+                <w:sz w:val="16"/>
+              </w:rPr>
+              <w:t>.atividade_h</w:t>
+            </w:r>
+            <w:proofErr w:type="spellEnd"/>
+            <w:r>
+              <w:rPr>
+                <w:sz w:val="16"/>
+              </w:rPr>
+              <w:t xml:space="preserve"> }}</w:t>
             </w:r>
           </w:p>
         </w:tc>
@@ -2049,11 +2175,33 @@
             <w:pPr>
               <w:cnfStyle w:val="000000010000" w:firstRow="0" w:lastRow="0" w:firstColumn="0" w:lastColumn="0" w:oddVBand="0" w:evenVBand="0" w:oddHBand="0" w:evenHBand="1" w:firstRowFirstColumn="0" w:firstRowLastColumn="0" w:lastRowFirstColumn="0" w:lastRowLastColumn="0"/>
             </w:pPr>
+            <w:proofErr w:type="gramStart"/>
             <w:r>
               <w:rPr>
                 <w:sz w:val="16"/>
               </w:rPr>
-              <w:t>{{ linha.uptime_h }}</w:t>
+              <w:t xml:space="preserve">{{ </w:t>
+            </w:r>
+            <w:proofErr w:type="spellStart"/>
+            <w:r>
+              <w:rPr>
+                <w:sz w:val="16"/>
+              </w:rPr>
+              <w:t>linha</w:t>
+            </w:r>
+            <w:proofErr w:type="gramEnd"/>
+            <w:r>
+              <w:rPr>
+                <w:sz w:val="16"/>
+              </w:rPr>
+              <w:t>.uptime_h</w:t>
+            </w:r>
+            <w:proofErr w:type="spellEnd"/>
+            <w:r>
+              <w:rPr>
+                <w:sz w:val="16"/>
+              </w:rPr>
+              <w:t xml:space="preserve"> }}</w:t>
             </w:r>
           </w:p>
         </w:tc>
@@ -2066,11 +2214,33 @@
             <w:pPr>
               <w:cnfStyle w:val="000000010000" w:firstRow="0" w:lastRow="0" w:firstColumn="0" w:lastColumn="0" w:oddVBand="0" w:evenVBand="0" w:oddHBand="0" w:evenHBand="1" w:firstRowFirstColumn="0" w:firstRowLastColumn="0" w:lastRowFirstColumn="0" w:lastRowLastColumn="0"/>
             </w:pPr>
+            <w:proofErr w:type="gramStart"/>
             <w:r>
               <w:rPr>
                 <w:sz w:val="16"/>
               </w:rPr>
-              <w:t>{{ linha.mtbf }}</w:t>
+              <w:t xml:space="preserve">{{ </w:t>
+            </w:r>
+            <w:proofErr w:type="spellStart"/>
+            <w:r>
+              <w:rPr>
+                <w:sz w:val="16"/>
+              </w:rPr>
+              <w:t>linha</w:t>
+            </w:r>
+            <w:proofErr w:type="gramEnd"/>
+            <w:r>
+              <w:rPr>
+                <w:sz w:val="16"/>
+              </w:rPr>
+              <w:t>.mtbf</w:t>
+            </w:r>
+            <w:proofErr w:type="spellEnd"/>
+            <w:r>
+              <w:rPr>
+                <w:sz w:val="16"/>
+              </w:rPr>
+              <w:t xml:space="preserve"> }}</w:t>
             </w:r>
           </w:p>
         </w:tc>
@@ -2083,11 +2253,33 @@
             <w:pPr>
               <w:cnfStyle w:val="000000010000" w:firstRow="0" w:lastRow="0" w:firstColumn="0" w:lastColumn="0" w:oddVBand="0" w:evenVBand="0" w:oddHBand="0" w:evenHBand="1" w:firstRowFirstColumn="0" w:firstRowLastColumn="0" w:lastRowFirstColumn="0" w:lastRowLastColumn="0"/>
             </w:pPr>
+            <w:proofErr w:type="gramStart"/>
             <w:r>
               <w:rPr>
                 <w:sz w:val="16"/>
               </w:rPr>
-              <w:t>{{ linha.mttr }}</w:t>
+              <w:t xml:space="preserve">{{ </w:t>
+            </w:r>
+            <w:proofErr w:type="spellStart"/>
+            <w:r>
+              <w:rPr>
+                <w:sz w:val="16"/>
+              </w:rPr>
+              <w:t>linha</w:t>
+            </w:r>
+            <w:proofErr w:type="gramEnd"/>
+            <w:r>
+              <w:rPr>
+                <w:sz w:val="16"/>
+              </w:rPr>
+              <w:t>.mttr</w:t>
+            </w:r>
+            <w:proofErr w:type="spellEnd"/>
+            <w:r>
+              <w:rPr>
+                <w:sz w:val="16"/>
+              </w:rPr>
+              <w:t xml:space="preserve"> }}</w:t>
             </w:r>
           </w:p>
         </w:tc>
@@ -2100,11 +2292,33 @@
             <w:pPr>
               <w:cnfStyle w:val="000000010000" w:firstRow="0" w:lastRow="0" w:firstColumn="0" w:lastColumn="0" w:oddVBand="0" w:evenVBand="0" w:oddHBand="0" w:evenHBand="1" w:firstRowFirstColumn="0" w:firstRowLastColumn="0" w:lastRowFirstColumn="0" w:lastRowLastColumn="0"/>
             </w:pPr>
+            <w:proofErr w:type="gramStart"/>
             <w:r>
               <w:rPr>
                 <w:sz w:val="16"/>
               </w:rPr>
-              <w:t>{{ linha.taxa_avaria }}</w:t>
+              <w:t xml:space="preserve">{{ </w:t>
+            </w:r>
+            <w:proofErr w:type="spellStart"/>
+            <w:r>
+              <w:rPr>
+                <w:sz w:val="16"/>
+              </w:rPr>
+              <w:t>linha</w:t>
+            </w:r>
+            <w:proofErr w:type="gramEnd"/>
+            <w:r>
+              <w:rPr>
+                <w:sz w:val="16"/>
+              </w:rPr>
+              <w:t>.taxa_avaria</w:t>
+            </w:r>
+            <w:proofErr w:type="spellEnd"/>
+            <w:r>
+              <w:rPr>
+                <w:sz w:val="16"/>
+              </w:rPr>
+              <w:t xml:space="preserve"> }}</w:t>
             </w:r>
           </w:p>
         </w:tc>
@@ -2125,7 +2339,23 @@
                 <w:b w:val="0"/>
                 <w:sz w:val="2"/>
               </w:rPr>
-              <w:t>{%tr endfor %}</w:t>
+              <w:t xml:space="preserve">{%tr </w:t>
+            </w:r>
+            <w:proofErr w:type="spellStart"/>
+            <w:r>
+              <w:rPr>
+                <w:b w:val="0"/>
+                <w:sz w:val="2"/>
+              </w:rPr>
+              <w:t>endfor</w:t>
+            </w:r>
+            <w:proofErr w:type="spellEnd"/>
+            <w:r>
+              <w:rPr>
+                <w:b w:val="0"/>
+                <w:sz w:val="2"/>
+              </w:rPr>
+              <w:t xml:space="preserve"> %}</w:t>
             </w:r>
           </w:p>
         </w:tc>
@@ -2246,12 +2476,21 @@
             <w:pPr>
               <w:cnfStyle w:val="000000010000" w:firstRow="0" w:lastRow="0" w:firstColumn="0" w:lastColumn="0" w:oddVBand="0" w:evenVBand="0" w:oddHBand="0" w:evenHBand="1" w:firstRowFirstColumn="0" w:firstRowLastColumn="0" w:lastRowFirstColumn="0" w:lastRowLastColumn="0"/>
             </w:pPr>
+            <w:proofErr w:type="gramStart"/>
             <w:r>
               <w:rPr>
                 <w:b/>
                 <w:sz w:val="16"/>
               </w:rPr>
-              <w:t>{{ bloco4.total.num_ordens }}</w:t>
+              <w:t>{{ bloco4.total.num</w:t>
+            </w:r>
+            <w:proofErr w:type="gramEnd"/>
+            <w:r>
+              <w:rPr>
+                <w:b/>
+                <w:sz w:val="16"/>
+              </w:rPr>
+              <w:t>_ordens }}</w:t>
             </w:r>
           </w:p>
         </w:tc>
@@ -2264,12 +2503,21 @@
             <w:pPr>
               <w:cnfStyle w:val="000000010000" w:firstRow="0" w:lastRow="0" w:firstColumn="0" w:lastColumn="0" w:oddVBand="0" w:evenVBand="0" w:oddHBand="0" w:evenHBand="1" w:firstRowFirstColumn="0" w:firstRowLastColumn="0" w:lastRowFirstColumn="0" w:lastRowLastColumn="0"/>
             </w:pPr>
+            <w:proofErr w:type="gramStart"/>
             <w:r>
               <w:rPr>
                 <w:b/>
                 <w:sz w:val="16"/>
               </w:rPr>
-              <w:t>{{ bloco4.total.num_paradas }}</w:t>
+              <w:t>{{ bloco4.total.num</w:t>
+            </w:r>
+            <w:proofErr w:type="gramEnd"/>
+            <w:r>
+              <w:rPr>
+                <w:b/>
+                <w:sz w:val="16"/>
+              </w:rPr>
+              <w:t>_paradas }}</w:t>
             </w:r>
           </w:p>
         </w:tc>
@@ -2282,12 +2530,21 @@
             <w:pPr>
               <w:cnfStyle w:val="000000010000" w:firstRow="0" w:lastRow="0" w:firstColumn="0" w:lastColumn="0" w:oddVBand="0" w:evenVBand="0" w:oddHBand="0" w:evenHBand="1" w:firstRowFirstColumn="0" w:firstRowLastColumn="0" w:lastRowFirstColumn="0" w:lastRowLastColumn="0"/>
             </w:pPr>
+            <w:proofErr w:type="gramStart"/>
             <w:r>
               <w:rPr>
                 <w:b/>
                 <w:sz w:val="16"/>
               </w:rPr>
-              <w:t>{{ bloco4.total.avaria_min }}</w:t>
+              <w:t>{{ bloco4.total</w:t>
+            </w:r>
+            <w:proofErr w:type="gramEnd"/>
+            <w:r>
+              <w:rPr>
+                <w:b/>
+                <w:sz w:val="16"/>
+              </w:rPr>
+              <w:t>.avaria_min }}</w:t>
             </w:r>
           </w:p>
         </w:tc>
@@ -2300,12 +2557,21 @@
             <w:pPr>
               <w:cnfStyle w:val="000000010000" w:firstRow="0" w:lastRow="0" w:firstColumn="0" w:lastColumn="0" w:oddVBand="0" w:evenVBand="0" w:oddHBand="0" w:evenHBand="1" w:firstRowFirstColumn="0" w:firstRowLastColumn="0" w:lastRowFirstColumn="0" w:lastRowLastColumn="0"/>
             </w:pPr>
+            <w:proofErr w:type="gramStart"/>
             <w:r>
               <w:rPr>
                 <w:b/>
                 <w:sz w:val="16"/>
               </w:rPr>
-              <w:t>{{ bloco4.total.atividade_h }}</w:t>
+              <w:t>{{ bloco4.total</w:t>
+            </w:r>
+            <w:proofErr w:type="gramEnd"/>
+            <w:r>
+              <w:rPr>
+                <w:b/>
+                <w:sz w:val="16"/>
+              </w:rPr>
+              <w:t>.atividade_h }}</w:t>
             </w:r>
           </w:p>
         </w:tc>
@@ -2318,12 +2584,21 @@
             <w:pPr>
               <w:cnfStyle w:val="000000010000" w:firstRow="0" w:lastRow="0" w:firstColumn="0" w:lastColumn="0" w:oddVBand="0" w:evenVBand="0" w:oddHBand="0" w:evenHBand="1" w:firstRowFirstColumn="0" w:firstRowLastColumn="0" w:lastRowFirstColumn="0" w:lastRowLastColumn="0"/>
             </w:pPr>
+            <w:proofErr w:type="gramStart"/>
             <w:r>
               <w:rPr>
                 <w:b/>
                 <w:sz w:val="16"/>
               </w:rPr>
-              <w:t>{{ bloco4.total.uptime_h }}</w:t>
+              <w:t>{{ bloco4.total</w:t>
+            </w:r>
+            <w:proofErr w:type="gramEnd"/>
+            <w:r>
+              <w:rPr>
+                <w:b/>
+                <w:sz w:val="16"/>
+              </w:rPr>
+              <w:t>.uptime_h }}</w:t>
             </w:r>
           </w:p>
         </w:tc>
@@ -2336,12 +2611,21 @@
             <w:pPr>
               <w:cnfStyle w:val="000000010000" w:firstRow="0" w:lastRow="0" w:firstColumn="0" w:lastColumn="0" w:oddVBand="0" w:evenVBand="0" w:oddHBand="0" w:evenHBand="1" w:firstRowFirstColumn="0" w:firstRowLastColumn="0" w:lastRowFirstColumn="0" w:lastRowLastColumn="0"/>
             </w:pPr>
+            <w:proofErr w:type="gramStart"/>
             <w:r>
               <w:rPr>
                 <w:b/>
                 <w:sz w:val="16"/>
               </w:rPr>
-              <w:t>{{ bloco4.total.mtbf }}</w:t>
+              <w:t>{{ bloco4.total</w:t>
+            </w:r>
+            <w:proofErr w:type="gramEnd"/>
+            <w:r>
+              <w:rPr>
+                <w:b/>
+                <w:sz w:val="16"/>
+              </w:rPr>
+              <w:t>.mtbf }}</w:t>
             </w:r>
           </w:p>
         </w:tc>
@@ -2354,12 +2638,21 @@
             <w:pPr>
               <w:cnfStyle w:val="000000010000" w:firstRow="0" w:lastRow="0" w:firstColumn="0" w:lastColumn="0" w:oddVBand="0" w:evenVBand="0" w:oddHBand="0" w:evenHBand="1" w:firstRowFirstColumn="0" w:firstRowLastColumn="0" w:lastRowFirstColumn="0" w:lastRowLastColumn="0"/>
             </w:pPr>
+            <w:proofErr w:type="gramStart"/>
             <w:r>
               <w:rPr>
                 <w:b/>
                 <w:sz w:val="16"/>
               </w:rPr>
-              <w:t>{{ bloco4.total.mttr }}</w:t>
+              <w:t>{{ bloco4.total</w:t>
+            </w:r>
+            <w:proofErr w:type="gramEnd"/>
+            <w:r>
+              <w:rPr>
+                <w:b/>
+                <w:sz w:val="16"/>
+              </w:rPr>
+              <w:t>.mttr }}</w:t>
             </w:r>
           </w:p>
         </w:tc>
@@ -2372,12 +2665,21 @@
             <w:pPr>
               <w:cnfStyle w:val="000000010000" w:firstRow="0" w:lastRow="0" w:firstColumn="0" w:lastColumn="0" w:oddVBand="0" w:evenVBand="0" w:oddHBand="0" w:evenHBand="1" w:firstRowFirstColumn="0" w:firstRowLastColumn="0" w:lastRowFirstColumn="0" w:lastRowLastColumn="0"/>
             </w:pPr>
+            <w:proofErr w:type="gramStart"/>
             <w:r>
               <w:rPr>
                 <w:b/>
                 <w:sz w:val="16"/>
               </w:rPr>
-              <w:t>{{ bloco4.total.taxa_avaria }}</w:t>
+              <w:t>{{ bloco4.total</w:t>
+            </w:r>
+            <w:proofErr w:type="gramEnd"/>
+            <w:r>
+              <w:rPr>
+                <w:b/>
+                <w:sz w:val="16"/>
+              </w:rPr>
+              <w:t>.taxa_avaria }}</w:t>
             </w:r>
           </w:p>
         </w:tc>
@@ -2396,7 +2698,25 @@
           <w:color w:val="1B2860"/>
           <w:sz w:val="24"/>
         </w:rPr>
-        <w:t>Paradas das Últimas 24 Horas</w:t>
+        <w:t xml:space="preserve">Paradas das </w:t>
+      </w:r>
+      <w:proofErr w:type="spellStart"/>
+      <w:r>
+        <w:rPr>
+          <w:b/>
+          <w:color w:val="1B2860"/>
+          <w:sz w:val="24"/>
+        </w:rPr>
+        <w:t>Últimas</w:t>
+      </w:r>
+      <w:proofErr w:type="spellEnd"/>
+      <w:r>
+        <w:rPr>
+          <w:b/>
+          <w:color w:val="1B2860"/>
+          <w:sz w:val="24"/>
+        </w:rPr>
+        <w:t xml:space="preserve"> 24 Horas</w:t>
       </w:r>
     </w:p>
     <w:tbl>
@@ -2906,12 +3226,14 @@
         <w:spacing w:before="160"/>
         <w:jc w:val="center"/>
         <w:rPr>
+          <w:color w:val="1B2860"/>
           <w:lang w:val="pt-BR"/>
         </w:rPr>
       </w:pPr>
       <w:r>
         <w:rPr>
           <w:i/>
+          <w:color w:val="1B2860"/>
           <w:sz w:val="16"/>
           <w:lang w:val="pt-BR"/>
         </w:rPr>
@@ -2921,6 +3243,7 @@
       <w:r>
         <w:rPr>
           <w:i/>
+          <w:color w:val="1B2860"/>
           <w:sz w:val="16"/>
           <w:lang w:val="pt-BR"/>
         </w:rPr>
@@ -2930,6 +3253,7 @@
       <w:r>
         <w:rPr>
           <w:i/>
+          <w:color w:val="1B2860"/>
           <w:sz w:val="16"/>
           <w:lang w:val="pt-BR"/>
         </w:rPr>
@@ -2939,6 +3263,7 @@
       <w:r>
         <w:rPr>
           <w:i/>
+          <w:color w:val="1B2860"/>
           <w:sz w:val="16"/>
           <w:lang w:val="pt-BR"/>
         </w:rPr>
@@ -2948,6 +3273,7 @@
       <w:r>
         <w:rPr>
           <w:i/>
+          <w:color w:val="1B2860"/>
           <w:sz w:val="16"/>
           <w:lang w:val="pt-BR"/>
         </w:rPr>
@@ -2958,6 +3284,7 @@
       <w:r>
         <w:rPr>
           <w:i/>
+          <w:color w:val="1B2860"/>
           <w:sz w:val="16"/>
           <w:lang w:val="pt-BR"/>
         </w:rPr>
@@ -2967,6 +3294,7 @@
       <w:r>
         <w:rPr>
           <w:i/>
+          <w:color w:val="1B2860"/>
           <w:sz w:val="16"/>
           <w:lang w:val="pt-BR"/>
         </w:rPr>
@@ -2976,6 +3304,7 @@
       <w:r>
         <w:rPr>
           <w:i/>
+          <w:color w:val="1B2860"/>
           <w:sz w:val="16"/>
           <w:lang w:val="pt-BR"/>
         </w:rPr>
@@ -2985,6 +3314,7 @@
       <w:r>
         <w:rPr>
           <w:i/>
+          <w:color w:val="1B2860"/>
           <w:sz w:val="16"/>
           <w:lang w:val="pt-BR"/>
         </w:rPr>
@@ -2994,6 +3324,7 @@
       <w:r>
         <w:rPr>
           <w:i/>
+          <w:color w:val="1B2860"/>
           <w:sz w:val="16"/>
           <w:lang w:val="pt-BR"/>
         </w:rPr>
@@ -3003,6 +3334,7 @@
       <w:r>
         <w:rPr>
           <w:i/>
+          <w:color w:val="1B2860"/>
           <w:sz w:val="16"/>
           <w:lang w:val="pt-BR"/>
         </w:rPr>
@@ -3012,6 +3344,7 @@
       <w:r>
         <w:rPr>
           <w:i/>
+          <w:color w:val="1B2860"/>
           <w:sz w:val="16"/>
           <w:lang w:val="pt-BR"/>
         </w:rPr>
@@ -3021,6 +3354,7 @@
       <w:r>
         <w:rPr>
           <w:i/>
+          <w:color w:val="1B2860"/>
           <w:sz w:val="16"/>
           <w:lang w:val="pt-BR"/>
         </w:rPr>
@@ -3030,6 +3364,7 @@
       <w:r>
         <w:rPr>
           <w:i/>
+          <w:color w:val="1B2860"/>
           <w:sz w:val="16"/>
           <w:lang w:val="pt-BR"/>
         </w:rPr>

</xml_diff>

<commit_message>
style(kpi-report): nova rodada de perfumaria visual no template (Word)
</commit_message>
<xml_diff>
--- a/webapp/src/assets/templates/kpi_report.docx
+++ b/webapp/src/assets/templates/kpi_report.docx
@@ -27,7 +27,6 @@
           <w:lang w:val="pt-BR"/>
         </w:rPr>
       </w:pPr>
-      <w:proofErr w:type="gramStart"/>
       <w:r>
         <w:rPr>
           <w:i/>
@@ -43,25 +42,7 @@
           <w:color w:val="1B2860"/>
           <w:lang w:val="pt-BR"/>
         </w:rPr>
-        <w:t>periodo</w:t>
-      </w:r>
-      <w:proofErr w:type="gramEnd"/>
-      <w:r>
-        <w:rPr>
-          <w:i/>
-          <w:color w:val="1B2860"/>
-          <w:lang w:val="pt-BR"/>
-        </w:rPr>
-        <w:t>.</w:t>
-      </w:r>
-      <w:proofErr w:type="gramStart"/>
-      <w:r>
-        <w:rPr>
-          <w:i/>
-          <w:color w:val="1B2860"/>
-          <w:lang w:val="pt-BR"/>
-        </w:rPr>
-        <w:t>rotulo</w:t>
+        <w:t>periodo.rotulo</w:t>
       </w:r>
       <w:proofErr w:type="spellEnd"/>
       <w:r>
@@ -70,16 +51,7 @@
           <w:color w:val="1B2860"/>
           <w:lang w:val="pt-BR"/>
         </w:rPr>
-        <w:t xml:space="preserve"> }</w:t>
-      </w:r>
-      <w:proofErr w:type="gramEnd"/>
-      <w:r>
-        <w:rPr>
-          <w:i/>
-          <w:color w:val="1B2860"/>
-          <w:lang w:val="pt-BR"/>
-        </w:rPr>
-        <w:t>}</w:t>
+        <w:t xml:space="preserve"> }}</w:t>
       </w:r>
     </w:p>
     <w:p>
@@ -215,41 +187,13 @@
                 <w:lang w:val="pt-BR"/>
               </w:rPr>
             </w:pPr>
-            <w:proofErr w:type="gramStart"/>
             <w:r>
               <w:rPr>
                 <w:b/>
                 <w:sz w:val="40"/>
                 <w:lang w:val="pt-BR"/>
               </w:rPr>
-              <w:t>{{ bloco1.kpis</w:t>
-            </w:r>
-            <w:proofErr w:type="gramEnd"/>
-            <w:r>
-              <w:rPr>
-                <w:b/>
-                <w:sz w:val="40"/>
-                <w:lang w:val="pt-BR"/>
-              </w:rPr>
-              <w:t>_</w:t>
-            </w:r>
-            <w:proofErr w:type="gramStart"/>
-            <w:r>
-              <w:rPr>
-                <w:b/>
-                <w:sz w:val="40"/>
-                <w:lang w:val="pt-BR"/>
-              </w:rPr>
-              <w:t>planta.taxa</w:t>
-            </w:r>
-            <w:proofErr w:type="gramEnd"/>
-            <w:r>
-              <w:rPr>
-                <w:b/>
-                <w:sz w:val="40"/>
-                <w:lang w:val="pt-BR"/>
-              </w:rPr>
-              <w:t>_avaria }}</w:t>
+              <w:t>{{ bloco1.kpis_planta.taxa_avaria }}</w:t>
             </w:r>
           </w:p>
         </w:tc>
@@ -277,72 +221,8 @@
                 <w:sz w:val="16"/>
                 <w:lang w:val="pt-BR"/>
               </w:rPr>
-              <w:t xml:space="preserve">Meta: </w:t>
+              <w:t>Meta: {{ bloco1.metas.mtbf }}  ±{{ bloco1.alert_range }}%</w:t>
             </w:r>
-            <w:proofErr w:type="gramStart"/>
-            <w:r>
-              <w:rPr>
-                <w:b w:val="0"/>
-                <w:sz w:val="16"/>
-                <w:lang w:val="pt-BR"/>
-              </w:rPr>
-              <w:t>{{ bloco1.metas</w:t>
-            </w:r>
-            <w:proofErr w:type="gramEnd"/>
-            <w:r>
-              <w:rPr>
-                <w:b w:val="0"/>
-                <w:sz w:val="16"/>
-                <w:lang w:val="pt-BR"/>
-              </w:rPr>
-              <w:t>.</w:t>
-            </w:r>
-            <w:proofErr w:type="gramStart"/>
-            <w:r>
-              <w:rPr>
-                <w:b w:val="0"/>
-                <w:sz w:val="16"/>
-                <w:lang w:val="pt-BR"/>
-              </w:rPr>
-              <w:t>mtbf }</w:t>
-            </w:r>
-            <w:proofErr w:type="gramEnd"/>
-            <w:r>
-              <w:rPr>
-                <w:b w:val="0"/>
-                <w:sz w:val="16"/>
-                <w:lang w:val="pt-BR"/>
-              </w:rPr>
-              <w:t xml:space="preserve">}  </w:t>
-            </w:r>
-            <w:proofErr w:type="gramStart"/>
-            <w:r>
-              <w:rPr>
-                <w:b w:val="0"/>
-                <w:sz w:val="16"/>
-                <w:lang w:val="pt-BR"/>
-              </w:rPr>
-              <w:t>±{{ bloco1.alert</w:t>
-            </w:r>
-            <w:proofErr w:type="gramEnd"/>
-            <w:r>
-              <w:rPr>
-                <w:b w:val="0"/>
-                <w:sz w:val="16"/>
-                <w:lang w:val="pt-BR"/>
-              </w:rPr>
-              <w:t>_</w:t>
-            </w:r>
-            <w:proofErr w:type="gramStart"/>
-            <w:r>
-              <w:rPr>
-                <w:b w:val="0"/>
-                <w:sz w:val="16"/>
-                <w:lang w:val="pt-BR"/>
-              </w:rPr>
-              <w:t>range }}%</w:t>
-            </w:r>
-            <w:proofErr w:type="gramEnd"/>
           </w:p>
         </w:tc>
         <w:tc>
@@ -363,65 +243,8 @@
                 <w:sz w:val="16"/>
                 <w:lang w:val="pt-BR"/>
               </w:rPr>
-              <w:t xml:space="preserve">Meta: </w:t>
+              <w:t>Meta: {{ bloco1.metas.mttr }}  ±{{ bloco1.alert_range }}%</w:t>
             </w:r>
-            <w:proofErr w:type="gramStart"/>
-            <w:r>
-              <w:rPr>
-                <w:sz w:val="16"/>
-                <w:lang w:val="pt-BR"/>
-              </w:rPr>
-              <w:t>{{ bloco1.metas</w:t>
-            </w:r>
-            <w:proofErr w:type="gramEnd"/>
-            <w:r>
-              <w:rPr>
-                <w:sz w:val="16"/>
-                <w:lang w:val="pt-BR"/>
-              </w:rPr>
-              <w:t>.</w:t>
-            </w:r>
-            <w:proofErr w:type="gramStart"/>
-            <w:r>
-              <w:rPr>
-                <w:sz w:val="16"/>
-                <w:lang w:val="pt-BR"/>
-              </w:rPr>
-              <w:t>mttr }</w:t>
-            </w:r>
-            <w:proofErr w:type="gramEnd"/>
-            <w:r>
-              <w:rPr>
-                <w:sz w:val="16"/>
-                <w:lang w:val="pt-BR"/>
-              </w:rPr>
-              <w:t xml:space="preserve">}  </w:t>
-            </w:r>
-            <w:proofErr w:type="gramStart"/>
-            <w:r>
-              <w:rPr>
-                <w:sz w:val="16"/>
-                <w:lang w:val="pt-BR"/>
-              </w:rPr>
-              <w:t>±{{ bloco1.alert</w:t>
-            </w:r>
-            <w:proofErr w:type="gramEnd"/>
-            <w:r>
-              <w:rPr>
-                <w:sz w:val="16"/>
-                <w:lang w:val="pt-BR"/>
-              </w:rPr>
-              <w:t>_</w:t>
-            </w:r>
-            <w:proofErr w:type="gramStart"/>
-            <w:r>
-              <w:rPr>
-                <w:sz w:val="16"/>
-                <w:lang w:val="pt-BR"/>
-              </w:rPr>
-              <w:t>range }}%</w:t>
-            </w:r>
-            <w:proofErr w:type="gramEnd"/>
           </w:p>
         </w:tc>
         <w:tc>
@@ -442,65 +265,8 @@
                 <w:sz w:val="16"/>
                 <w:lang w:val="pt-BR"/>
               </w:rPr>
-              <w:t xml:space="preserve">Meta: </w:t>
+              <w:t>Meta: {{ bloco1.metas.taxa_avaria }}  ±{{ bloco1.alert_range }}%</w:t>
             </w:r>
-            <w:proofErr w:type="gramStart"/>
-            <w:r>
-              <w:rPr>
-                <w:sz w:val="16"/>
-                <w:lang w:val="pt-BR"/>
-              </w:rPr>
-              <w:t>{{ bloco1.metas</w:t>
-            </w:r>
-            <w:proofErr w:type="gramEnd"/>
-            <w:r>
-              <w:rPr>
-                <w:sz w:val="16"/>
-                <w:lang w:val="pt-BR"/>
-              </w:rPr>
-              <w:t>.taxa_</w:t>
-            </w:r>
-            <w:proofErr w:type="gramStart"/>
-            <w:r>
-              <w:rPr>
-                <w:sz w:val="16"/>
-                <w:lang w:val="pt-BR"/>
-              </w:rPr>
-              <w:t>avaria }</w:t>
-            </w:r>
-            <w:proofErr w:type="gramEnd"/>
-            <w:r>
-              <w:rPr>
-                <w:sz w:val="16"/>
-                <w:lang w:val="pt-BR"/>
-              </w:rPr>
-              <w:t xml:space="preserve">}  </w:t>
-            </w:r>
-            <w:proofErr w:type="gramStart"/>
-            <w:r>
-              <w:rPr>
-                <w:sz w:val="16"/>
-                <w:lang w:val="pt-BR"/>
-              </w:rPr>
-              <w:t>±{{ bloco1.alert</w:t>
-            </w:r>
-            <w:proofErr w:type="gramEnd"/>
-            <w:r>
-              <w:rPr>
-                <w:sz w:val="16"/>
-                <w:lang w:val="pt-BR"/>
-              </w:rPr>
-              <w:t>_</w:t>
-            </w:r>
-            <w:proofErr w:type="gramStart"/>
-            <w:r>
-              <w:rPr>
-                <w:sz w:val="16"/>
-                <w:lang w:val="pt-BR"/>
-              </w:rPr>
-              <w:t>range }}%</w:t>
-            </w:r>
-            <w:proofErr w:type="gramEnd"/>
           </w:p>
         </w:tc>
       </w:tr>
@@ -518,37 +284,12 @@
             <w:pPr>
               <w:jc w:val="center"/>
             </w:pPr>
-            <w:proofErr w:type="gramStart"/>
             <w:r>
               <w:rPr>
                 <w:b w:val="0"/>
                 <w:sz w:val="20"/>
               </w:rPr>
-              <w:t>{{ bloco1.sunburst</w:t>
-            </w:r>
-            <w:proofErr w:type="gramEnd"/>
-            <w:r>
-              <w:rPr>
-                <w:b w:val="0"/>
-                <w:sz w:val="20"/>
-              </w:rPr>
-              <w:t>_</w:t>
-            </w:r>
-            <w:proofErr w:type="gramStart"/>
-            <w:r>
-              <w:rPr>
-                <w:b w:val="0"/>
-                <w:sz w:val="20"/>
-              </w:rPr>
-              <w:t>figures.mtbf</w:t>
-            </w:r>
-            <w:proofErr w:type="gramEnd"/>
-            <w:r>
-              <w:rPr>
-                <w:b w:val="0"/>
-                <w:sz w:val="20"/>
-              </w:rPr>
-              <w:t xml:space="preserve"> }}</w:t>
+              <w:t>{{ bloco1.sunburst_figures.mtbf }}</w:t>
             </w:r>
           </w:p>
         </w:tc>
@@ -627,7 +368,7 @@
         <w:tc>
           <w:tcPr>
             <w:cnfStyle w:val="001000000000" w:firstRow="0" w:lastRow="0" w:firstColumn="1" w:lastColumn="0" w:oddVBand="0" w:evenVBand="0" w:oddHBand="0" w:evenHBand="0" w:firstRowFirstColumn="0" w:firstRowLastColumn="0" w:lastRowFirstColumn="0" w:lastRowLastColumn="0"/>
-            <w:tcW w:w="567" w:type="dxa"/>
+            <w:tcW w:w="1208" w:type="dxa"/>
             <w:vAlign w:val="center"/>
           </w:tcPr>
           <w:p>
@@ -641,7 +382,7 @@
         </w:tc>
         <w:tc>
           <w:tcPr>
-            <w:tcW w:w="1984" w:type="dxa"/>
+            <w:tcW w:w="1951" w:type="dxa"/>
             <w:vAlign w:val="center"/>
           </w:tcPr>
           <w:p>
@@ -658,7 +399,7 @@
         </w:tc>
         <w:tc>
           <w:tcPr>
-            <w:tcW w:w="1984" w:type="dxa"/>
+            <w:tcW w:w="1930" w:type="dxa"/>
             <w:vAlign w:val="center"/>
           </w:tcPr>
           <w:p>
@@ -675,7 +416,7 @@
         </w:tc>
         <w:tc>
           <w:tcPr>
-            <w:tcW w:w="1417" w:type="dxa"/>
+            <w:tcW w:w="1609" w:type="dxa"/>
             <w:vAlign w:val="center"/>
           </w:tcPr>
           <w:p>
@@ -692,7 +433,7 @@
         </w:tc>
         <w:tc>
           <w:tcPr>
-            <w:tcW w:w="1134" w:type="dxa"/>
+            <w:tcW w:w="1132" w:type="dxa"/>
             <w:vAlign w:val="center"/>
           </w:tcPr>
           <w:p>
@@ -709,7 +450,7 @@
         </w:tc>
         <w:tc>
           <w:tcPr>
-            <w:tcW w:w="7427" w:type="dxa"/>
+            <w:tcW w:w="6866" w:type="dxa"/>
             <w:vAlign w:val="center"/>
           </w:tcPr>
           <w:p>
@@ -732,7 +473,7 @@
         <w:tc>
           <w:tcPr>
             <w:cnfStyle w:val="001000000000" w:firstRow="0" w:lastRow="0" w:firstColumn="1" w:lastColumn="0" w:oddVBand="0" w:evenVBand="0" w:oddHBand="0" w:evenHBand="0" w:firstRowFirstColumn="0" w:firstRowLastColumn="0" w:lastRowFirstColumn="0" w:lastRowLastColumn="0"/>
-            <w:tcW w:w="567" w:type="dxa"/>
+            <w:tcW w:w="1208" w:type="dxa"/>
             <w:vAlign w:val="center"/>
           </w:tcPr>
           <w:p>
@@ -771,7 +512,7 @@
         </w:tc>
         <w:tc>
           <w:tcPr>
-            <w:tcW w:w="1984" w:type="dxa"/>
+            <w:tcW w:w="1951" w:type="dxa"/>
             <w:vAlign w:val="center"/>
           </w:tcPr>
           <w:p>
@@ -785,7 +526,7 @@
         </w:tc>
         <w:tc>
           <w:tcPr>
-            <w:tcW w:w="1984" w:type="dxa"/>
+            <w:tcW w:w="1930" w:type="dxa"/>
             <w:vAlign w:val="center"/>
           </w:tcPr>
           <w:p>
@@ -799,7 +540,7 @@
         </w:tc>
         <w:tc>
           <w:tcPr>
-            <w:tcW w:w="1417" w:type="dxa"/>
+            <w:tcW w:w="1609" w:type="dxa"/>
             <w:vAlign w:val="center"/>
           </w:tcPr>
           <w:p>
@@ -813,7 +554,7 @@
         </w:tc>
         <w:tc>
           <w:tcPr>
-            <w:tcW w:w="1134" w:type="dxa"/>
+            <w:tcW w:w="1132" w:type="dxa"/>
             <w:vAlign w:val="center"/>
           </w:tcPr>
           <w:p>
@@ -827,7 +568,7 @@
         </w:tc>
         <w:tc>
           <w:tcPr>
-            <w:tcW w:w="7427" w:type="dxa"/>
+            <w:tcW w:w="6866" w:type="dxa"/>
             <w:vAlign w:val="center"/>
           </w:tcPr>
           <w:p>
@@ -847,11 +588,10 @@
         <w:tc>
           <w:tcPr>
             <w:cnfStyle w:val="001000000000" w:firstRow="0" w:lastRow="0" w:firstColumn="1" w:lastColumn="0" w:oddVBand="0" w:evenVBand="0" w:oddHBand="0" w:evenHBand="0" w:firstRowFirstColumn="0" w:firstRowLastColumn="0" w:lastRowFirstColumn="0" w:lastRowLastColumn="0"/>
-            <w:tcW w:w="567" w:type="dxa"/>
+            <w:tcW w:w="1208" w:type="dxa"/>
             <w:vAlign w:val="center"/>
           </w:tcPr>
           <w:p>
-            <w:proofErr w:type="gramStart"/>
             <w:r>
               <w:rPr>
                 <w:b w:val="0"/>
@@ -865,15 +605,7 @@
                 <w:b w:val="0"/>
                 <w:sz w:val="16"/>
               </w:rPr>
-              <w:t>parada</w:t>
-            </w:r>
-            <w:proofErr w:type="gramEnd"/>
-            <w:r>
-              <w:rPr>
-                <w:b w:val="0"/>
-                <w:sz w:val="16"/>
-              </w:rPr>
-              <w:t>.posicao</w:t>
+              <w:t>parada.posicao</w:t>
             </w:r>
             <w:proofErr w:type="spellEnd"/>
             <w:r>
@@ -887,7 +619,7 @@
         </w:tc>
         <w:tc>
           <w:tcPr>
-            <w:tcW w:w="1984" w:type="dxa"/>
+            <w:tcW w:w="1951" w:type="dxa"/>
             <w:vAlign w:val="center"/>
           </w:tcPr>
           <w:p>
@@ -904,7 +636,7 @@
         </w:tc>
         <w:tc>
           <w:tcPr>
-            <w:tcW w:w="1984" w:type="dxa"/>
+            <w:tcW w:w="1930" w:type="dxa"/>
             <w:vAlign w:val="center"/>
           </w:tcPr>
           <w:p>
@@ -921,7 +653,7 @@
         </w:tc>
         <w:tc>
           <w:tcPr>
-            <w:tcW w:w="1417" w:type="dxa"/>
+            <w:tcW w:w="1609" w:type="dxa"/>
             <w:vAlign w:val="center"/>
           </w:tcPr>
           <w:p>
@@ -938,7 +670,7 @@
         </w:tc>
         <w:tc>
           <w:tcPr>
-            <w:tcW w:w="1134" w:type="dxa"/>
+            <w:tcW w:w="1132" w:type="dxa"/>
             <w:vAlign w:val="center"/>
           </w:tcPr>
           <w:p>
@@ -955,7 +687,7 @@
         </w:tc>
         <w:tc>
           <w:tcPr>
-            <w:tcW w:w="7427" w:type="dxa"/>
+            <w:tcW w:w="6866" w:type="dxa"/>
             <w:vAlign w:val="center"/>
           </w:tcPr>
           <w:p>
@@ -978,7 +710,7 @@
         <w:tc>
           <w:tcPr>
             <w:cnfStyle w:val="001000000000" w:firstRow="0" w:lastRow="0" w:firstColumn="1" w:lastColumn="0" w:oddVBand="0" w:evenVBand="0" w:oddHBand="0" w:evenHBand="0" w:firstRowFirstColumn="0" w:firstRowLastColumn="0" w:lastRowFirstColumn="0" w:lastRowLastColumn="0"/>
-            <w:tcW w:w="567" w:type="dxa"/>
+            <w:tcW w:w="1208" w:type="dxa"/>
             <w:vAlign w:val="center"/>
           </w:tcPr>
           <w:p>
@@ -993,7 +725,7 @@
         </w:tc>
         <w:tc>
           <w:tcPr>
-            <w:tcW w:w="1984" w:type="dxa"/>
+            <w:tcW w:w="1951" w:type="dxa"/>
             <w:vAlign w:val="center"/>
           </w:tcPr>
           <w:p>
@@ -1004,7 +736,7 @@
         </w:tc>
         <w:tc>
           <w:tcPr>
-            <w:tcW w:w="1984" w:type="dxa"/>
+            <w:tcW w:w="1930" w:type="dxa"/>
             <w:vAlign w:val="center"/>
           </w:tcPr>
           <w:p>
@@ -1015,7 +747,7 @@
         </w:tc>
         <w:tc>
           <w:tcPr>
-            <w:tcW w:w="1417" w:type="dxa"/>
+            <w:tcW w:w="1609" w:type="dxa"/>
             <w:vAlign w:val="center"/>
           </w:tcPr>
           <w:p>
@@ -1026,7 +758,7 @@
         </w:tc>
         <w:tc>
           <w:tcPr>
-            <w:tcW w:w="1134" w:type="dxa"/>
+            <w:tcW w:w="1132" w:type="dxa"/>
             <w:vAlign w:val="center"/>
           </w:tcPr>
           <w:p>
@@ -1037,519 +769,13 @@
         </w:tc>
         <w:tc>
           <w:tcPr>
-            <w:tcW w:w="7427" w:type="dxa"/>
+            <w:tcW w:w="6866" w:type="dxa"/>
             <w:vAlign w:val="center"/>
           </w:tcPr>
           <w:p>
             <w:pPr>
               <w:cnfStyle w:val="000000100000" w:firstRow="0" w:lastRow="0" w:firstColumn="0" w:lastColumn="0" w:oddVBand="0" w:evenVBand="0" w:oddHBand="1" w:evenHBand="0" w:firstRowFirstColumn="0" w:firstRowLastColumn="0" w:lastRowFirstColumn="0" w:lastRowLastColumn="0"/>
             </w:pPr>
-          </w:p>
-        </w:tc>
-      </w:tr>
-    </w:tbl>
-    <w:p>
-      <w:pPr>
-        <w:spacing w:before="280"/>
-        <w:rPr>
-          <w:color w:val="1B2860"/>
-        </w:rPr>
-      </w:pPr>
-      <w:r>
-        <w:rPr>
-          <w:b/>
-          <w:color w:val="1B2860"/>
-          <w:sz w:val="24"/>
-        </w:rPr>
-        <w:t>Indicadores Últimas 24 Horas — Planta</w:t>
-      </w:r>
-    </w:p>
-    <w:tbl>
-      <w:tblPr>
-        <w:tblStyle w:val="GradeClara-nfase1"/>
-        <w:tblW w:w="0" w:type="auto"/>
-        <w:tblLook w:val="04A0" w:firstRow="1" w:lastRow="0" w:firstColumn="1" w:lastColumn="0" w:noHBand="0" w:noVBand="1"/>
-      </w:tblPr>
-      <w:tblGrid>
-        <w:gridCol w:w="4270"/>
-        <w:gridCol w:w="4581"/>
-        <w:gridCol w:w="5845"/>
-      </w:tblGrid>
-      <w:tr>
-        <w:trPr>
-          <w:cnfStyle w:val="100000000000" w:firstRow="1" w:lastRow="0" w:firstColumn="0" w:lastColumn="0" w:oddVBand="0" w:evenVBand="0" w:oddHBand="0" w:evenHBand="0" w:firstRowFirstColumn="0" w:firstRowLastColumn="0" w:lastRowFirstColumn="0" w:lastRowLastColumn="0"/>
-        </w:trPr>
-        <w:tc>
-          <w:tcPr>
-            <w:cnfStyle w:val="001000000000" w:firstRow="0" w:lastRow="0" w:firstColumn="1" w:lastColumn="0" w:oddVBand="0" w:evenVBand="0" w:oddHBand="0" w:evenHBand="0" w:firstRowFirstColumn="0" w:firstRowLastColumn="0" w:lastRowFirstColumn="0" w:lastRowLastColumn="0"/>
-            <w:tcW w:w="4270" w:type="dxa"/>
-            <w:vAlign w:val="center"/>
-          </w:tcPr>
-          <w:p>
-            <w:pPr>
-              <w:jc w:val="center"/>
-            </w:pPr>
-            <w:r>
-              <w:t>MTBF (h)</w:t>
-            </w:r>
-          </w:p>
-        </w:tc>
-        <w:tc>
-          <w:tcPr>
-            <w:tcW w:w="4581" w:type="dxa"/>
-            <w:vAlign w:val="center"/>
-          </w:tcPr>
-          <w:p>
-            <w:pPr>
-              <w:jc w:val="center"/>
-              <w:cnfStyle w:val="100000000000" w:firstRow="1" w:lastRow="0" w:firstColumn="0" w:lastColumn="0" w:oddVBand="0" w:evenVBand="0" w:oddHBand="0" w:evenHBand="0" w:firstRowFirstColumn="0" w:firstRowLastColumn="0" w:lastRowFirstColumn="0" w:lastRowLastColumn="0"/>
-            </w:pPr>
-            <w:r>
-              <w:t>MTTR (min)</w:t>
-            </w:r>
-          </w:p>
-        </w:tc>
-        <w:tc>
-          <w:tcPr>
-            <w:tcW w:w="5845" w:type="dxa"/>
-            <w:vAlign w:val="center"/>
-          </w:tcPr>
-          <w:p>
-            <w:pPr>
-              <w:jc w:val="center"/>
-              <w:cnfStyle w:val="100000000000" w:firstRow="1" w:lastRow="0" w:firstColumn="0" w:lastColumn="0" w:oddVBand="0" w:evenVBand="0" w:oddHBand="0" w:evenHBand="0" w:firstRowFirstColumn="0" w:firstRowLastColumn="0" w:lastRowFirstColumn="0" w:lastRowLastColumn="0"/>
-            </w:pPr>
-            <w:r>
-              <w:t>Taxa de Avaria (%)</w:t>
-            </w:r>
-          </w:p>
-        </w:tc>
-      </w:tr>
-      <w:tr>
-        <w:trPr>
-          <w:cnfStyle w:val="000000100000" w:firstRow="0" w:lastRow="0" w:firstColumn="0" w:lastColumn="0" w:oddVBand="0" w:evenVBand="0" w:oddHBand="1" w:evenHBand="0" w:firstRowFirstColumn="0" w:firstRowLastColumn="0" w:lastRowFirstColumn="0" w:lastRowLastColumn="0"/>
-        </w:trPr>
-        <w:tc>
-          <w:tcPr>
-            <w:cnfStyle w:val="001000000000" w:firstRow="0" w:lastRow="0" w:firstColumn="1" w:lastColumn="0" w:oddVBand="0" w:evenVBand="0" w:oddHBand="0" w:evenHBand="0" w:firstRowFirstColumn="0" w:firstRowLastColumn="0" w:lastRowFirstColumn="0" w:lastRowLastColumn="0"/>
-            <w:tcW w:w="4270" w:type="dxa"/>
-            <w:vAlign w:val="center"/>
-          </w:tcPr>
-          <w:p>
-            <w:pPr>
-              <w:jc w:val="center"/>
-            </w:pPr>
-            <w:r>
-              <w:rPr>
-                <w:sz w:val="40"/>
-              </w:rPr>
-              <w:t>{{ bloco3.kpis_planta.mtbf }}</w:t>
-            </w:r>
-          </w:p>
-        </w:tc>
-        <w:tc>
-          <w:tcPr>
-            <w:tcW w:w="4581" w:type="dxa"/>
-            <w:vAlign w:val="center"/>
-          </w:tcPr>
-          <w:p>
-            <w:pPr>
-              <w:jc w:val="center"/>
-              <w:cnfStyle w:val="000000100000" w:firstRow="0" w:lastRow="0" w:firstColumn="0" w:lastColumn="0" w:oddVBand="0" w:evenVBand="0" w:oddHBand="1" w:evenHBand="0" w:firstRowFirstColumn="0" w:firstRowLastColumn="0" w:lastRowFirstColumn="0" w:lastRowLastColumn="0"/>
-            </w:pPr>
-            <w:r>
-              <w:rPr>
-                <w:b/>
-                <w:sz w:val="40"/>
-              </w:rPr>
-              <w:t>{{ bloco3.kpis_planta.mttr }}</w:t>
-            </w:r>
-          </w:p>
-        </w:tc>
-        <w:tc>
-          <w:tcPr>
-            <w:tcW w:w="5845" w:type="dxa"/>
-            <w:vAlign w:val="center"/>
-          </w:tcPr>
-          <w:p>
-            <w:pPr>
-              <w:jc w:val="center"/>
-              <w:cnfStyle w:val="000000100000" w:firstRow="0" w:lastRow="0" w:firstColumn="0" w:lastColumn="0" w:oddVBand="0" w:evenVBand="0" w:oddHBand="1" w:evenHBand="0" w:firstRowFirstColumn="0" w:firstRowLastColumn="0" w:lastRowFirstColumn="0" w:lastRowLastColumn="0"/>
-              <w:rPr>
-                <w:lang w:val="pt-BR"/>
-              </w:rPr>
-            </w:pPr>
-            <w:proofErr w:type="gramStart"/>
-            <w:r>
-              <w:rPr>
-                <w:b/>
-                <w:sz w:val="40"/>
-                <w:lang w:val="pt-BR"/>
-              </w:rPr>
-              <w:t>{{ bloco3.kpis</w:t>
-            </w:r>
-            <w:proofErr w:type="gramEnd"/>
-            <w:r>
-              <w:rPr>
-                <w:b/>
-                <w:sz w:val="40"/>
-                <w:lang w:val="pt-BR"/>
-              </w:rPr>
-              <w:t>_</w:t>
-            </w:r>
-            <w:proofErr w:type="gramStart"/>
-            <w:r>
-              <w:rPr>
-                <w:b/>
-                <w:sz w:val="40"/>
-                <w:lang w:val="pt-BR"/>
-              </w:rPr>
-              <w:t>planta.taxa</w:t>
-            </w:r>
-            <w:proofErr w:type="gramEnd"/>
-            <w:r>
-              <w:rPr>
-                <w:b/>
-                <w:sz w:val="40"/>
-                <w:lang w:val="pt-BR"/>
-              </w:rPr>
-              <w:t>_avaria }}</w:t>
-            </w:r>
-          </w:p>
-        </w:tc>
-      </w:tr>
-      <w:tr>
-        <w:trPr>
-          <w:cnfStyle w:val="000000010000" w:firstRow="0" w:lastRow="0" w:firstColumn="0" w:lastColumn="0" w:oddVBand="0" w:evenVBand="0" w:oddHBand="0" w:evenHBand="1" w:firstRowFirstColumn="0" w:firstRowLastColumn="0" w:lastRowFirstColumn="0" w:lastRowLastColumn="0"/>
-        </w:trPr>
-        <w:tc>
-          <w:tcPr>
-            <w:cnfStyle w:val="001000000000" w:firstRow="0" w:lastRow="0" w:firstColumn="1" w:lastColumn="0" w:oddVBand="0" w:evenVBand="0" w:oddHBand="0" w:evenHBand="0" w:firstRowFirstColumn="0" w:firstRowLastColumn="0" w:lastRowFirstColumn="0" w:lastRowLastColumn="0"/>
-            <w:tcW w:w="4270" w:type="dxa"/>
-            <w:vAlign w:val="center"/>
-          </w:tcPr>
-          <w:p>
-            <w:pPr>
-              <w:jc w:val="center"/>
-              <w:rPr>
-                <w:lang w:val="pt-BR"/>
-              </w:rPr>
-            </w:pPr>
-            <w:r>
-              <w:rPr>
-                <w:b w:val="0"/>
-                <w:sz w:val="16"/>
-                <w:lang w:val="pt-BR"/>
-              </w:rPr>
-              <w:t xml:space="preserve">Meta: </w:t>
-            </w:r>
-            <w:proofErr w:type="gramStart"/>
-            <w:r>
-              <w:rPr>
-                <w:b w:val="0"/>
-                <w:sz w:val="16"/>
-                <w:lang w:val="pt-BR"/>
-              </w:rPr>
-              <w:t>{{ bloco3.metas</w:t>
-            </w:r>
-            <w:proofErr w:type="gramEnd"/>
-            <w:r>
-              <w:rPr>
-                <w:b w:val="0"/>
-                <w:sz w:val="16"/>
-                <w:lang w:val="pt-BR"/>
-              </w:rPr>
-              <w:t>.</w:t>
-            </w:r>
-            <w:proofErr w:type="gramStart"/>
-            <w:r>
-              <w:rPr>
-                <w:b w:val="0"/>
-                <w:sz w:val="16"/>
-                <w:lang w:val="pt-BR"/>
-              </w:rPr>
-              <w:t>mtbf }</w:t>
-            </w:r>
-            <w:proofErr w:type="gramEnd"/>
-            <w:r>
-              <w:rPr>
-                <w:b w:val="0"/>
-                <w:sz w:val="16"/>
-                <w:lang w:val="pt-BR"/>
-              </w:rPr>
-              <w:t xml:space="preserve">}  </w:t>
-            </w:r>
-            <w:proofErr w:type="gramStart"/>
-            <w:r>
-              <w:rPr>
-                <w:b w:val="0"/>
-                <w:sz w:val="16"/>
-                <w:lang w:val="pt-BR"/>
-              </w:rPr>
-              <w:t>±{{ bloco3.alert</w:t>
-            </w:r>
-            <w:proofErr w:type="gramEnd"/>
-            <w:r>
-              <w:rPr>
-                <w:b w:val="0"/>
-                <w:sz w:val="16"/>
-                <w:lang w:val="pt-BR"/>
-              </w:rPr>
-              <w:t>_</w:t>
-            </w:r>
-            <w:proofErr w:type="gramStart"/>
-            <w:r>
-              <w:rPr>
-                <w:b w:val="0"/>
-                <w:sz w:val="16"/>
-                <w:lang w:val="pt-BR"/>
-              </w:rPr>
-              <w:t>range }}%</w:t>
-            </w:r>
-            <w:proofErr w:type="gramEnd"/>
-          </w:p>
-        </w:tc>
-        <w:tc>
-          <w:tcPr>
-            <w:tcW w:w="4581" w:type="dxa"/>
-            <w:vAlign w:val="center"/>
-          </w:tcPr>
-          <w:p>
-            <w:pPr>
-              <w:jc w:val="center"/>
-              <w:cnfStyle w:val="000000010000" w:firstRow="0" w:lastRow="0" w:firstColumn="0" w:lastColumn="0" w:oddVBand="0" w:evenVBand="0" w:oddHBand="0" w:evenHBand="1" w:firstRowFirstColumn="0" w:firstRowLastColumn="0" w:lastRowFirstColumn="0" w:lastRowLastColumn="0"/>
-              <w:rPr>
-                <w:lang w:val="pt-BR"/>
-              </w:rPr>
-            </w:pPr>
-            <w:r>
-              <w:rPr>
-                <w:sz w:val="16"/>
-                <w:lang w:val="pt-BR"/>
-              </w:rPr>
-              <w:t xml:space="preserve">Meta: </w:t>
-            </w:r>
-            <w:proofErr w:type="gramStart"/>
-            <w:r>
-              <w:rPr>
-                <w:sz w:val="16"/>
-                <w:lang w:val="pt-BR"/>
-              </w:rPr>
-              <w:t>{{ bloco3.metas</w:t>
-            </w:r>
-            <w:proofErr w:type="gramEnd"/>
-            <w:r>
-              <w:rPr>
-                <w:sz w:val="16"/>
-                <w:lang w:val="pt-BR"/>
-              </w:rPr>
-              <w:t>.</w:t>
-            </w:r>
-            <w:proofErr w:type="gramStart"/>
-            <w:r>
-              <w:rPr>
-                <w:sz w:val="16"/>
-                <w:lang w:val="pt-BR"/>
-              </w:rPr>
-              <w:t>mttr }</w:t>
-            </w:r>
-            <w:proofErr w:type="gramEnd"/>
-            <w:r>
-              <w:rPr>
-                <w:sz w:val="16"/>
-                <w:lang w:val="pt-BR"/>
-              </w:rPr>
-              <w:t xml:space="preserve">}  </w:t>
-            </w:r>
-            <w:proofErr w:type="gramStart"/>
-            <w:r>
-              <w:rPr>
-                <w:sz w:val="16"/>
-                <w:lang w:val="pt-BR"/>
-              </w:rPr>
-              <w:t>±{{ bloco3.alert</w:t>
-            </w:r>
-            <w:proofErr w:type="gramEnd"/>
-            <w:r>
-              <w:rPr>
-                <w:sz w:val="16"/>
-                <w:lang w:val="pt-BR"/>
-              </w:rPr>
-              <w:t>_</w:t>
-            </w:r>
-            <w:proofErr w:type="gramStart"/>
-            <w:r>
-              <w:rPr>
-                <w:sz w:val="16"/>
-                <w:lang w:val="pt-BR"/>
-              </w:rPr>
-              <w:t>range }}%</w:t>
-            </w:r>
-            <w:proofErr w:type="gramEnd"/>
-          </w:p>
-        </w:tc>
-        <w:tc>
-          <w:tcPr>
-            <w:tcW w:w="5845" w:type="dxa"/>
-            <w:vAlign w:val="center"/>
-          </w:tcPr>
-          <w:p>
-            <w:pPr>
-              <w:jc w:val="center"/>
-              <w:cnfStyle w:val="000000010000" w:firstRow="0" w:lastRow="0" w:firstColumn="0" w:lastColumn="0" w:oddVBand="0" w:evenVBand="0" w:oddHBand="0" w:evenHBand="1" w:firstRowFirstColumn="0" w:firstRowLastColumn="0" w:lastRowFirstColumn="0" w:lastRowLastColumn="0"/>
-              <w:rPr>
-                <w:lang w:val="pt-BR"/>
-              </w:rPr>
-            </w:pPr>
-            <w:r>
-              <w:rPr>
-                <w:sz w:val="16"/>
-                <w:lang w:val="pt-BR"/>
-              </w:rPr>
-              <w:t xml:space="preserve">Meta: </w:t>
-            </w:r>
-            <w:proofErr w:type="gramStart"/>
-            <w:r>
-              <w:rPr>
-                <w:sz w:val="16"/>
-                <w:lang w:val="pt-BR"/>
-              </w:rPr>
-              <w:t>{{ bloco3.metas</w:t>
-            </w:r>
-            <w:proofErr w:type="gramEnd"/>
-            <w:r>
-              <w:rPr>
-                <w:sz w:val="16"/>
-                <w:lang w:val="pt-BR"/>
-              </w:rPr>
-              <w:t>.taxa_</w:t>
-            </w:r>
-            <w:proofErr w:type="gramStart"/>
-            <w:r>
-              <w:rPr>
-                <w:sz w:val="16"/>
-                <w:lang w:val="pt-BR"/>
-              </w:rPr>
-              <w:t>avaria }</w:t>
-            </w:r>
-            <w:proofErr w:type="gramEnd"/>
-            <w:r>
-              <w:rPr>
-                <w:sz w:val="16"/>
-                <w:lang w:val="pt-BR"/>
-              </w:rPr>
-              <w:t xml:space="preserve">}  </w:t>
-            </w:r>
-            <w:proofErr w:type="gramStart"/>
-            <w:r>
-              <w:rPr>
-                <w:sz w:val="16"/>
-                <w:lang w:val="pt-BR"/>
-              </w:rPr>
-              <w:t>±{{ bloco3.alert</w:t>
-            </w:r>
-            <w:proofErr w:type="gramEnd"/>
-            <w:r>
-              <w:rPr>
-                <w:sz w:val="16"/>
-                <w:lang w:val="pt-BR"/>
-              </w:rPr>
-              <w:t>_</w:t>
-            </w:r>
-            <w:proofErr w:type="gramStart"/>
-            <w:r>
-              <w:rPr>
-                <w:sz w:val="16"/>
-                <w:lang w:val="pt-BR"/>
-              </w:rPr>
-              <w:t>range }}%</w:t>
-            </w:r>
-            <w:proofErr w:type="gramEnd"/>
-          </w:p>
-        </w:tc>
-      </w:tr>
-      <w:tr>
-        <w:trPr>
-          <w:cnfStyle w:val="000000100000" w:firstRow="0" w:lastRow="0" w:firstColumn="0" w:lastColumn="0" w:oddVBand="0" w:evenVBand="0" w:oddHBand="1" w:evenHBand="0" w:firstRowFirstColumn="0" w:firstRowLastColumn="0" w:lastRowFirstColumn="0" w:lastRowLastColumn="0"/>
-        </w:trPr>
-        <w:tc>
-          <w:tcPr>
-            <w:cnfStyle w:val="001000000000" w:firstRow="0" w:lastRow="0" w:firstColumn="1" w:lastColumn="0" w:oddVBand="0" w:evenVBand="0" w:oddHBand="0" w:evenHBand="0" w:firstRowFirstColumn="0" w:firstRowLastColumn="0" w:lastRowFirstColumn="0" w:lastRowLastColumn="0"/>
-            <w:tcW w:w="4270" w:type="dxa"/>
-            <w:vAlign w:val="center"/>
-          </w:tcPr>
-          <w:p>
-            <w:pPr>
-              <w:jc w:val="center"/>
-            </w:pPr>
-            <w:proofErr w:type="gramStart"/>
-            <w:r>
-              <w:rPr>
-                <w:b w:val="0"/>
-                <w:sz w:val="20"/>
-              </w:rPr>
-              <w:t>{{ bloco3.sunburst</w:t>
-            </w:r>
-            <w:proofErr w:type="gramEnd"/>
-            <w:r>
-              <w:rPr>
-                <w:b w:val="0"/>
-                <w:sz w:val="20"/>
-              </w:rPr>
-              <w:t>_</w:t>
-            </w:r>
-            <w:proofErr w:type="gramStart"/>
-            <w:r>
-              <w:rPr>
-                <w:b w:val="0"/>
-                <w:sz w:val="20"/>
-              </w:rPr>
-              <w:t>figures.mtbf</w:t>
-            </w:r>
-            <w:proofErr w:type="gramEnd"/>
-            <w:r>
-              <w:rPr>
-                <w:b w:val="0"/>
-                <w:sz w:val="20"/>
-              </w:rPr>
-              <w:t xml:space="preserve"> }}</w:t>
-            </w:r>
-          </w:p>
-        </w:tc>
-        <w:tc>
-          <w:tcPr>
-            <w:tcW w:w="4581" w:type="dxa"/>
-            <w:vAlign w:val="center"/>
-          </w:tcPr>
-          <w:p>
-            <w:pPr>
-              <w:jc w:val="center"/>
-              <w:cnfStyle w:val="000000100000" w:firstRow="0" w:lastRow="0" w:firstColumn="0" w:lastColumn="0" w:oddVBand="0" w:evenVBand="0" w:oddHBand="1" w:evenHBand="0" w:firstRowFirstColumn="0" w:firstRowLastColumn="0" w:lastRowFirstColumn="0" w:lastRowLastColumn="0"/>
-            </w:pPr>
-            <w:r>
-              <w:rPr>
-                <w:sz w:val="20"/>
-              </w:rPr>
-              <w:t>{{ bloco3.sunburst_figures.mttr }}</w:t>
-            </w:r>
-          </w:p>
-        </w:tc>
-        <w:tc>
-          <w:tcPr>
-            <w:tcW w:w="5845" w:type="dxa"/>
-            <w:vAlign w:val="center"/>
-          </w:tcPr>
-          <w:p>
-            <w:pPr>
-              <w:jc w:val="center"/>
-              <w:cnfStyle w:val="000000100000" w:firstRow="0" w:lastRow="0" w:firstColumn="0" w:lastColumn="0" w:oddVBand="0" w:evenVBand="0" w:oddHBand="1" w:evenHBand="0" w:firstRowFirstColumn="0" w:firstRowLastColumn="0" w:lastRowFirstColumn="0" w:lastRowLastColumn="0"/>
-            </w:pPr>
-            <w:r>
-              <w:rPr>
-                <w:sz w:val="20"/>
-              </w:rPr>
-              <w:t>{{ bloco3.sunburst_figures.taxa_avaria }}</w:t>
-            </w:r>
           </w:p>
         </w:tc>
       </w:tr>
@@ -1655,19 +881,11 @@
             <w:pPr>
               <w:cnfStyle w:val="100000000000" w:firstRow="1" w:lastRow="0" w:firstColumn="0" w:lastColumn="0" w:oddVBand="0" w:evenVBand="0" w:oddHBand="0" w:evenHBand="0" w:firstRowFirstColumn="0" w:firstRowLastColumn="0" w:lastRowFirstColumn="0" w:lastRowLastColumn="0"/>
             </w:pPr>
-            <w:proofErr w:type="gramStart"/>
             <w:r>
               <w:rPr>
                 <w:sz w:val="16"/>
               </w:rPr>
-              <w:t>Nº</w:t>
-            </w:r>
-            <w:proofErr w:type="gramEnd"/>
-            <w:r>
-              <w:rPr>
-                <w:sz w:val="16"/>
-              </w:rPr>
-              <w:t xml:space="preserve"> Ord.</w:t>
+              <w:t>Nº Ord.</w:t>
             </w:r>
           </w:p>
         </w:tc>
@@ -1680,19 +898,11 @@
             <w:pPr>
               <w:cnfStyle w:val="100000000000" w:firstRow="1" w:lastRow="0" w:firstColumn="0" w:lastColumn="0" w:oddVBand="0" w:evenVBand="0" w:oddHBand="0" w:evenHBand="0" w:firstRowFirstColumn="0" w:firstRowLastColumn="0" w:lastRowFirstColumn="0" w:lastRowLastColumn="0"/>
             </w:pPr>
-            <w:proofErr w:type="gramStart"/>
             <w:r>
               <w:rPr>
                 <w:sz w:val="16"/>
               </w:rPr>
-              <w:t>Nº</w:t>
-            </w:r>
-            <w:proofErr w:type="gramEnd"/>
-            <w:r>
-              <w:rPr>
-                <w:sz w:val="16"/>
-              </w:rPr>
-              <w:t xml:space="preserve"> Par.</w:t>
+              <w:t>Nº Par.</w:t>
             </w:r>
           </w:p>
         </w:tc>
@@ -1829,7 +1039,6 @@
                 <w:sz w:val="2"/>
                 <w:lang w:val="pt-BR"/>
               </w:rPr>
-              <w:lastRenderedPageBreak/>
               <w:t>{%</w:t>
             </w:r>
             <w:proofErr w:type="spellStart"/>
@@ -1976,7 +1185,6 @@
             <w:vAlign w:val="center"/>
           </w:tcPr>
           <w:p>
-            <w:proofErr w:type="gramStart"/>
             <w:r>
               <w:rPr>
                 <w:b w:val="0"/>
@@ -1990,15 +1198,7 @@
                 <w:b w:val="0"/>
                 <w:sz w:val="16"/>
               </w:rPr>
-              <w:t>linha</w:t>
-            </w:r>
-            <w:proofErr w:type="gramEnd"/>
-            <w:r>
-              <w:rPr>
-                <w:b w:val="0"/>
-                <w:sz w:val="16"/>
-              </w:rPr>
-              <w:t>.equipamento</w:t>
+              <w:t>linha.equipamento</w:t>
             </w:r>
             <w:proofErr w:type="spellEnd"/>
             <w:r>
@@ -2019,7 +1219,6 @@
             <w:pPr>
               <w:cnfStyle w:val="000000010000" w:firstRow="0" w:lastRow="0" w:firstColumn="0" w:lastColumn="0" w:oddVBand="0" w:evenVBand="0" w:oddHBand="0" w:evenHBand="1" w:firstRowFirstColumn="0" w:firstRowLastColumn="0" w:lastRowFirstColumn="0" w:lastRowLastColumn="0"/>
             </w:pPr>
-            <w:proofErr w:type="gramStart"/>
             <w:r>
               <w:rPr>
                 <w:sz w:val="16"/>
@@ -2031,14 +1230,7 @@
               <w:rPr>
                 <w:sz w:val="16"/>
               </w:rPr>
-              <w:t>linha.num</w:t>
-            </w:r>
-            <w:proofErr w:type="gramEnd"/>
-            <w:r>
-              <w:rPr>
-                <w:sz w:val="16"/>
-              </w:rPr>
-              <w:t>_ordens</w:t>
+              <w:t>linha.num_ordens</w:t>
             </w:r>
             <w:proofErr w:type="spellEnd"/>
             <w:r>
@@ -2058,7 +1250,6 @@
             <w:pPr>
               <w:cnfStyle w:val="000000010000" w:firstRow="0" w:lastRow="0" w:firstColumn="0" w:lastColumn="0" w:oddVBand="0" w:evenVBand="0" w:oddHBand="0" w:evenHBand="1" w:firstRowFirstColumn="0" w:firstRowLastColumn="0" w:lastRowFirstColumn="0" w:lastRowLastColumn="0"/>
             </w:pPr>
-            <w:proofErr w:type="gramStart"/>
             <w:r>
               <w:rPr>
                 <w:sz w:val="16"/>
@@ -2070,14 +1261,7 @@
               <w:rPr>
                 <w:sz w:val="16"/>
               </w:rPr>
-              <w:t>linha.num</w:t>
-            </w:r>
-            <w:proofErr w:type="gramEnd"/>
-            <w:r>
-              <w:rPr>
-                <w:sz w:val="16"/>
-              </w:rPr>
-              <w:t>_paradas</w:t>
+              <w:t>linha.num_paradas</w:t>
             </w:r>
             <w:proofErr w:type="spellEnd"/>
             <w:r>
@@ -2097,7 +1281,6 @@
             <w:pPr>
               <w:cnfStyle w:val="000000010000" w:firstRow="0" w:lastRow="0" w:firstColumn="0" w:lastColumn="0" w:oddVBand="0" w:evenVBand="0" w:oddHBand="0" w:evenHBand="1" w:firstRowFirstColumn="0" w:firstRowLastColumn="0" w:lastRowFirstColumn="0" w:lastRowLastColumn="0"/>
             </w:pPr>
-            <w:proofErr w:type="gramStart"/>
             <w:r>
               <w:rPr>
                 <w:sz w:val="16"/>
@@ -2109,14 +1292,7 @@
               <w:rPr>
                 <w:sz w:val="16"/>
               </w:rPr>
-              <w:t>linha</w:t>
-            </w:r>
-            <w:proofErr w:type="gramEnd"/>
-            <w:r>
-              <w:rPr>
-                <w:sz w:val="16"/>
-              </w:rPr>
-              <w:t>.avaria_min</w:t>
+              <w:t>linha.avaria_min</w:t>
             </w:r>
             <w:proofErr w:type="spellEnd"/>
             <w:r>
@@ -2136,7 +1312,6 @@
             <w:pPr>
               <w:cnfStyle w:val="000000010000" w:firstRow="0" w:lastRow="0" w:firstColumn="0" w:lastColumn="0" w:oddVBand="0" w:evenVBand="0" w:oddHBand="0" w:evenHBand="1" w:firstRowFirstColumn="0" w:firstRowLastColumn="0" w:lastRowFirstColumn="0" w:lastRowLastColumn="0"/>
             </w:pPr>
-            <w:proofErr w:type="gramStart"/>
             <w:r>
               <w:rPr>
                 <w:sz w:val="16"/>
@@ -2148,14 +1323,7 @@
               <w:rPr>
                 <w:sz w:val="16"/>
               </w:rPr>
-              <w:t>linha</w:t>
-            </w:r>
-            <w:proofErr w:type="gramEnd"/>
-            <w:r>
-              <w:rPr>
-                <w:sz w:val="16"/>
-              </w:rPr>
-              <w:t>.atividade_h</w:t>
+              <w:t>linha.atividade_h</w:t>
             </w:r>
             <w:proofErr w:type="spellEnd"/>
             <w:r>
@@ -2175,7 +1343,6 @@
             <w:pPr>
               <w:cnfStyle w:val="000000010000" w:firstRow="0" w:lastRow="0" w:firstColumn="0" w:lastColumn="0" w:oddVBand="0" w:evenVBand="0" w:oddHBand="0" w:evenHBand="1" w:firstRowFirstColumn="0" w:firstRowLastColumn="0" w:lastRowFirstColumn="0" w:lastRowLastColumn="0"/>
             </w:pPr>
-            <w:proofErr w:type="gramStart"/>
             <w:r>
               <w:rPr>
                 <w:sz w:val="16"/>
@@ -2187,14 +1354,7 @@
               <w:rPr>
                 <w:sz w:val="16"/>
               </w:rPr>
-              <w:t>linha</w:t>
-            </w:r>
-            <w:proofErr w:type="gramEnd"/>
-            <w:r>
-              <w:rPr>
-                <w:sz w:val="16"/>
-              </w:rPr>
-              <w:t>.uptime_h</w:t>
+              <w:t>linha.uptime_h</w:t>
             </w:r>
             <w:proofErr w:type="spellEnd"/>
             <w:r>
@@ -2214,7 +1374,6 @@
             <w:pPr>
               <w:cnfStyle w:val="000000010000" w:firstRow="0" w:lastRow="0" w:firstColumn="0" w:lastColumn="0" w:oddVBand="0" w:evenVBand="0" w:oddHBand="0" w:evenHBand="1" w:firstRowFirstColumn="0" w:firstRowLastColumn="0" w:lastRowFirstColumn="0" w:lastRowLastColumn="0"/>
             </w:pPr>
-            <w:proofErr w:type="gramStart"/>
             <w:r>
               <w:rPr>
                 <w:sz w:val="16"/>
@@ -2226,14 +1385,7 @@
               <w:rPr>
                 <w:sz w:val="16"/>
               </w:rPr>
-              <w:t>linha</w:t>
-            </w:r>
-            <w:proofErr w:type="gramEnd"/>
-            <w:r>
-              <w:rPr>
-                <w:sz w:val="16"/>
-              </w:rPr>
-              <w:t>.mtbf</w:t>
+              <w:t>linha.mtbf</w:t>
             </w:r>
             <w:proofErr w:type="spellEnd"/>
             <w:r>
@@ -2253,7 +1405,6 @@
             <w:pPr>
               <w:cnfStyle w:val="000000010000" w:firstRow="0" w:lastRow="0" w:firstColumn="0" w:lastColumn="0" w:oddVBand="0" w:evenVBand="0" w:oddHBand="0" w:evenHBand="1" w:firstRowFirstColumn="0" w:firstRowLastColumn="0" w:lastRowFirstColumn="0" w:lastRowLastColumn="0"/>
             </w:pPr>
-            <w:proofErr w:type="gramStart"/>
             <w:r>
               <w:rPr>
                 <w:sz w:val="16"/>
@@ -2265,14 +1416,7 @@
               <w:rPr>
                 <w:sz w:val="16"/>
               </w:rPr>
-              <w:t>linha</w:t>
-            </w:r>
-            <w:proofErr w:type="gramEnd"/>
-            <w:r>
-              <w:rPr>
-                <w:sz w:val="16"/>
-              </w:rPr>
-              <w:t>.mttr</w:t>
+              <w:t>linha.mttr</w:t>
             </w:r>
             <w:proofErr w:type="spellEnd"/>
             <w:r>
@@ -2292,7 +1436,6 @@
             <w:pPr>
               <w:cnfStyle w:val="000000010000" w:firstRow="0" w:lastRow="0" w:firstColumn="0" w:lastColumn="0" w:oddVBand="0" w:evenVBand="0" w:oddHBand="0" w:evenHBand="1" w:firstRowFirstColumn="0" w:firstRowLastColumn="0" w:lastRowFirstColumn="0" w:lastRowLastColumn="0"/>
             </w:pPr>
-            <w:proofErr w:type="gramStart"/>
             <w:r>
               <w:rPr>
                 <w:sz w:val="16"/>
@@ -2304,14 +1447,7 @@
               <w:rPr>
                 <w:sz w:val="16"/>
               </w:rPr>
-              <w:t>linha</w:t>
-            </w:r>
-            <w:proofErr w:type="gramEnd"/>
-            <w:r>
-              <w:rPr>
-                <w:sz w:val="16"/>
-              </w:rPr>
-              <w:t>.taxa_avaria</w:t>
+              <w:t>linha.taxa_avaria</w:t>
             </w:r>
             <w:proofErr w:type="spellEnd"/>
             <w:r>
@@ -2476,21 +1612,12 @@
             <w:pPr>
               <w:cnfStyle w:val="000000010000" w:firstRow="0" w:lastRow="0" w:firstColumn="0" w:lastColumn="0" w:oddVBand="0" w:evenVBand="0" w:oddHBand="0" w:evenHBand="1" w:firstRowFirstColumn="0" w:firstRowLastColumn="0" w:lastRowFirstColumn="0" w:lastRowLastColumn="0"/>
             </w:pPr>
-            <w:proofErr w:type="gramStart"/>
             <w:r>
               <w:rPr>
                 <w:b/>
                 <w:sz w:val="16"/>
               </w:rPr>
-              <w:t>{{ bloco4.total.num</w:t>
-            </w:r>
-            <w:proofErr w:type="gramEnd"/>
-            <w:r>
-              <w:rPr>
-                <w:b/>
-                <w:sz w:val="16"/>
-              </w:rPr>
-              <w:t>_ordens }}</w:t>
+              <w:t>{{ bloco4.total.num_ordens }}</w:t>
             </w:r>
           </w:p>
         </w:tc>
@@ -2503,21 +1630,12 @@
             <w:pPr>
               <w:cnfStyle w:val="000000010000" w:firstRow="0" w:lastRow="0" w:firstColumn="0" w:lastColumn="0" w:oddVBand="0" w:evenVBand="0" w:oddHBand="0" w:evenHBand="1" w:firstRowFirstColumn="0" w:firstRowLastColumn="0" w:lastRowFirstColumn="0" w:lastRowLastColumn="0"/>
             </w:pPr>
-            <w:proofErr w:type="gramStart"/>
             <w:r>
               <w:rPr>
                 <w:b/>
                 <w:sz w:val="16"/>
               </w:rPr>
-              <w:t>{{ bloco4.total.num</w:t>
-            </w:r>
-            <w:proofErr w:type="gramEnd"/>
-            <w:r>
-              <w:rPr>
-                <w:b/>
-                <w:sz w:val="16"/>
-              </w:rPr>
-              <w:t>_paradas }}</w:t>
+              <w:t>{{ bloco4.total.num_paradas }}</w:t>
             </w:r>
           </w:p>
         </w:tc>
@@ -2530,21 +1648,12 @@
             <w:pPr>
               <w:cnfStyle w:val="000000010000" w:firstRow="0" w:lastRow="0" w:firstColumn="0" w:lastColumn="0" w:oddVBand="0" w:evenVBand="0" w:oddHBand="0" w:evenHBand="1" w:firstRowFirstColumn="0" w:firstRowLastColumn="0" w:lastRowFirstColumn="0" w:lastRowLastColumn="0"/>
             </w:pPr>
-            <w:proofErr w:type="gramStart"/>
             <w:r>
               <w:rPr>
                 <w:b/>
                 <w:sz w:val="16"/>
               </w:rPr>
-              <w:t>{{ bloco4.total</w:t>
-            </w:r>
-            <w:proofErr w:type="gramEnd"/>
-            <w:r>
-              <w:rPr>
-                <w:b/>
-                <w:sz w:val="16"/>
-              </w:rPr>
-              <w:t>.avaria_min }}</w:t>
+              <w:t>{{ bloco4.total.avaria_min }}</w:t>
             </w:r>
           </w:p>
         </w:tc>
@@ -2557,21 +1666,12 @@
             <w:pPr>
               <w:cnfStyle w:val="000000010000" w:firstRow="0" w:lastRow="0" w:firstColumn="0" w:lastColumn="0" w:oddVBand="0" w:evenVBand="0" w:oddHBand="0" w:evenHBand="1" w:firstRowFirstColumn="0" w:firstRowLastColumn="0" w:lastRowFirstColumn="0" w:lastRowLastColumn="0"/>
             </w:pPr>
-            <w:proofErr w:type="gramStart"/>
             <w:r>
               <w:rPr>
                 <w:b/>
                 <w:sz w:val="16"/>
               </w:rPr>
-              <w:t>{{ bloco4.total</w:t>
-            </w:r>
-            <w:proofErr w:type="gramEnd"/>
-            <w:r>
-              <w:rPr>
-                <w:b/>
-                <w:sz w:val="16"/>
-              </w:rPr>
-              <w:t>.atividade_h }}</w:t>
+              <w:t>{{ bloco4.total.atividade_h }}</w:t>
             </w:r>
           </w:p>
         </w:tc>
@@ -2584,21 +1684,12 @@
             <w:pPr>
               <w:cnfStyle w:val="000000010000" w:firstRow="0" w:lastRow="0" w:firstColumn="0" w:lastColumn="0" w:oddVBand="0" w:evenVBand="0" w:oddHBand="0" w:evenHBand="1" w:firstRowFirstColumn="0" w:firstRowLastColumn="0" w:lastRowFirstColumn="0" w:lastRowLastColumn="0"/>
             </w:pPr>
-            <w:proofErr w:type="gramStart"/>
             <w:r>
               <w:rPr>
                 <w:b/>
                 <w:sz w:val="16"/>
               </w:rPr>
-              <w:t>{{ bloco4.total</w:t>
-            </w:r>
-            <w:proofErr w:type="gramEnd"/>
-            <w:r>
-              <w:rPr>
-                <w:b/>
-                <w:sz w:val="16"/>
-              </w:rPr>
-              <w:t>.uptime_h }}</w:t>
+              <w:t>{{ bloco4.total.uptime_h }}</w:t>
             </w:r>
           </w:p>
         </w:tc>
@@ -2611,21 +1702,12 @@
             <w:pPr>
               <w:cnfStyle w:val="000000010000" w:firstRow="0" w:lastRow="0" w:firstColumn="0" w:lastColumn="0" w:oddVBand="0" w:evenVBand="0" w:oddHBand="0" w:evenHBand="1" w:firstRowFirstColumn="0" w:firstRowLastColumn="0" w:lastRowFirstColumn="0" w:lastRowLastColumn="0"/>
             </w:pPr>
-            <w:proofErr w:type="gramStart"/>
             <w:r>
               <w:rPr>
                 <w:b/>
                 <w:sz w:val="16"/>
               </w:rPr>
-              <w:t>{{ bloco4.total</w:t>
-            </w:r>
-            <w:proofErr w:type="gramEnd"/>
-            <w:r>
-              <w:rPr>
-                <w:b/>
-                <w:sz w:val="16"/>
-              </w:rPr>
-              <w:t>.mtbf }}</w:t>
+              <w:t>{{ bloco4.total.mtbf }}</w:t>
             </w:r>
           </w:p>
         </w:tc>
@@ -2638,21 +1720,12 @@
             <w:pPr>
               <w:cnfStyle w:val="000000010000" w:firstRow="0" w:lastRow="0" w:firstColumn="0" w:lastColumn="0" w:oddVBand="0" w:evenVBand="0" w:oddHBand="0" w:evenHBand="1" w:firstRowFirstColumn="0" w:firstRowLastColumn="0" w:lastRowFirstColumn="0" w:lastRowLastColumn="0"/>
             </w:pPr>
-            <w:proofErr w:type="gramStart"/>
             <w:r>
               <w:rPr>
                 <w:b/>
                 <w:sz w:val="16"/>
               </w:rPr>
-              <w:t>{{ bloco4.total</w:t>
-            </w:r>
-            <w:proofErr w:type="gramEnd"/>
-            <w:r>
-              <w:rPr>
-                <w:b/>
-                <w:sz w:val="16"/>
-              </w:rPr>
-              <w:t>.mttr }}</w:t>
+              <w:t>{{ bloco4.total.mttr }}</w:t>
             </w:r>
           </w:p>
         </w:tc>
@@ -2665,21 +1738,316 @@
             <w:pPr>
               <w:cnfStyle w:val="000000010000" w:firstRow="0" w:lastRow="0" w:firstColumn="0" w:lastColumn="0" w:oddVBand="0" w:evenVBand="0" w:oddHBand="0" w:evenHBand="1" w:firstRowFirstColumn="0" w:firstRowLastColumn="0" w:lastRowFirstColumn="0" w:lastRowLastColumn="0"/>
             </w:pPr>
-            <w:proofErr w:type="gramStart"/>
             <w:r>
               <w:rPr>
                 <w:b/>
                 <w:sz w:val="16"/>
               </w:rPr>
-              <w:t>{{ bloco4.total</w:t>
+              <w:t>{{ bloco4.total.taxa_avaria }}</w:t>
             </w:r>
-            <w:proofErr w:type="gramEnd"/>
+          </w:p>
+        </w:tc>
+      </w:tr>
+    </w:tbl>
+    <w:p>
+      <w:pPr>
+        <w:spacing w:before="280"/>
+        <w:rPr>
+          <w:color w:val="1B2860"/>
+        </w:rPr>
+      </w:pPr>
+      <w:proofErr w:type="spellStart"/>
+      <w:r>
+        <w:rPr>
+          <w:b/>
+          <w:color w:val="1B2860"/>
+          <w:sz w:val="24"/>
+        </w:rPr>
+        <w:t>Indicadores</w:t>
+      </w:r>
+      <w:proofErr w:type="spellEnd"/>
+      <w:r>
+        <w:rPr>
+          <w:b/>
+          <w:color w:val="1B2860"/>
+          <w:sz w:val="24"/>
+        </w:rPr>
+        <w:t xml:space="preserve"> </w:t>
+      </w:r>
+      <w:proofErr w:type="spellStart"/>
+      <w:r>
+        <w:rPr>
+          <w:b/>
+          <w:color w:val="1B2860"/>
+          <w:sz w:val="24"/>
+        </w:rPr>
+        <w:t>Últimas</w:t>
+      </w:r>
+      <w:proofErr w:type="spellEnd"/>
+      <w:r>
+        <w:rPr>
+          <w:b/>
+          <w:color w:val="1B2860"/>
+          <w:sz w:val="24"/>
+        </w:rPr>
+        <w:t xml:space="preserve"> 24 Horas — Planta</w:t>
+      </w:r>
+    </w:p>
+    <w:tbl>
+      <w:tblPr>
+        <w:tblStyle w:val="GradeClara-nfase1"/>
+        <w:tblW w:w="0" w:type="auto"/>
+        <w:tblLook w:val="04A0" w:firstRow="1" w:lastRow="0" w:firstColumn="1" w:lastColumn="0" w:noHBand="0" w:noVBand="1"/>
+      </w:tblPr>
+      <w:tblGrid>
+        <w:gridCol w:w="4270"/>
+        <w:gridCol w:w="4581"/>
+        <w:gridCol w:w="5845"/>
+      </w:tblGrid>
+      <w:tr>
+        <w:trPr>
+          <w:cnfStyle w:val="100000000000" w:firstRow="1" w:lastRow="0" w:firstColumn="0" w:lastColumn="0" w:oddVBand="0" w:evenVBand="0" w:oddHBand="0" w:evenHBand="0" w:firstRowFirstColumn="0" w:firstRowLastColumn="0" w:lastRowFirstColumn="0" w:lastRowLastColumn="0"/>
+        </w:trPr>
+        <w:tc>
+          <w:tcPr>
+            <w:cnfStyle w:val="001000000000" w:firstRow="0" w:lastRow="0" w:firstColumn="1" w:lastColumn="0" w:oddVBand="0" w:evenVBand="0" w:oddHBand="0" w:evenHBand="0" w:firstRowFirstColumn="0" w:firstRowLastColumn="0" w:lastRowFirstColumn="0" w:lastRowLastColumn="0"/>
+            <w:tcW w:w="4270" w:type="dxa"/>
+            <w:vAlign w:val="center"/>
+          </w:tcPr>
+          <w:p>
+            <w:pPr>
+              <w:jc w:val="center"/>
+            </w:pPr>
+            <w:r>
+              <w:t>MTBF (h)</w:t>
+            </w:r>
+          </w:p>
+        </w:tc>
+        <w:tc>
+          <w:tcPr>
+            <w:tcW w:w="4581" w:type="dxa"/>
+            <w:vAlign w:val="center"/>
+          </w:tcPr>
+          <w:p>
+            <w:pPr>
+              <w:jc w:val="center"/>
+              <w:cnfStyle w:val="100000000000" w:firstRow="1" w:lastRow="0" w:firstColumn="0" w:lastColumn="0" w:oddVBand="0" w:evenVBand="0" w:oddHBand="0" w:evenHBand="0" w:firstRowFirstColumn="0" w:firstRowLastColumn="0" w:lastRowFirstColumn="0" w:lastRowLastColumn="0"/>
+            </w:pPr>
+            <w:r>
+              <w:t>MTTR (min)</w:t>
+            </w:r>
+          </w:p>
+        </w:tc>
+        <w:tc>
+          <w:tcPr>
+            <w:tcW w:w="5845" w:type="dxa"/>
+            <w:vAlign w:val="center"/>
+          </w:tcPr>
+          <w:p>
+            <w:pPr>
+              <w:jc w:val="center"/>
+              <w:cnfStyle w:val="100000000000" w:firstRow="1" w:lastRow="0" w:firstColumn="0" w:lastColumn="0" w:oddVBand="0" w:evenVBand="0" w:oddHBand="0" w:evenHBand="0" w:firstRowFirstColumn="0" w:firstRowLastColumn="0" w:lastRowFirstColumn="0" w:lastRowLastColumn="0"/>
+            </w:pPr>
+            <w:r>
+              <w:t>Taxa de Avaria (%)</w:t>
+            </w:r>
+          </w:p>
+        </w:tc>
+      </w:tr>
+      <w:tr>
+        <w:trPr>
+          <w:cnfStyle w:val="000000100000" w:firstRow="0" w:lastRow="0" w:firstColumn="0" w:lastColumn="0" w:oddVBand="0" w:evenVBand="0" w:oddHBand="1" w:evenHBand="0" w:firstRowFirstColumn="0" w:firstRowLastColumn="0" w:lastRowFirstColumn="0" w:lastRowLastColumn="0"/>
+        </w:trPr>
+        <w:tc>
+          <w:tcPr>
+            <w:cnfStyle w:val="001000000000" w:firstRow="0" w:lastRow="0" w:firstColumn="1" w:lastColumn="0" w:oddVBand="0" w:evenVBand="0" w:oddHBand="0" w:evenHBand="0" w:firstRowFirstColumn="0" w:firstRowLastColumn="0" w:lastRowFirstColumn="0" w:lastRowLastColumn="0"/>
+            <w:tcW w:w="4270" w:type="dxa"/>
+            <w:vAlign w:val="center"/>
+          </w:tcPr>
+          <w:p>
+            <w:pPr>
+              <w:jc w:val="center"/>
+            </w:pPr>
+            <w:r>
+              <w:rPr>
+                <w:sz w:val="40"/>
+              </w:rPr>
+              <w:lastRenderedPageBreak/>
+              <w:t>{{ bloco3.kpis_planta.mtbf }}</w:t>
+            </w:r>
+          </w:p>
+        </w:tc>
+        <w:tc>
+          <w:tcPr>
+            <w:tcW w:w="4581" w:type="dxa"/>
+            <w:vAlign w:val="center"/>
+          </w:tcPr>
+          <w:p>
+            <w:pPr>
+              <w:jc w:val="center"/>
+              <w:cnfStyle w:val="000000100000" w:firstRow="0" w:lastRow="0" w:firstColumn="0" w:lastColumn="0" w:oddVBand="0" w:evenVBand="0" w:oddHBand="1" w:evenHBand="0" w:firstRowFirstColumn="0" w:firstRowLastColumn="0" w:lastRowFirstColumn="0" w:lastRowLastColumn="0"/>
+            </w:pPr>
             <w:r>
               <w:rPr>
                 <w:b/>
+                <w:sz w:val="40"/>
+              </w:rPr>
+              <w:t>{{ bloco3.kpis_planta.mttr }}</w:t>
+            </w:r>
+          </w:p>
+        </w:tc>
+        <w:tc>
+          <w:tcPr>
+            <w:tcW w:w="5845" w:type="dxa"/>
+            <w:vAlign w:val="center"/>
+          </w:tcPr>
+          <w:p>
+            <w:pPr>
+              <w:jc w:val="center"/>
+              <w:cnfStyle w:val="000000100000" w:firstRow="0" w:lastRow="0" w:firstColumn="0" w:lastColumn="0" w:oddVBand="0" w:evenVBand="0" w:oddHBand="1" w:evenHBand="0" w:firstRowFirstColumn="0" w:firstRowLastColumn="0" w:lastRowFirstColumn="0" w:lastRowLastColumn="0"/>
+              <w:rPr>
+                <w:lang w:val="pt-BR"/>
+              </w:rPr>
+            </w:pPr>
+            <w:r>
+              <w:rPr>
+                <w:b/>
+                <w:sz w:val="40"/>
+                <w:lang w:val="pt-BR"/>
+              </w:rPr>
+              <w:t>{{ bloco3.kpis_planta.taxa_avaria }}</w:t>
+            </w:r>
+          </w:p>
+        </w:tc>
+      </w:tr>
+      <w:tr>
+        <w:trPr>
+          <w:cnfStyle w:val="000000010000" w:firstRow="0" w:lastRow="0" w:firstColumn="0" w:lastColumn="0" w:oddVBand="0" w:evenVBand="0" w:oddHBand="0" w:evenHBand="1" w:firstRowFirstColumn="0" w:firstRowLastColumn="0" w:lastRowFirstColumn="0" w:lastRowLastColumn="0"/>
+        </w:trPr>
+        <w:tc>
+          <w:tcPr>
+            <w:cnfStyle w:val="001000000000" w:firstRow="0" w:lastRow="0" w:firstColumn="1" w:lastColumn="0" w:oddVBand="0" w:evenVBand="0" w:oddHBand="0" w:evenHBand="0" w:firstRowFirstColumn="0" w:firstRowLastColumn="0" w:lastRowFirstColumn="0" w:lastRowLastColumn="0"/>
+            <w:tcW w:w="4270" w:type="dxa"/>
+            <w:vAlign w:val="center"/>
+          </w:tcPr>
+          <w:p>
+            <w:pPr>
+              <w:jc w:val="center"/>
+              <w:rPr>
+                <w:lang w:val="pt-BR"/>
+              </w:rPr>
+            </w:pPr>
+            <w:r>
+              <w:rPr>
+                <w:b w:val="0"/>
                 <w:sz w:val="16"/>
+                <w:lang w:val="pt-BR"/>
               </w:rPr>
-              <w:t>.taxa_avaria }}</w:t>
+              <w:t>Meta: {{ bloco3.metas.mtbf }}  ±{{ bloco3.alert_range }}%</w:t>
+            </w:r>
+          </w:p>
+        </w:tc>
+        <w:tc>
+          <w:tcPr>
+            <w:tcW w:w="4581" w:type="dxa"/>
+            <w:vAlign w:val="center"/>
+          </w:tcPr>
+          <w:p>
+            <w:pPr>
+              <w:jc w:val="center"/>
+              <w:cnfStyle w:val="000000010000" w:firstRow="0" w:lastRow="0" w:firstColumn="0" w:lastColumn="0" w:oddVBand="0" w:evenVBand="0" w:oddHBand="0" w:evenHBand="1" w:firstRowFirstColumn="0" w:firstRowLastColumn="0" w:lastRowFirstColumn="0" w:lastRowLastColumn="0"/>
+              <w:rPr>
+                <w:lang w:val="pt-BR"/>
+              </w:rPr>
+            </w:pPr>
+            <w:r>
+              <w:rPr>
+                <w:sz w:val="16"/>
+                <w:lang w:val="pt-BR"/>
+              </w:rPr>
+              <w:t>Meta: {{ bloco3.metas.mttr }}  ±{{ bloco3.alert_range }}%</w:t>
+            </w:r>
+          </w:p>
+        </w:tc>
+        <w:tc>
+          <w:tcPr>
+            <w:tcW w:w="5845" w:type="dxa"/>
+            <w:vAlign w:val="center"/>
+          </w:tcPr>
+          <w:p>
+            <w:pPr>
+              <w:jc w:val="center"/>
+              <w:cnfStyle w:val="000000010000" w:firstRow="0" w:lastRow="0" w:firstColumn="0" w:lastColumn="0" w:oddVBand="0" w:evenVBand="0" w:oddHBand="0" w:evenHBand="1" w:firstRowFirstColumn="0" w:firstRowLastColumn="0" w:lastRowFirstColumn="0" w:lastRowLastColumn="0"/>
+              <w:rPr>
+                <w:lang w:val="pt-BR"/>
+              </w:rPr>
+            </w:pPr>
+            <w:r>
+              <w:rPr>
+                <w:sz w:val="16"/>
+                <w:lang w:val="pt-BR"/>
+              </w:rPr>
+              <w:t>Meta: {{ bloco3.metas.taxa_avaria }}  ±{{ bloco3.alert_range }}%</w:t>
+            </w:r>
+          </w:p>
+        </w:tc>
+      </w:tr>
+      <w:tr>
+        <w:trPr>
+          <w:cnfStyle w:val="000000100000" w:firstRow="0" w:lastRow="0" w:firstColumn="0" w:lastColumn="0" w:oddVBand="0" w:evenVBand="0" w:oddHBand="1" w:evenHBand="0" w:firstRowFirstColumn="0" w:firstRowLastColumn="0" w:lastRowFirstColumn="0" w:lastRowLastColumn="0"/>
+        </w:trPr>
+        <w:tc>
+          <w:tcPr>
+            <w:cnfStyle w:val="001000000000" w:firstRow="0" w:lastRow="0" w:firstColumn="1" w:lastColumn="0" w:oddVBand="0" w:evenVBand="0" w:oddHBand="0" w:evenHBand="0" w:firstRowFirstColumn="0" w:firstRowLastColumn="0" w:lastRowFirstColumn="0" w:lastRowLastColumn="0"/>
+            <w:tcW w:w="4270" w:type="dxa"/>
+            <w:vAlign w:val="center"/>
+          </w:tcPr>
+          <w:p>
+            <w:pPr>
+              <w:jc w:val="center"/>
+            </w:pPr>
+            <w:r>
+              <w:rPr>
+                <w:b w:val="0"/>
+                <w:sz w:val="20"/>
+              </w:rPr>
+              <w:t>{{ bloco3.sunburst_figures.mtbf }}</w:t>
+            </w:r>
+          </w:p>
+        </w:tc>
+        <w:tc>
+          <w:tcPr>
+            <w:tcW w:w="4581" w:type="dxa"/>
+            <w:vAlign w:val="center"/>
+          </w:tcPr>
+          <w:p>
+            <w:pPr>
+              <w:jc w:val="center"/>
+              <w:cnfStyle w:val="000000100000" w:firstRow="0" w:lastRow="0" w:firstColumn="0" w:lastColumn="0" w:oddVBand="0" w:evenVBand="0" w:oddHBand="1" w:evenHBand="0" w:firstRowFirstColumn="0" w:firstRowLastColumn="0" w:lastRowFirstColumn="0" w:lastRowLastColumn="0"/>
+            </w:pPr>
+            <w:r>
+              <w:rPr>
+                <w:sz w:val="20"/>
+              </w:rPr>
+              <w:t>{{ bloco3.sunburst_figures.mttr }}</w:t>
+            </w:r>
+          </w:p>
+        </w:tc>
+        <w:tc>
+          <w:tcPr>
+            <w:tcW w:w="5845" w:type="dxa"/>
+            <w:vAlign w:val="center"/>
+          </w:tcPr>
+          <w:p>
+            <w:pPr>
+              <w:jc w:val="center"/>
+              <w:cnfStyle w:val="000000100000" w:firstRow="0" w:lastRow="0" w:firstColumn="0" w:lastColumn="0" w:oddVBand="0" w:evenVBand="0" w:oddHBand="1" w:evenHBand="0" w:firstRowFirstColumn="0" w:firstRowLastColumn="0" w:lastRowFirstColumn="0" w:lastRowLastColumn="0"/>
+            </w:pPr>
+            <w:r>
+              <w:rPr>
+                <w:sz w:val="20"/>
+              </w:rPr>
+              <w:t>{{ bloco3.sunburst_figures.taxa_avaria }}</w:t>
             </w:r>
           </w:p>
         </w:tc>
@@ -2996,7 +2364,6 @@
             <w:vAlign w:val="center"/>
           </w:tcPr>
           <w:p>
-            <w:proofErr w:type="gramStart"/>
             <w:r>
               <w:rPr>
                 <w:b w:val="0"/>
@@ -3010,15 +2377,7 @@
                 <w:b w:val="0"/>
                 <w:sz w:val="16"/>
               </w:rPr>
-              <w:t>parada</w:t>
-            </w:r>
-            <w:proofErr w:type="gramEnd"/>
-            <w:r>
-              <w:rPr>
-                <w:b w:val="0"/>
-                <w:sz w:val="16"/>
-              </w:rPr>
-              <w:t>.posicao</w:t>
+              <w:t>parada.posicao</w:t>
             </w:r>
             <w:proofErr w:type="spellEnd"/>
             <w:r>
@@ -3237,17 +2596,7 @@
           <w:sz w:val="16"/>
           <w:lang w:val="pt-BR"/>
         </w:rPr>
-        <w:t xml:space="preserve">Gerado em </w:t>
-      </w:r>
-      <w:proofErr w:type="gramStart"/>
-      <w:r>
-        <w:rPr>
-          <w:i/>
-          <w:color w:val="1B2860"/>
-          <w:sz w:val="16"/>
-          <w:lang w:val="pt-BR"/>
-        </w:rPr>
-        <w:t xml:space="preserve">{{ </w:t>
+        <w:t xml:space="preserve">Gerado em {{ </w:t>
       </w:r>
       <w:proofErr w:type="spellStart"/>
       <w:r>
@@ -3257,9 +2606,9 @@
           <w:sz w:val="16"/>
           <w:lang w:val="pt-BR"/>
         </w:rPr>
-        <w:t>periodo</w:t>
+        <w:t>periodo.data_clique.strftime</w:t>
       </w:r>
-      <w:proofErr w:type="gramEnd"/>
+      <w:proofErr w:type="spellEnd"/>
       <w:r>
         <w:rPr>
           <w:i/>
@@ -3267,58 +2616,7 @@
           <w:sz w:val="16"/>
           <w:lang w:val="pt-BR"/>
         </w:rPr>
-        <w:t>.data_</w:t>
-      </w:r>
-      <w:proofErr w:type="gramStart"/>
-      <w:r>
-        <w:rPr>
-          <w:i/>
-          <w:color w:val="1B2860"/>
-          <w:sz w:val="16"/>
-          <w:lang w:val="pt-BR"/>
-        </w:rPr>
-        <w:t>clique.strftime</w:t>
-      </w:r>
-      <w:proofErr w:type="spellEnd"/>
-      <w:proofErr w:type="gramEnd"/>
-      <w:r>
-        <w:rPr>
-          <w:i/>
-          <w:color w:val="1B2860"/>
-          <w:sz w:val="16"/>
-          <w:lang w:val="pt-BR"/>
-        </w:rPr>
-        <w:t>('%d/%m/%Y %H:%M'</w:t>
-      </w:r>
-      <w:proofErr w:type="gramStart"/>
-      <w:r>
-        <w:rPr>
-          <w:i/>
-          <w:color w:val="1B2860"/>
-          <w:sz w:val="16"/>
-          <w:lang w:val="pt-BR"/>
-        </w:rPr>
-        <w:t>) }</w:t>
-      </w:r>
-      <w:proofErr w:type="gramEnd"/>
-      <w:r>
-        <w:rPr>
-          <w:i/>
-          <w:color w:val="1B2860"/>
-          <w:sz w:val="16"/>
-          <w:lang w:val="pt-BR"/>
-        </w:rPr>
-        <w:t>} (</w:t>
-      </w:r>
-      <w:proofErr w:type="gramStart"/>
-      <w:r>
-        <w:rPr>
-          <w:i/>
-          <w:color w:val="1B2860"/>
-          <w:sz w:val="16"/>
-          <w:lang w:val="pt-BR"/>
-        </w:rPr>
-        <w:t xml:space="preserve">{{ </w:t>
+        <w:t xml:space="preserve">('%d/%m/%Y %H:%M') }} ({{ </w:t>
       </w:r>
       <w:proofErr w:type="spellStart"/>
       <w:r>
@@ -3328,27 +2626,7 @@
           <w:sz w:val="16"/>
           <w:lang w:val="pt-BR"/>
         </w:rPr>
-        <w:t>periodo</w:t>
-      </w:r>
-      <w:proofErr w:type="gramEnd"/>
-      <w:r>
-        <w:rPr>
-          <w:i/>
-          <w:color w:val="1B2860"/>
-          <w:sz w:val="16"/>
-          <w:lang w:val="pt-BR"/>
-        </w:rPr>
-        <w:t>.</w:t>
-      </w:r>
-      <w:proofErr w:type="gramStart"/>
-      <w:r>
-        <w:rPr>
-          <w:i/>
-          <w:color w:val="1B2860"/>
-          <w:sz w:val="16"/>
-          <w:lang w:val="pt-BR"/>
-        </w:rPr>
-        <w:t>fuso</w:t>
+        <w:t>periodo.fuso</w:t>
       </w:r>
       <w:proofErr w:type="spellEnd"/>
       <w:r>
@@ -3358,17 +2636,7 @@
           <w:sz w:val="16"/>
           <w:lang w:val="pt-BR"/>
         </w:rPr>
-        <w:t xml:space="preserve"> }</w:t>
-      </w:r>
-      <w:proofErr w:type="gramEnd"/>
-      <w:r>
-        <w:rPr>
-          <w:i/>
-          <w:color w:val="1B2860"/>
-          <w:sz w:val="16"/>
-          <w:lang w:val="pt-BR"/>
-        </w:rPr>
-        <w:t>})</w:t>
+        <w:t xml:space="preserve"> }})</w:t>
       </w:r>
     </w:p>
     <w:p>

</xml_diff>

<commit_message>
feat(kpi-report): gráfico e tabelas de custo de manutenção no DOCX
Adiciona ao relatório DOCX (v1 e v2 — builder compartilhado), antes das
Anotações da Reunião: gráfico de custo do mês corrente (barras % do orçado,
largura cheia, fontes ampliadas para leitura em papel) e duas tabelas de
lançamentos (últimos 10 + top 5 maiores, colunas Data/Equipamento/Conta/
Descritor/Valor). Geração no montar_docx (DOCX-only e defensiva: omite blocos
sem dados e nunca derruba o export). Anotações da Reunião isoladas na última
página via quebra de página.

Inclui helpers da feature Custo de Manutenção (CostsManagement) dos quais o
relatório depende: custos/leitura.py (fetch_lancamentos_recentes/maiores,
fetch_contas_geral, _row_lanc) e callbacks_registers/custo_callbacks.py.

SDD KPIReport-v2: SP-16/17, DS-11/12, IM-15/16.
</commit_message>
<xml_diff>
--- a/webapp/src/assets/templates/kpi_report.docx
+++ b/webapp/src/assets/templates/kpi_report.docx
@@ -2649,6 +2649,727 @@
         <w:rPr>
           <w:lang w:val="pt-BR"/>
         </w:rPr>
+        <w:br w:type="page"/>
+      </w:r>
+    </w:p>
+    <w:p>
+      <w:r>
+        <w:t xml:space="preserve">{%p if custo_mensal_img %}</w:t>
+      </w:r>
+    </w:p>
+    <w:p>
+      <w:r>
+        <w:rPr>
+          <w:b/>
+          <w:sz w:val="24"/>
+          <w:szCs w:val="24"/>
+          <w:color w:val="1B2860"/>
+        </w:rPr>
+        <w:t xml:space="preserve">{{ custo_mensal_titulo }}</w:t>
+      </w:r>
+    </w:p>
+    <w:p>
+      <w:r>
+        <w:t xml:space="preserve">{{ custo_mensal_img }}</w:t>
+      </w:r>
+    </w:p>
+    <w:p>
+      <w:r>
+        <w:t xml:space="preserve">{%p endif %}</w:t>
+      </w:r>
+    </w:p>
+    <w:p>
+      <w:r>
+        <w:t xml:space="preserve">{%p if custo_recentes %}</w:t>
+      </w:r>
+    </w:p>
+    <w:p>
+      <w:pPr>
+        <w:spacing w:before="120"/>
+      </w:pPr>
+      <w:r>
+        <w:rPr>
+          <w:b/>
+          <w:sz w:val="22"/>
+          <w:color w:val="1B2860"/>
+        </w:rPr>
+        <w:t xml:space="preserve">Últimos 10 custos</w:t>
+      </w:r>
+    </w:p>
+    <w:tbl>
+      <w:tblPr>
+        <w:tblW w:w="14480" w:type="dxa"/>
+        <w:tblBorders>
+          <w:top w:val="single" w:sz="4" w:space="0" w:color="BBBBBB"/>
+          <w:left w:val="single" w:sz="4" w:space="0" w:color="BBBBBB"/>
+          <w:bottom w:val="single" w:sz="4" w:space="0" w:color="BBBBBB"/>
+          <w:right w:val="single" w:sz="4" w:space="0" w:color="BBBBBB"/>
+          <w:insideH w:val="single" w:sz="4" w:space="0" w:color="BBBBBB"/>
+          <w:insideV w:val="single" w:sz="4" w:space="0" w:color="BBBBBB"/>
+        </w:tblBorders>
+        <w:tblLook w:val="04A0" w:firstRow="1" w:lastRow="0" w:firstColumn="0" w:lastColumn="0" w:noHBand="0" w:noVBand="1"/>
+      </w:tblPr>
+      <w:tblGrid>
+        <w:gridCol w:w="1400"/>
+        <w:gridCol w:w="2400"/>
+        <w:gridCol w:w="3600"/>
+        <w:gridCol w:w="5080"/>
+        <w:gridCol w:w="2000"/>
+      </w:tblGrid>
+      <w:tr>
+        <w:trPr>
+          <w:tblHeader/>
+        </w:trPr>
+        <w:tc>
+          <w:tcPr>
+            <w:tcW w:w="1400" w:type="dxa"/>
+            <w:shd w:val="clear" w:color="auto" w:fill="D9E2EC"/>
+            <w:vAlign w:val="center"/>
+          </w:tcPr>
+          <w:p>
+            <w:r>
+              <w:rPr>
+                <w:b/>
+                <w:sz w:val="18"/>
+              </w:rPr>
+              <w:t xml:space="preserve">Data</w:t>
+            </w:r>
+          </w:p>
+        </w:tc>
+        <w:tc>
+          <w:tcPr>
+            <w:tcW w:w="2400" w:type="dxa"/>
+            <w:shd w:val="clear" w:color="auto" w:fill="D9E2EC"/>
+            <w:vAlign w:val="center"/>
+          </w:tcPr>
+          <w:p>
+            <w:r>
+              <w:rPr>
+                <w:b/>
+                <w:sz w:val="18"/>
+              </w:rPr>
+              <w:t xml:space="preserve">Equipamento</w:t>
+            </w:r>
+          </w:p>
+        </w:tc>
+        <w:tc>
+          <w:tcPr>
+            <w:tcW w:w="3600" w:type="dxa"/>
+            <w:shd w:val="clear" w:color="auto" w:fill="D9E2EC"/>
+            <w:vAlign w:val="center"/>
+          </w:tcPr>
+          <w:p>
+            <w:r>
+              <w:rPr>
+                <w:b/>
+                <w:sz w:val="18"/>
+              </w:rPr>
+              <w:t xml:space="preserve">Conta</w:t>
+            </w:r>
+          </w:p>
+        </w:tc>
+        <w:tc>
+          <w:tcPr>
+            <w:tcW w:w="5080" w:type="dxa"/>
+            <w:shd w:val="clear" w:color="auto" w:fill="D9E2EC"/>
+            <w:vAlign w:val="center"/>
+          </w:tcPr>
+          <w:p>
+            <w:r>
+              <w:rPr>
+                <w:b/>
+                <w:sz w:val="18"/>
+              </w:rPr>
+              <w:t xml:space="preserve">Descritor</w:t>
+            </w:r>
+          </w:p>
+        </w:tc>
+        <w:tc>
+          <w:tcPr>
+            <w:tcW w:w="2000" w:type="dxa"/>
+            <w:shd w:val="clear" w:color="auto" w:fill="D9E2EC"/>
+            <w:vAlign w:val="center"/>
+          </w:tcPr>
+          <w:p>
+            <w:r>
+              <w:rPr>
+                <w:b/>
+                <w:sz w:val="18"/>
+              </w:rPr>
+              <w:t xml:space="preserve">Valor</w:t>
+            </w:r>
+          </w:p>
+        </w:tc>
+      </w:tr>
+      <w:tr>
+        <w:tc>
+          <w:tcPr>
+            <w:tcW w:w="1400" w:type="dxa"/>
+            <w:vAlign w:val="center"/>
+          </w:tcPr>
+          <w:p>
+            <w:r>
+              <w:rPr>
+                <w:sz w:val="18"/>
+              </w:rPr>
+              <w:t xml:space="preserve">{%tr for l in custo_recentes %}</w:t>
+            </w:r>
+          </w:p>
+        </w:tc>
+        <w:tc>
+          <w:tcPr>
+            <w:tcW w:w="2400" w:type="dxa"/>
+            <w:vAlign w:val="center"/>
+          </w:tcPr>
+          <w:p>
+            <w:r>
+              <w:rPr>
+                <w:sz w:val="18"/>
+              </w:rPr>
+              <w:t xml:space="preserve"/>
+            </w:r>
+          </w:p>
+        </w:tc>
+        <w:tc>
+          <w:tcPr>
+            <w:tcW w:w="3600" w:type="dxa"/>
+            <w:vAlign w:val="center"/>
+          </w:tcPr>
+          <w:p>
+            <w:r>
+              <w:rPr>
+                <w:sz w:val="18"/>
+              </w:rPr>
+              <w:t xml:space="preserve"/>
+            </w:r>
+          </w:p>
+        </w:tc>
+        <w:tc>
+          <w:tcPr>
+            <w:tcW w:w="5080" w:type="dxa"/>
+            <w:vAlign w:val="center"/>
+          </w:tcPr>
+          <w:p>
+            <w:r>
+              <w:rPr>
+                <w:sz w:val="18"/>
+              </w:rPr>
+              <w:t xml:space="preserve"/>
+            </w:r>
+          </w:p>
+        </w:tc>
+        <w:tc>
+          <w:tcPr>
+            <w:tcW w:w="2000" w:type="dxa"/>
+            <w:vAlign w:val="center"/>
+          </w:tcPr>
+          <w:p>
+            <w:r>
+              <w:rPr>
+                <w:sz w:val="18"/>
+              </w:rPr>
+              <w:t xml:space="preserve"/>
+            </w:r>
+          </w:p>
+        </w:tc>
+      </w:tr>
+      <w:tr>
+        <w:tc>
+          <w:tcPr>
+            <w:tcW w:w="1400" w:type="dxa"/>
+            <w:vAlign w:val="center"/>
+          </w:tcPr>
+          <w:p>
+            <w:r>
+              <w:rPr>
+                <w:sz w:val="18"/>
+              </w:rPr>
+              <w:t xml:space="preserve">{{ l.data }}</w:t>
+            </w:r>
+          </w:p>
+        </w:tc>
+        <w:tc>
+          <w:tcPr>
+            <w:tcW w:w="2400" w:type="dxa"/>
+            <w:vAlign w:val="center"/>
+          </w:tcPr>
+          <w:p>
+            <w:r>
+              <w:rPr>
+                <w:sz w:val="18"/>
+              </w:rPr>
+              <w:t xml:space="preserve">{{ l.equipamento }}</w:t>
+            </w:r>
+          </w:p>
+        </w:tc>
+        <w:tc>
+          <w:tcPr>
+            <w:tcW w:w="3600" w:type="dxa"/>
+            <w:vAlign w:val="center"/>
+          </w:tcPr>
+          <w:p>
+            <w:r>
+              <w:rPr>
+                <w:sz w:val="18"/>
+              </w:rPr>
+              <w:t xml:space="preserve">{{ l.conta_nome }}</w:t>
+            </w:r>
+          </w:p>
+        </w:tc>
+        <w:tc>
+          <w:tcPr>
+            <w:tcW w:w="5080" w:type="dxa"/>
+            <w:vAlign w:val="center"/>
+          </w:tcPr>
+          <w:p>
+            <w:r>
+              <w:rPr>
+                <w:sz w:val="18"/>
+              </w:rPr>
+              <w:t xml:space="preserve">{{ l.descritor }}</w:t>
+            </w:r>
+          </w:p>
+        </w:tc>
+        <w:tc>
+          <w:tcPr>
+            <w:tcW w:w="2000" w:type="dxa"/>
+            <w:vAlign w:val="center"/>
+          </w:tcPr>
+          <w:p>
+            <w:r>
+              <w:rPr>
+                <w:sz w:val="18"/>
+              </w:rPr>
+              <w:t xml:space="preserve">{{ l.valor }}</w:t>
+            </w:r>
+          </w:p>
+        </w:tc>
+      </w:tr>
+      <w:tr>
+        <w:tc>
+          <w:tcPr>
+            <w:tcW w:w="1400" w:type="dxa"/>
+            <w:vAlign w:val="center"/>
+          </w:tcPr>
+          <w:p>
+            <w:r>
+              <w:rPr>
+                <w:sz w:val="18"/>
+              </w:rPr>
+              <w:t xml:space="preserve">{%tr endfor %}</w:t>
+            </w:r>
+          </w:p>
+        </w:tc>
+        <w:tc>
+          <w:tcPr>
+            <w:tcW w:w="2400" w:type="dxa"/>
+            <w:vAlign w:val="center"/>
+          </w:tcPr>
+          <w:p>
+            <w:r>
+              <w:rPr>
+                <w:sz w:val="18"/>
+              </w:rPr>
+              <w:t xml:space="preserve"/>
+            </w:r>
+          </w:p>
+        </w:tc>
+        <w:tc>
+          <w:tcPr>
+            <w:tcW w:w="3600" w:type="dxa"/>
+            <w:vAlign w:val="center"/>
+          </w:tcPr>
+          <w:p>
+            <w:r>
+              <w:rPr>
+                <w:sz w:val="18"/>
+              </w:rPr>
+              <w:t xml:space="preserve"/>
+            </w:r>
+          </w:p>
+        </w:tc>
+        <w:tc>
+          <w:tcPr>
+            <w:tcW w:w="5080" w:type="dxa"/>
+            <w:vAlign w:val="center"/>
+          </w:tcPr>
+          <w:p>
+            <w:r>
+              <w:rPr>
+                <w:sz w:val="18"/>
+              </w:rPr>
+              <w:t xml:space="preserve"/>
+            </w:r>
+          </w:p>
+        </w:tc>
+        <w:tc>
+          <w:tcPr>
+            <w:tcW w:w="2000" w:type="dxa"/>
+            <w:vAlign w:val="center"/>
+          </w:tcPr>
+          <w:p>
+            <w:r>
+              <w:rPr>
+                <w:sz w:val="18"/>
+              </w:rPr>
+              <w:t xml:space="preserve"/>
+            </w:r>
+          </w:p>
+        </w:tc>
+      </w:tr>
+    </w:tbl>
+    <w:p>
+      <w:r>
+        <w:t xml:space="preserve">{%p endif %}</w:t>
+      </w:r>
+    </w:p>
+    <w:p>
+      <w:r>
+        <w:t xml:space="preserve">{%p if custo_maiores %}</w:t>
+      </w:r>
+    </w:p>
+    <w:p>
+      <w:pPr>
+        <w:spacing w:before="120"/>
+      </w:pPr>
+      <w:r>
+        <w:rPr>
+          <w:b/>
+          <w:sz w:val="22"/>
+          <w:color w:val="1B2860"/>
+        </w:rPr>
+        <w:t xml:space="preserve">Top 5 maiores custos</w:t>
+      </w:r>
+    </w:p>
+    <w:tbl>
+      <w:tblPr>
+        <w:tblW w:w="14480" w:type="dxa"/>
+        <w:tblBorders>
+          <w:top w:val="single" w:sz="4" w:space="0" w:color="BBBBBB"/>
+          <w:left w:val="single" w:sz="4" w:space="0" w:color="BBBBBB"/>
+          <w:bottom w:val="single" w:sz="4" w:space="0" w:color="BBBBBB"/>
+          <w:right w:val="single" w:sz="4" w:space="0" w:color="BBBBBB"/>
+          <w:insideH w:val="single" w:sz="4" w:space="0" w:color="BBBBBB"/>
+          <w:insideV w:val="single" w:sz="4" w:space="0" w:color="BBBBBB"/>
+        </w:tblBorders>
+        <w:tblLook w:val="04A0" w:firstRow="1" w:lastRow="0" w:firstColumn="0" w:lastColumn="0" w:noHBand="0" w:noVBand="1"/>
+      </w:tblPr>
+      <w:tblGrid>
+        <w:gridCol w:w="1400"/>
+        <w:gridCol w:w="2400"/>
+        <w:gridCol w:w="3600"/>
+        <w:gridCol w:w="5080"/>
+        <w:gridCol w:w="2000"/>
+      </w:tblGrid>
+      <w:tr>
+        <w:trPr>
+          <w:tblHeader/>
+        </w:trPr>
+        <w:tc>
+          <w:tcPr>
+            <w:tcW w:w="1400" w:type="dxa"/>
+            <w:shd w:val="clear" w:color="auto" w:fill="D9E2EC"/>
+            <w:vAlign w:val="center"/>
+          </w:tcPr>
+          <w:p>
+            <w:r>
+              <w:rPr>
+                <w:b/>
+                <w:sz w:val="18"/>
+              </w:rPr>
+              <w:t xml:space="preserve">Data</w:t>
+            </w:r>
+          </w:p>
+        </w:tc>
+        <w:tc>
+          <w:tcPr>
+            <w:tcW w:w="2400" w:type="dxa"/>
+            <w:shd w:val="clear" w:color="auto" w:fill="D9E2EC"/>
+            <w:vAlign w:val="center"/>
+          </w:tcPr>
+          <w:p>
+            <w:r>
+              <w:rPr>
+                <w:b/>
+                <w:sz w:val="18"/>
+              </w:rPr>
+              <w:t xml:space="preserve">Equipamento</w:t>
+            </w:r>
+          </w:p>
+        </w:tc>
+        <w:tc>
+          <w:tcPr>
+            <w:tcW w:w="3600" w:type="dxa"/>
+            <w:shd w:val="clear" w:color="auto" w:fill="D9E2EC"/>
+            <w:vAlign w:val="center"/>
+          </w:tcPr>
+          <w:p>
+            <w:r>
+              <w:rPr>
+                <w:b/>
+                <w:sz w:val="18"/>
+              </w:rPr>
+              <w:t xml:space="preserve">Conta</w:t>
+            </w:r>
+          </w:p>
+        </w:tc>
+        <w:tc>
+          <w:tcPr>
+            <w:tcW w:w="5080" w:type="dxa"/>
+            <w:shd w:val="clear" w:color="auto" w:fill="D9E2EC"/>
+            <w:vAlign w:val="center"/>
+          </w:tcPr>
+          <w:p>
+            <w:r>
+              <w:rPr>
+                <w:b/>
+                <w:sz w:val="18"/>
+              </w:rPr>
+              <w:t xml:space="preserve">Descritor</w:t>
+            </w:r>
+          </w:p>
+        </w:tc>
+        <w:tc>
+          <w:tcPr>
+            <w:tcW w:w="2000" w:type="dxa"/>
+            <w:shd w:val="clear" w:color="auto" w:fill="D9E2EC"/>
+            <w:vAlign w:val="center"/>
+          </w:tcPr>
+          <w:p>
+            <w:r>
+              <w:rPr>
+                <w:b/>
+                <w:sz w:val="18"/>
+              </w:rPr>
+              <w:t xml:space="preserve">Valor</w:t>
+            </w:r>
+          </w:p>
+        </w:tc>
+      </w:tr>
+      <w:tr>
+        <w:tc>
+          <w:tcPr>
+            <w:tcW w:w="1400" w:type="dxa"/>
+            <w:vAlign w:val="center"/>
+          </w:tcPr>
+          <w:p>
+            <w:r>
+              <w:rPr>
+                <w:sz w:val="18"/>
+              </w:rPr>
+              <w:t xml:space="preserve">{%tr for l in custo_maiores %}</w:t>
+            </w:r>
+          </w:p>
+        </w:tc>
+        <w:tc>
+          <w:tcPr>
+            <w:tcW w:w="2400" w:type="dxa"/>
+            <w:vAlign w:val="center"/>
+          </w:tcPr>
+          <w:p>
+            <w:r>
+              <w:rPr>
+                <w:sz w:val="18"/>
+              </w:rPr>
+              <w:t xml:space="preserve"/>
+            </w:r>
+          </w:p>
+        </w:tc>
+        <w:tc>
+          <w:tcPr>
+            <w:tcW w:w="3600" w:type="dxa"/>
+            <w:vAlign w:val="center"/>
+          </w:tcPr>
+          <w:p>
+            <w:r>
+              <w:rPr>
+                <w:sz w:val="18"/>
+              </w:rPr>
+              <w:t xml:space="preserve"/>
+            </w:r>
+          </w:p>
+        </w:tc>
+        <w:tc>
+          <w:tcPr>
+            <w:tcW w:w="5080" w:type="dxa"/>
+            <w:vAlign w:val="center"/>
+          </w:tcPr>
+          <w:p>
+            <w:r>
+              <w:rPr>
+                <w:sz w:val="18"/>
+              </w:rPr>
+              <w:t xml:space="preserve"/>
+            </w:r>
+          </w:p>
+        </w:tc>
+        <w:tc>
+          <w:tcPr>
+            <w:tcW w:w="2000" w:type="dxa"/>
+            <w:vAlign w:val="center"/>
+          </w:tcPr>
+          <w:p>
+            <w:r>
+              <w:rPr>
+                <w:sz w:val="18"/>
+              </w:rPr>
+              <w:t xml:space="preserve"/>
+            </w:r>
+          </w:p>
+        </w:tc>
+      </w:tr>
+      <w:tr>
+        <w:tc>
+          <w:tcPr>
+            <w:tcW w:w="1400" w:type="dxa"/>
+            <w:vAlign w:val="center"/>
+          </w:tcPr>
+          <w:p>
+            <w:r>
+              <w:rPr>
+                <w:sz w:val="18"/>
+              </w:rPr>
+              <w:t xml:space="preserve">{{ l.data }}</w:t>
+            </w:r>
+          </w:p>
+        </w:tc>
+        <w:tc>
+          <w:tcPr>
+            <w:tcW w:w="2400" w:type="dxa"/>
+            <w:vAlign w:val="center"/>
+          </w:tcPr>
+          <w:p>
+            <w:r>
+              <w:rPr>
+                <w:sz w:val="18"/>
+              </w:rPr>
+              <w:t xml:space="preserve">{{ l.equipamento }}</w:t>
+            </w:r>
+          </w:p>
+        </w:tc>
+        <w:tc>
+          <w:tcPr>
+            <w:tcW w:w="3600" w:type="dxa"/>
+            <w:vAlign w:val="center"/>
+          </w:tcPr>
+          <w:p>
+            <w:r>
+              <w:rPr>
+                <w:sz w:val="18"/>
+              </w:rPr>
+              <w:t xml:space="preserve">{{ l.conta_nome }}</w:t>
+            </w:r>
+          </w:p>
+        </w:tc>
+        <w:tc>
+          <w:tcPr>
+            <w:tcW w:w="5080" w:type="dxa"/>
+            <w:vAlign w:val="center"/>
+          </w:tcPr>
+          <w:p>
+            <w:r>
+              <w:rPr>
+                <w:sz w:val="18"/>
+              </w:rPr>
+              <w:t xml:space="preserve">{{ l.descritor }}</w:t>
+            </w:r>
+          </w:p>
+        </w:tc>
+        <w:tc>
+          <w:tcPr>
+            <w:tcW w:w="2000" w:type="dxa"/>
+            <w:vAlign w:val="center"/>
+          </w:tcPr>
+          <w:p>
+            <w:r>
+              <w:rPr>
+                <w:sz w:val="18"/>
+              </w:rPr>
+              <w:t xml:space="preserve">{{ l.valor }}</w:t>
+            </w:r>
+          </w:p>
+        </w:tc>
+      </w:tr>
+      <w:tr>
+        <w:tc>
+          <w:tcPr>
+            <w:tcW w:w="1400" w:type="dxa"/>
+            <w:vAlign w:val="center"/>
+          </w:tcPr>
+          <w:p>
+            <w:r>
+              <w:rPr>
+                <w:sz w:val="18"/>
+              </w:rPr>
+              <w:t xml:space="preserve">{%tr endfor %}</w:t>
+            </w:r>
+          </w:p>
+        </w:tc>
+        <w:tc>
+          <w:tcPr>
+            <w:tcW w:w="2400" w:type="dxa"/>
+            <w:vAlign w:val="center"/>
+          </w:tcPr>
+          <w:p>
+            <w:r>
+              <w:rPr>
+                <w:sz w:val="18"/>
+              </w:rPr>
+              <w:t xml:space="preserve"/>
+            </w:r>
+          </w:p>
+        </w:tc>
+        <w:tc>
+          <w:tcPr>
+            <w:tcW w:w="3600" w:type="dxa"/>
+            <w:vAlign w:val="center"/>
+          </w:tcPr>
+          <w:p>
+            <w:r>
+              <w:rPr>
+                <w:sz w:val="18"/>
+              </w:rPr>
+              <w:t xml:space="preserve"/>
+            </w:r>
+          </w:p>
+        </w:tc>
+        <w:tc>
+          <w:tcPr>
+            <w:tcW w:w="5080" w:type="dxa"/>
+            <w:vAlign w:val="center"/>
+          </w:tcPr>
+          <w:p>
+            <w:r>
+              <w:rPr>
+                <w:sz w:val="18"/>
+              </w:rPr>
+              <w:t xml:space="preserve"/>
+            </w:r>
+          </w:p>
+        </w:tc>
+        <w:tc>
+          <w:tcPr>
+            <w:tcW w:w="2000" w:type="dxa"/>
+            <w:vAlign w:val="center"/>
+          </w:tcPr>
+          <w:p>
+            <w:r>
+              <w:rPr>
+                <w:sz w:val="18"/>
+              </w:rPr>
+              <w:t xml:space="preserve"/>
+            </w:r>
+          </w:p>
+        </w:tc>
+      </w:tr>
+    </w:tbl>
+    <w:p>
+      <w:r>
+        <w:t xml:space="preserve">{%p endif %}</w:t>
+      </w:r>
+    </w:p>
+    <w:p>
+      <w:r>
         <w:br w:type="page"/>
       </w:r>
     </w:p>

</xml_diff>